<commit_message>
Add parent onboarding and curriculum-week derivation
</commit_message>
<xml_diff>
--- a/Documents/Build log.docx
+++ b/Documents/Build log.docx
@@ -14,7 +14,6 @@
           <w:rFonts w:hint="default" w:ascii="Calibri" w:hAnsi="Calibri" w:cs="Calibri"/>
         </w:rPr>
       </w:pPr>
-      <w:bookmarkStart w:id="0" w:name="_GoBack"/>
       <w:r>
         <w:rPr>
           <w:rFonts w:hint="default" w:ascii="Calibri" w:hAnsi="Calibri" w:cs="Calibri"/>
@@ -22,7 +21,6 @@
         <w:t>Build log — 2026-08-17: first working scaffold</w:t>
       </w:r>
     </w:p>
-    <w:bookmarkEnd w:id="0"/>
     <w:p>
       <w:pPr>
         <w:pStyle w:val="9"/>
@@ -1719,6 +1717,3059 @@
           <w:rFonts w:hint="default" w:ascii="Calibri" w:hAnsi="Calibri" w:cs="Calibri"/>
         </w:rPr>
         <w:t xml:space="preserve"> will work locally (she is currently developing against local Postgres, which is fine for now).</w:t>
+      </w:r>
+    </w:p>
+    <w:p>
+      <w:pPr>
+        <w:rPr>
+          <w:rFonts w:hint="default" w:ascii="Calibri" w:hAnsi="Calibri" w:cs="Calibri"/>
+        </w:rPr>
+      </w:pPr>
+    </w:p>
+    <w:p>
+      <w:pPr>
+        <w:rPr>
+          <w:rFonts w:hint="default" w:ascii="Calibri" w:hAnsi="Calibri" w:cs="Calibri"/>
+        </w:rPr>
+      </w:pPr>
+    </w:p>
+    <w:p>
+      <w:pPr>
+        <w:rPr>
+          <w:rFonts w:hint="default" w:ascii="Calibri" w:hAnsi="Calibri" w:cs="Calibri"/>
+        </w:rPr>
+      </w:pPr>
+    </w:p>
+    <w:p>
+      <w:pPr>
+        <w:rPr>
+          <w:rFonts w:hint="default" w:ascii="Calibri" w:hAnsi="Calibri" w:cs="Calibri"/>
+        </w:rPr>
+      </w:pPr>
+    </w:p>
+    <w:p>
+      <w:pPr>
+        <w:rPr>
+          <w:rFonts w:hint="default" w:ascii="Calibri" w:hAnsi="Calibri" w:cs="Calibri"/>
+        </w:rPr>
+      </w:pPr>
+    </w:p>
+    <w:p>
+      <w:pPr>
+        <w:rPr>
+          <w:rFonts w:hint="default" w:ascii="Calibri" w:hAnsi="Calibri" w:cs="Calibri"/>
+        </w:rPr>
+      </w:pPr>
+    </w:p>
+    <w:p>
+      <w:pPr>
+        <w:rPr>
+          <w:rFonts w:hint="default" w:ascii="Calibri" w:hAnsi="Calibri" w:cs="Calibri"/>
+        </w:rPr>
+      </w:pPr>
+    </w:p>
+    <w:p>
+      <w:pPr>
+        <w:rPr>
+          <w:rFonts w:hint="default" w:ascii="Calibri" w:hAnsi="Calibri" w:cs="Calibri"/>
+        </w:rPr>
+      </w:pPr>
+    </w:p>
+    <w:p>
+      <w:pPr>
+        <w:rPr>
+          <w:rFonts w:hint="default" w:ascii="Calibri" w:hAnsi="Calibri" w:cs="Calibri"/>
+        </w:rPr>
+      </w:pPr>
+    </w:p>
+    <w:p>
+      <w:pPr>
+        <w:rPr>
+          <w:rFonts w:hint="default" w:ascii="Calibri" w:hAnsi="Calibri" w:cs="Calibri"/>
+        </w:rPr>
+      </w:pPr>
+    </w:p>
+    <w:p>
+      <w:pPr>
+        <w:rPr>
+          <w:rFonts w:hint="default" w:ascii="Calibri" w:hAnsi="Calibri" w:cs="Calibri"/>
+        </w:rPr>
+      </w:pPr>
+    </w:p>
+    <w:p>
+      <w:pPr>
+        <w:rPr>
+          <w:rFonts w:hint="default" w:ascii="Calibri" w:hAnsi="Calibri" w:cs="Calibri"/>
+        </w:rPr>
+      </w:pPr>
+    </w:p>
+    <w:p>
+      <w:pPr>
+        <w:rPr>
+          <w:rFonts w:hint="default" w:ascii="Calibri" w:hAnsi="Calibri" w:cs="Calibri"/>
+        </w:rPr>
+      </w:pPr>
+    </w:p>
+    <w:p>
+      <w:pPr>
+        <w:rPr>
+          <w:rFonts w:hint="default" w:ascii="Calibri" w:hAnsi="Calibri" w:cs="Calibri"/>
+        </w:rPr>
+      </w:pPr>
+    </w:p>
+    <w:p>
+      <w:pPr>
+        <w:rPr>
+          <w:rFonts w:hint="default" w:ascii="Calibri" w:hAnsi="Calibri" w:cs="Calibri"/>
+        </w:rPr>
+      </w:pPr>
+    </w:p>
+    <w:p>
+      <w:pPr>
+        <w:rPr>
+          <w:rFonts w:hint="default" w:ascii="Calibri" w:hAnsi="Calibri" w:cs="Calibri"/>
+        </w:rPr>
+      </w:pPr>
+    </w:p>
+    <w:p>
+      <w:pPr>
+        <w:rPr>
+          <w:rFonts w:hint="default" w:ascii="Calibri" w:hAnsi="Calibri" w:cs="Calibri"/>
+        </w:rPr>
+      </w:pPr>
+    </w:p>
+    <w:p>
+      <w:pPr>
+        <w:rPr>
+          <w:rFonts w:hint="default" w:ascii="Calibri" w:hAnsi="Calibri" w:cs="Calibri"/>
+        </w:rPr>
+      </w:pPr>
+    </w:p>
+    <w:p>
+      <w:pPr>
+        <w:rPr>
+          <w:rFonts w:hint="default" w:ascii="Calibri" w:hAnsi="Calibri" w:cs="Calibri"/>
+        </w:rPr>
+      </w:pPr>
+    </w:p>
+    <w:p>
+      <w:pPr>
+        <w:rPr>
+          <w:rFonts w:hint="default" w:ascii="Calibri" w:hAnsi="Calibri" w:cs="Calibri"/>
+        </w:rPr>
+      </w:pPr>
+    </w:p>
+    <w:p>
+      <w:pPr>
+        <w:rPr>
+          <w:rFonts w:hint="default" w:ascii="Calibri" w:hAnsi="Calibri" w:cs="Calibri"/>
+        </w:rPr>
+      </w:pPr>
+    </w:p>
+    <w:p>
+      <w:pPr>
+        <w:rPr>
+          <w:rFonts w:hint="default" w:ascii="Calibri" w:hAnsi="Calibri" w:cs="Calibri"/>
+        </w:rPr>
+      </w:pPr>
+    </w:p>
+    <w:p>
+      <w:pPr>
+        <w:rPr>
+          <w:rFonts w:hint="default" w:ascii="Calibri" w:hAnsi="Calibri" w:cs="Calibri"/>
+        </w:rPr>
+      </w:pPr>
+    </w:p>
+    <w:p>
+      <w:pPr>
+        <w:rPr>
+          <w:rFonts w:hint="default" w:ascii="Calibri" w:hAnsi="Calibri" w:cs="Calibri"/>
+        </w:rPr>
+      </w:pPr>
+    </w:p>
+    <w:p>
+      <w:pPr>
+        <w:rPr>
+          <w:rFonts w:hint="default" w:ascii="Calibri" w:hAnsi="Calibri" w:cs="Calibri"/>
+        </w:rPr>
+      </w:pPr>
+    </w:p>
+    <w:p>
+      <w:pPr>
+        <w:rPr>
+          <w:rFonts w:hint="default" w:ascii="Calibri" w:hAnsi="Calibri" w:cs="Calibri"/>
+        </w:rPr>
+      </w:pPr>
+    </w:p>
+    <w:p>
+      <w:pPr>
+        <w:rPr>
+          <w:rFonts w:hint="default" w:ascii="Calibri" w:hAnsi="Calibri" w:cs="Calibri"/>
+        </w:rPr>
+      </w:pPr>
+    </w:p>
+    <w:p>
+      <w:pPr>
+        <w:rPr>
+          <w:rFonts w:hint="default" w:ascii="Calibri" w:hAnsi="Calibri" w:cs="Calibri"/>
+        </w:rPr>
+      </w:pPr>
+    </w:p>
+    <w:p>
+      <w:pPr>
+        <w:pStyle w:val="2"/>
+        <w:keepNext w:val="0"/>
+        <w:keepLines w:val="0"/>
+        <w:widowControl/>
+        <w:suppressLineNumbers w:val="0"/>
+        <w:bidi w:val="0"/>
+        <w:rPr>
+          <w:rFonts w:hint="default" w:ascii="Calibri" w:hAnsi="Calibri" w:cs="Calibri"/>
+        </w:rPr>
+      </w:pPr>
+      <w:r>
+        <w:rPr>
+          <w:rFonts w:hint="default" w:ascii="Calibri" w:hAnsi="Calibri" w:cs="Calibri"/>
+        </w:rPr>
+        <w:t>Build log — 2026-08-17: first working scaffold</w:t>
+      </w:r>
+    </w:p>
+    <w:p>
+      <w:pPr>
+        <w:pStyle w:val="9"/>
+        <w:keepNext w:val="0"/>
+        <w:keepLines w:val="0"/>
+        <w:widowControl/>
+        <w:suppressLineNumbers w:val="0"/>
+        <w:bidi w:val="0"/>
+        <w:spacing w:before="0" w:beforeAutospacing="1" w:after="0" w:afterAutospacing="1"/>
+        <w:ind w:left="0" w:right="0"/>
+        <w:rPr>
+          <w:rFonts w:hint="default" w:ascii="Calibri" w:hAnsi="Calibri" w:cs="Calibri"/>
+        </w:rPr>
+      </w:pPr>
+      <w:r>
+        <w:rPr>
+          <w:rFonts w:hint="default" w:ascii="Calibri" w:hAnsi="Calibri" w:cs="Calibri"/>
+        </w:rPr>
+        <w:t xml:space="preserve">Built the first runnable slice of Recallie end-to-end in a Claude session (cloud sandbox), following the tech-stack and pedagogy docs already in this project. Source delivered to Chandana as </w:t>
+      </w:r>
+      <w:r>
+        <w:rPr>
+          <w:rStyle w:val="7"/>
+          <w:rFonts w:hint="default" w:ascii="Calibri" w:hAnsi="Calibri" w:cs="Calibri"/>
+        </w:rPr>
+        <w:t>recallie-app-src.tar.gz</w:t>
+      </w:r>
+      <w:r>
+        <w:rPr>
+          <w:rFonts w:hint="default" w:ascii="Calibri" w:hAnsi="Calibri" w:cs="Calibri"/>
+        </w:rPr>
+        <w:t xml:space="preserve"> and pushed to GitHub. Summary below so a future session has context.</w:t>
+      </w:r>
+    </w:p>
+    <w:p>
+      <w:pPr>
+        <w:pStyle w:val="3"/>
+        <w:keepNext w:val="0"/>
+        <w:keepLines w:val="0"/>
+        <w:widowControl/>
+        <w:suppressLineNumbers w:val="0"/>
+        <w:bidi w:val="0"/>
+        <w:rPr>
+          <w:rFonts w:hint="default" w:ascii="Calibri" w:hAnsi="Calibri" w:cs="Calibri"/>
+        </w:rPr>
+      </w:pPr>
+      <w:r>
+        <w:rPr>
+          <w:rFonts w:hint="default" w:ascii="Calibri" w:hAnsi="Calibri" w:cs="Calibri"/>
+        </w:rPr>
+        <w:t>Repo</w:t>
+      </w:r>
+    </w:p>
+    <w:p>
+      <w:pPr>
+        <w:pStyle w:val="9"/>
+        <w:keepNext w:val="0"/>
+        <w:keepLines w:val="0"/>
+        <w:widowControl/>
+        <w:suppressLineNumbers w:val="0"/>
+        <w:bidi w:val="0"/>
+        <w:spacing w:before="0" w:beforeAutospacing="1" w:after="0" w:afterAutospacing="1"/>
+        <w:ind w:left="0" w:right="0"/>
+        <w:rPr>
+          <w:rFonts w:hint="default" w:ascii="Calibri" w:hAnsi="Calibri" w:cs="Calibri"/>
+        </w:rPr>
+      </w:pPr>
+      <w:r>
+        <w:rPr>
+          <w:rStyle w:val="10"/>
+          <w:rFonts w:hint="default" w:ascii="Calibri" w:hAnsi="Calibri" w:cs="Calibri"/>
+        </w:rPr>
+        <w:fldChar w:fldCharType="begin"/>
+      </w:r>
+      <w:r>
+        <w:rPr>
+          <w:rStyle w:val="10"/>
+          <w:rFonts w:hint="default" w:ascii="Calibri" w:hAnsi="Calibri" w:cs="Calibri"/>
+        </w:rPr>
+        <w:instrText xml:space="preserve"> HYPERLINK "https://github.com/jayasingheck-afk/recallie-app" </w:instrText>
+      </w:r>
+      <w:r>
+        <w:rPr>
+          <w:rStyle w:val="10"/>
+          <w:rFonts w:hint="default" w:ascii="Calibri" w:hAnsi="Calibri" w:cs="Calibri"/>
+        </w:rPr>
+        <w:fldChar w:fldCharType="separate"/>
+      </w:r>
+      <w:r>
+        <w:rPr>
+          <w:rStyle w:val="8"/>
+          <w:rFonts w:hint="default" w:ascii="Calibri" w:hAnsi="Calibri" w:cs="Calibri"/>
+        </w:rPr>
+        <w:t>https://github.com/jayasingheck-afk/recallie-app</w:t>
+      </w:r>
+      <w:r>
+        <w:rPr>
+          <w:rStyle w:val="10"/>
+          <w:rFonts w:hint="default" w:ascii="Calibri" w:hAnsi="Calibri" w:cs="Calibri"/>
+        </w:rPr>
+        <w:fldChar w:fldCharType="end"/>
+      </w:r>
+      <w:r>
+        <w:rPr>
+          <w:rFonts w:hint="default" w:ascii="Calibri" w:hAnsi="Calibri" w:cs="Calibri"/>
+        </w:rPr>
+        <w:t xml:space="preserve"> — pushed and confirmed live 2026-08-17. Local dev copy on Chandana's Windows machine at </w:t>
+      </w:r>
+      <w:r>
+        <w:rPr>
+          <w:rStyle w:val="7"/>
+          <w:rFonts w:hint="default" w:ascii="Calibri" w:hAnsi="Calibri" w:cs="Calibri"/>
+        </w:rPr>
+        <w:t>C:\recallie-app</w:t>
+      </w:r>
+      <w:r>
+        <w:rPr>
+          <w:rFonts w:hint="default" w:ascii="Calibri" w:hAnsi="Calibri" w:cs="Calibri"/>
+        </w:rPr>
+        <w:t>.</w:t>
+      </w:r>
+    </w:p>
+    <w:p>
+      <w:pPr>
+        <w:pStyle w:val="3"/>
+        <w:keepNext w:val="0"/>
+        <w:keepLines w:val="0"/>
+        <w:widowControl/>
+        <w:suppressLineNumbers w:val="0"/>
+        <w:bidi w:val="0"/>
+        <w:rPr>
+          <w:rFonts w:hint="default" w:ascii="Calibri" w:hAnsi="Calibri" w:cs="Calibri"/>
+        </w:rPr>
+      </w:pPr>
+      <w:r>
+        <w:rPr>
+          <w:rFonts w:hint="default" w:ascii="Calibri" w:hAnsi="Calibri" w:cs="Calibri"/>
+        </w:rPr>
+        <w:t>What exists now</w:t>
+      </w:r>
+    </w:p>
+    <w:p>
+      <w:pPr>
+        <w:keepNext w:val="0"/>
+        <w:keepLines w:val="0"/>
+        <w:widowControl/>
+        <w:numPr>
+          <w:ilvl w:val="0"/>
+          <w:numId w:val="5"/>
+        </w:numPr>
+        <w:suppressLineNumbers w:val="0"/>
+        <w:spacing w:before="0" w:beforeAutospacing="1" w:after="0" w:afterAutospacing="1"/>
+        <w:ind w:left="720" w:hanging="360"/>
+        <w:rPr>
+          <w:rFonts w:hint="default" w:ascii="Calibri" w:hAnsi="Calibri" w:cs="Calibri"/>
+        </w:rPr>
+      </w:pPr>
+      <w:r>
+        <w:rPr>
+          <w:rFonts w:hint="default" w:ascii="Calibri" w:hAnsi="Calibri" w:cs="Calibri"/>
+        </w:rPr>
+        <w:t xml:space="preserve">Next.js 16 (App Router, TS, Tailwind v4) app named </w:t>
+      </w:r>
+      <w:r>
+        <w:rPr>
+          <w:rStyle w:val="7"/>
+          <w:rFonts w:hint="default" w:ascii="Calibri" w:hAnsi="Calibri" w:cs="Calibri"/>
+        </w:rPr>
+        <w:t>recallie-app</w:t>
+      </w:r>
+      <w:r>
+        <w:rPr>
+          <w:rFonts w:hint="default" w:ascii="Calibri" w:hAnsi="Calibri" w:cs="Calibri"/>
+        </w:rPr>
+        <w:t>.</w:t>
+      </w:r>
+    </w:p>
+    <w:p>
+      <w:pPr>
+        <w:keepNext w:val="0"/>
+        <w:keepLines w:val="0"/>
+        <w:widowControl/>
+        <w:numPr>
+          <w:ilvl w:val="0"/>
+          <w:numId w:val="5"/>
+        </w:numPr>
+        <w:suppressLineNumbers w:val="0"/>
+        <w:spacing w:before="0" w:beforeAutospacing="1" w:after="0" w:afterAutospacing="1"/>
+        <w:ind w:left="720" w:hanging="360"/>
+        <w:rPr>
+          <w:rFonts w:hint="default" w:ascii="Calibri" w:hAnsi="Calibri" w:cs="Calibri"/>
+        </w:rPr>
+      </w:pPr>
+      <w:r>
+        <w:rPr>
+          <w:rFonts w:hint="default" w:ascii="Calibri" w:hAnsi="Calibri" w:cs="Calibri"/>
+        </w:rPr>
+        <w:t xml:space="preserve">PostgreSQL schema (9 tables) matching the project's documented Prisma schema exactly — User, ParentChildLink, Skill, CurriculumSequenceEntry, ChildSkillState, ReviewEvent, Item, Session, Subscription — but implemented with </w:t>
+      </w:r>
+      <w:r>
+        <w:rPr>
+          <w:rStyle w:val="10"/>
+          <w:rFonts w:hint="default" w:ascii="Calibri" w:hAnsi="Calibri" w:cs="Calibri"/>
+        </w:rPr>
+        <w:t>Drizzle ORM, not Prisma</w:t>
+      </w:r>
+      <w:r>
+        <w:rPr>
+          <w:rFonts w:hint="default" w:ascii="Calibri" w:hAnsi="Calibri" w:cs="Calibri"/>
+        </w:rPr>
+        <w:t xml:space="preserve">. </w:t>
+      </w:r>
+      <w:r>
+        <w:rPr>
+          <w:rStyle w:val="7"/>
+          <w:rFonts w:hint="default" w:ascii="Calibri" w:hAnsi="Calibri" w:cs="Calibri"/>
+        </w:rPr>
+        <w:t>User</w:t>
+      </w:r>
+      <w:r>
+        <w:rPr>
+          <w:rFonts w:hint="default" w:ascii="Calibri" w:hAnsi="Calibri" w:cs="Calibri"/>
+        </w:rPr>
+        <w:t xml:space="preserve"> now also has </w:t>
+      </w:r>
+      <w:r>
+        <w:rPr>
+          <w:rStyle w:val="7"/>
+          <w:rFonts w:hint="default" w:ascii="Calibri" w:hAnsi="Calibri" w:cs="Calibri"/>
+        </w:rPr>
+        <w:t>enrolledAt</w:t>
+      </w:r>
+      <w:r>
+        <w:rPr>
+          <w:rFonts w:hint="default" w:ascii="Calibri" w:hAnsi="Calibri" w:cs="Calibri"/>
+        </w:rPr>
+        <w:t xml:space="preserve"> (see "Parent onboarding" below).</w:t>
+      </w:r>
+    </w:p>
+    <w:p>
+      <w:pPr>
+        <w:keepNext w:val="0"/>
+        <w:keepLines w:val="0"/>
+        <w:widowControl/>
+        <w:numPr>
+          <w:ilvl w:val="0"/>
+          <w:numId w:val="5"/>
+        </w:numPr>
+        <w:suppressLineNumbers w:val="0"/>
+        <w:spacing w:before="0" w:beforeAutospacing="1" w:after="0" w:afterAutospacing="1"/>
+        <w:ind w:left="720" w:hanging="360"/>
+        <w:rPr>
+          <w:rFonts w:hint="default" w:ascii="Calibri" w:hAnsi="Calibri" w:cs="Calibri"/>
+        </w:rPr>
+      </w:pPr>
+      <w:r>
+        <w:rPr>
+          <w:rFonts w:hint="default" w:ascii="Calibri" w:hAnsi="Calibri" w:cs="Calibri"/>
+        </w:rPr>
+        <w:t xml:space="preserve">Full Year 3 Term 1 curriculum seeded: 25 Maths skills + 30 English skills, with AC/VIC/NSW mappings, taken directly from the project's curriculum docs. Note: the </w:t>
+      </w:r>
+      <w:r>
+        <w:rPr>
+          <w:rStyle w:val="6"/>
+          <w:rFonts w:hint="default" w:ascii="Calibri" w:hAnsi="Calibri" w:cs="Calibri"/>
+        </w:rPr>
+        <w:t>weekly sequence</w:t>
+      </w:r>
+      <w:r>
+        <w:rPr>
+          <w:rFonts w:hint="default" w:ascii="Calibri" w:hAnsi="Calibri" w:cs="Calibri"/>
+        </w:rPr>
+        <w:t xml:space="preserve"> (which skills are "new" each week) currently only has entries for </w:t>
+      </w:r>
+      <w:r>
+        <w:rPr>
+          <w:rStyle w:val="10"/>
+          <w:rFonts w:hint="default" w:ascii="Calibri" w:hAnsi="Calibri" w:cs="Calibri"/>
+        </w:rPr>
+        <w:t>Week 1</w:t>
+      </w:r>
+      <w:r>
+        <w:rPr>
+          <w:rFonts w:hint="default" w:ascii="Calibri" w:hAnsi="Calibri" w:cs="Calibri"/>
+        </w:rPr>
+        <w:t xml:space="preserve"> — see next steps.</w:t>
+      </w:r>
+    </w:p>
+    <w:p>
+      <w:pPr>
+        <w:keepNext w:val="0"/>
+        <w:keepLines w:val="0"/>
+        <w:widowControl/>
+        <w:numPr>
+          <w:ilvl w:val="0"/>
+          <w:numId w:val="5"/>
+        </w:numPr>
+        <w:suppressLineNumbers w:val="0"/>
+        <w:spacing w:before="0" w:beforeAutospacing="1" w:after="0" w:afterAutospacing="1"/>
+        <w:ind w:left="720" w:hanging="360"/>
+        <w:rPr>
+          <w:rFonts w:hint="default" w:ascii="Calibri" w:hAnsi="Calibri" w:cs="Calibri"/>
+        </w:rPr>
+      </w:pPr>
+      <w:r>
+        <w:rPr>
+          <w:rFonts w:hint="default" w:ascii="Calibri" w:hAnsi="Calibri" w:cs="Calibri"/>
+        </w:rPr>
+        <w:t>Spaced-repetition engine (</w:t>
+      </w:r>
+      <w:r>
+        <w:rPr>
+          <w:rStyle w:val="7"/>
+          <w:rFonts w:hint="default" w:ascii="Calibri" w:hAnsi="Calibri" w:cs="Calibri"/>
+        </w:rPr>
+        <w:t>src/lib/spacedRepetition.ts</w:t>
+      </w:r>
+      <w:r>
+        <w:rPr>
+          <w:rFonts w:hint="default" w:ascii="Calibri" w:hAnsi="Calibri" w:cs="Calibri"/>
+        </w:rPr>
+        <w:t>) ported from the project's TypeScript pseudocode doc.</w:t>
+      </w:r>
+    </w:p>
+    <w:p>
+      <w:pPr>
+        <w:keepNext w:val="0"/>
+        <w:keepLines w:val="0"/>
+        <w:widowControl/>
+        <w:numPr>
+          <w:ilvl w:val="0"/>
+          <w:numId w:val="5"/>
+        </w:numPr>
+        <w:suppressLineNumbers w:val="0"/>
+        <w:spacing w:before="0" w:beforeAutospacing="1" w:after="0" w:afterAutospacing="1"/>
+        <w:ind w:left="720" w:hanging="360"/>
+        <w:rPr>
+          <w:rFonts w:hint="default" w:ascii="Calibri" w:hAnsi="Calibri" w:cs="Calibri"/>
+        </w:rPr>
+      </w:pPr>
+      <w:r>
+        <w:rPr>
+          <w:rFonts w:hint="default" w:ascii="Calibri" w:hAnsi="Calibri" w:cs="Calibri"/>
+        </w:rPr>
+        <w:t>Session builder (</w:t>
+      </w:r>
+      <w:r>
+        <w:rPr>
+          <w:rStyle w:val="7"/>
+          <w:rFonts w:hint="default" w:ascii="Calibri" w:hAnsi="Calibri" w:cs="Calibri"/>
+        </w:rPr>
+        <w:t>src/lib/sessionBuilder.ts</w:t>
+      </w:r>
+      <w:r>
+        <w:rPr>
+          <w:rFonts w:hint="default" w:ascii="Calibri" w:hAnsi="Calibri" w:cs="Calibri"/>
+        </w:rPr>
+        <w:t xml:space="preserve">) implementing the ~40/35/25 review/new/mixed allocation and same-skill interleave cap from the session-builder doc. Excludes </w:t>
+      </w:r>
+      <w:r>
+        <w:rPr>
+          <w:rStyle w:val="7"/>
+          <w:rFonts w:hint="default" w:ascii="Calibri" w:hAnsi="Calibri" w:cs="Calibri"/>
+        </w:rPr>
+        <w:t>multi_part</w:t>
+      </w:r>
+      <w:r>
+        <w:rPr>
+          <w:rFonts w:hint="default" w:ascii="Calibri" w:hAnsi="Calibri" w:cs="Calibri"/>
+        </w:rPr>
+        <w:t xml:space="preserve"> and </w:t>
+      </w:r>
+      <w:r>
+        <w:rPr>
+          <w:rStyle w:val="7"/>
+          <w:rFonts w:hint="default" w:ascii="Calibri" w:hAnsi="Calibri" w:cs="Calibri"/>
+        </w:rPr>
+        <w:t>open_response</w:t>
+      </w:r>
+      <w:r>
+        <w:rPr>
+          <w:rFonts w:hint="default" w:ascii="Calibri" w:hAnsi="Calibri" w:cs="Calibri"/>
+        </w:rPr>
+        <w:t xml:space="preserve">-tagged items from live sessions (see "Item bank expansion"). Term/week are no longer hard-coded — derived per child via </w:t>
+      </w:r>
+      <w:r>
+        <w:rPr>
+          <w:rStyle w:val="7"/>
+          <w:rFonts w:hint="default" w:ascii="Calibri" w:hAnsi="Calibri" w:cs="Calibri"/>
+        </w:rPr>
+        <w:t>curriculumWeek.ts</w:t>
+      </w:r>
+      <w:r>
+        <w:rPr>
+          <w:rFonts w:hint="default" w:ascii="Calibri" w:hAnsi="Calibri" w:cs="Calibri"/>
+        </w:rPr>
+        <w:t>.</w:t>
+      </w:r>
+    </w:p>
+    <w:p>
+      <w:pPr>
+        <w:keepNext w:val="0"/>
+        <w:keepLines w:val="0"/>
+        <w:widowControl/>
+        <w:numPr>
+          <w:ilvl w:val="0"/>
+          <w:numId w:val="5"/>
+        </w:numPr>
+        <w:suppressLineNumbers w:val="0"/>
+        <w:spacing w:before="0" w:beforeAutospacing="1" w:after="0" w:afterAutospacing="1"/>
+        <w:ind w:left="720" w:hanging="360"/>
+        <w:rPr>
+          <w:rFonts w:hint="default" w:ascii="Calibri" w:hAnsi="Calibri" w:cs="Calibri"/>
+        </w:rPr>
+      </w:pPr>
+      <w:r>
+        <w:rPr>
+          <w:rFonts w:hint="default" w:ascii="Calibri" w:hAnsi="Calibri" w:cs="Calibri"/>
+        </w:rPr>
+        <w:t xml:space="preserve">API routes: </w:t>
+      </w:r>
+      <w:r>
+        <w:rPr>
+          <w:rStyle w:val="7"/>
+          <w:rFonts w:hint="default" w:ascii="Calibri" w:hAnsi="Calibri" w:cs="Calibri"/>
+        </w:rPr>
+        <w:t>GET /api/session/today</w:t>
+      </w:r>
+      <w:r>
+        <w:rPr>
+          <w:rFonts w:hint="default" w:ascii="Calibri" w:hAnsi="Calibri" w:cs="Calibri"/>
+        </w:rPr>
+        <w:t xml:space="preserve">, </w:t>
+      </w:r>
+      <w:r>
+        <w:rPr>
+          <w:rStyle w:val="7"/>
+          <w:rFonts w:hint="default" w:ascii="Calibri" w:hAnsi="Calibri" w:cs="Calibri"/>
+        </w:rPr>
+        <w:t>POST /api/reviews</w:t>
+      </w:r>
+      <w:r>
+        <w:rPr>
+          <w:rFonts w:hint="default" w:ascii="Calibri" w:hAnsi="Calibri" w:cs="Calibri"/>
+        </w:rPr>
+        <w:t xml:space="preserve">, </w:t>
+      </w:r>
+      <w:r>
+        <w:rPr>
+          <w:rStyle w:val="7"/>
+          <w:rFonts w:hint="default" w:ascii="Calibri" w:hAnsi="Calibri" w:cs="Calibri"/>
+        </w:rPr>
+        <w:t>GET /api/dashboard</w:t>
+      </w:r>
+      <w:r>
+        <w:rPr>
+          <w:rFonts w:hint="default" w:ascii="Calibri" w:hAnsi="Calibri" w:cs="Calibri"/>
+        </w:rPr>
+        <w:t xml:space="preserve">, </w:t>
+      </w:r>
+      <w:r>
+        <w:rPr>
+          <w:rStyle w:val="7"/>
+          <w:rFonts w:hint="default" w:ascii="Calibri" w:hAnsi="Calibri" w:cs="Calibri"/>
+        </w:rPr>
+        <w:t>GET</w:t>
+      </w:r>
+      <w:r>
+        <w:rPr>
+          <w:rFonts w:hint="default" w:ascii="Calibri" w:hAnsi="Calibri" w:cs="Calibri"/>
+        </w:rPr>
+        <w:t>/</w:t>
+      </w:r>
+      <w:r>
+        <w:rPr>
+          <w:rStyle w:val="7"/>
+          <w:rFonts w:hint="default" w:ascii="Calibri" w:hAnsi="Calibri" w:cs="Calibri"/>
+        </w:rPr>
+        <w:t>POST /api/children</w:t>
+      </w:r>
+      <w:r>
+        <w:rPr>
+          <w:rFonts w:hint="default" w:ascii="Calibri" w:hAnsi="Calibri" w:cs="Calibri"/>
+        </w:rPr>
+        <w:t>.</w:t>
+      </w:r>
+    </w:p>
+    <w:p>
+      <w:pPr>
+        <w:keepNext w:val="0"/>
+        <w:keepLines w:val="0"/>
+        <w:widowControl/>
+        <w:numPr>
+          <w:ilvl w:val="0"/>
+          <w:numId w:val="5"/>
+        </w:numPr>
+        <w:suppressLineNumbers w:val="0"/>
+        <w:spacing w:before="0" w:beforeAutospacing="1" w:after="0" w:afterAutospacing="1"/>
+        <w:ind w:left="720" w:hanging="360"/>
+        <w:rPr>
+          <w:rFonts w:hint="default" w:ascii="Calibri" w:hAnsi="Calibri" w:cs="Calibri"/>
+        </w:rPr>
+      </w:pPr>
+      <w:r>
+        <w:rPr>
+          <w:rFonts w:hint="default" w:ascii="Calibri" w:hAnsi="Calibri" w:cs="Calibri"/>
+        </w:rPr>
+        <w:t xml:space="preserve">UI: </w:t>
+      </w:r>
+      <w:r>
+        <w:rPr>
+          <w:rStyle w:val="7"/>
+          <w:rFonts w:hint="default" w:ascii="Calibri" w:hAnsi="Calibri" w:cs="Calibri"/>
+        </w:rPr>
+        <w:t>/child</w:t>
+      </w:r>
+      <w:r>
+        <w:rPr>
+          <w:rFonts w:hint="default" w:ascii="Calibri" w:hAnsi="Calibri" w:cs="Calibri"/>
+        </w:rPr>
+        <w:t xml:space="preserve"> (one-item-at-a-time practice, accepts </w:t>
+      </w:r>
+      <w:r>
+        <w:rPr>
+          <w:rStyle w:val="7"/>
+          <w:rFonts w:hint="default" w:ascii="Calibri" w:hAnsi="Calibri" w:cs="Calibri"/>
+        </w:rPr>
+        <w:t>?childId=</w:t>
+      </w:r>
+      <w:r>
+        <w:rPr>
+          <w:rFonts w:hint="default" w:ascii="Calibri" w:hAnsi="Calibri" w:cs="Calibri"/>
+        </w:rPr>
+        <w:t xml:space="preserve">), </w:t>
+      </w:r>
+      <w:r>
+        <w:rPr>
+          <w:rStyle w:val="7"/>
+          <w:rFonts w:hint="default" w:ascii="Calibri" w:hAnsi="Calibri" w:cs="Calibri"/>
+        </w:rPr>
+        <w:t>/parent/dashboard</w:t>
+      </w:r>
+      <w:r>
+        <w:rPr>
+          <w:rFonts w:hint="default" w:ascii="Calibri" w:hAnsi="Calibri" w:cs="Calibri"/>
+        </w:rPr>
+        <w:t xml:space="preserve"> (accepts </w:t>
+      </w:r>
+      <w:r>
+        <w:rPr>
+          <w:rStyle w:val="7"/>
+          <w:rFonts w:hint="default" w:ascii="Calibri" w:hAnsi="Calibri" w:cs="Calibri"/>
+        </w:rPr>
+        <w:t>?childId=</w:t>
+      </w:r>
+      <w:r>
+        <w:rPr>
+          <w:rFonts w:hint="default" w:ascii="Calibri" w:hAnsi="Calibri" w:cs="Calibri"/>
+        </w:rPr>
+        <w:t xml:space="preserve">), </w:t>
+      </w:r>
+      <w:r>
+        <w:rPr>
+          <w:rStyle w:val="7"/>
+          <w:rFonts w:hint="default" w:ascii="Calibri" w:hAnsi="Calibri" w:cs="Calibri"/>
+        </w:rPr>
+        <w:t>/parent/children</w:t>
+      </w:r>
+      <w:r>
+        <w:rPr>
+          <w:rFonts w:hint="default" w:ascii="Calibri" w:hAnsi="Calibri" w:cs="Calibri"/>
+        </w:rPr>
+        <w:t xml:space="preserve"> (add/list children, parent onboarding).</w:t>
+      </w:r>
+    </w:p>
+    <w:p>
+      <w:pPr>
+        <w:keepNext w:val="0"/>
+        <w:keepLines w:val="0"/>
+        <w:widowControl/>
+        <w:numPr>
+          <w:ilvl w:val="0"/>
+          <w:numId w:val="5"/>
+        </w:numPr>
+        <w:suppressLineNumbers w:val="0"/>
+        <w:spacing w:before="0" w:beforeAutospacing="1" w:after="0" w:afterAutospacing="1"/>
+        <w:ind w:left="720" w:hanging="360"/>
+        <w:rPr>
+          <w:rFonts w:hint="default" w:ascii="Calibri" w:hAnsi="Calibri" w:cs="Calibri"/>
+        </w:rPr>
+      </w:pPr>
+      <w:r>
+        <w:rPr>
+          <w:rFonts w:hint="default" w:ascii="Calibri" w:hAnsi="Calibri" w:cs="Calibri"/>
+        </w:rPr>
+        <w:t>Week 1 item bank: 62 items total (8 original hand-written samples + 54 generated) across the 5 Week 1 skills, plus a demo parent/child, so the whole loop is testable with real variety.</w:t>
+      </w:r>
+    </w:p>
+    <w:p>
+      <w:pPr>
+        <w:keepNext w:val="0"/>
+        <w:keepLines w:val="0"/>
+        <w:widowControl/>
+        <w:numPr>
+          <w:ilvl w:val="0"/>
+          <w:numId w:val="5"/>
+        </w:numPr>
+        <w:suppressLineNumbers w:val="0"/>
+        <w:spacing w:before="0" w:beforeAutospacing="1" w:after="0" w:afterAutospacing="1"/>
+        <w:ind w:left="720" w:hanging="360"/>
+        <w:rPr>
+          <w:rFonts w:hint="default" w:ascii="Calibri" w:hAnsi="Calibri" w:cs="Calibri"/>
+        </w:rPr>
+      </w:pPr>
+      <w:r>
+        <w:rPr>
+          <w:rStyle w:val="7"/>
+          <w:rFonts w:hint="default" w:ascii="Calibri" w:hAnsi="Calibri" w:cs="Calibri"/>
+        </w:rPr>
+        <w:t>src/db/client.ts</w:t>
+      </w:r>
+      <w:r>
+        <w:rPr>
+          <w:rFonts w:hint="default" w:ascii="Calibri" w:hAnsi="Calibri" w:cs="Calibri"/>
+        </w:rPr>
+        <w:t xml:space="preserve"> auto-detects local vs. managed Postgres (Neon/Supabase/RDS) and enables SSL accordingly — no manual config needed either way.</w:t>
+      </w:r>
+    </w:p>
+    <w:p>
+      <w:pPr>
+        <w:pStyle w:val="3"/>
+        <w:keepNext w:val="0"/>
+        <w:keepLines w:val="0"/>
+        <w:widowControl/>
+        <w:suppressLineNumbers w:val="0"/>
+        <w:bidi w:val="0"/>
+        <w:rPr>
+          <w:rFonts w:hint="default" w:ascii="Calibri" w:hAnsi="Calibri" w:cs="Calibri"/>
+        </w:rPr>
+      </w:pPr>
+      <w:r>
+        <w:rPr>
+          <w:rFonts w:hint="default" w:ascii="Calibri" w:hAnsi="Calibri" w:cs="Calibri"/>
+        </w:rPr>
+        <w:t>Key decision: Prisma → Drizzle</w:t>
+      </w:r>
+    </w:p>
+    <w:p>
+      <w:pPr>
+        <w:pStyle w:val="9"/>
+        <w:keepNext w:val="0"/>
+        <w:keepLines w:val="0"/>
+        <w:widowControl/>
+        <w:suppressLineNumbers w:val="0"/>
+        <w:bidi w:val="0"/>
+        <w:spacing w:before="0" w:beforeAutospacing="1" w:after="0" w:afterAutospacing="1"/>
+        <w:ind w:left="0" w:right="0"/>
+        <w:rPr>
+          <w:rFonts w:hint="default" w:ascii="Calibri" w:hAnsi="Calibri" w:cs="Calibri"/>
+        </w:rPr>
+      </w:pPr>
+      <w:r>
+        <w:rPr>
+          <w:rFonts w:hint="default" w:ascii="Calibri" w:hAnsi="Calibri" w:cs="Calibri"/>
+        </w:rPr>
+        <w:t xml:space="preserve">The sandbox environment could not reach </w:t>
+      </w:r>
+      <w:r>
+        <w:rPr>
+          <w:rStyle w:val="7"/>
+          <w:rFonts w:hint="default" w:ascii="Calibri" w:hAnsi="Calibri" w:cs="Calibri"/>
+        </w:rPr>
+        <w:t>binaries.prisma.sh</w:t>
+      </w:r>
+      <w:r>
+        <w:rPr>
+          <w:rFonts w:hint="default" w:ascii="Calibri" w:hAnsi="Calibri" w:cs="Calibri"/>
+        </w:rPr>
+        <w:t xml:space="preserve"> (network allowlist covers npm registry only), so </w:t>
+      </w:r>
+      <w:r>
+        <w:rPr>
+          <w:rStyle w:val="7"/>
+          <w:rFonts w:hint="default" w:ascii="Calibri" w:hAnsi="Calibri" w:cs="Calibri"/>
+        </w:rPr>
+        <w:t>prisma init</w:t>
+      </w:r>
+      <w:r>
+        <w:rPr>
+          <w:rFonts w:hint="default" w:ascii="Calibri" w:hAnsi="Calibri" w:cs="Calibri"/>
+        </w:rPr>
+        <w:t>/</w:t>
+      </w:r>
+      <w:r>
+        <w:rPr>
+          <w:rStyle w:val="7"/>
+          <w:rFonts w:hint="default" w:ascii="Calibri" w:hAnsi="Calibri" w:cs="Calibri"/>
+        </w:rPr>
+        <w:t>migrate</w:t>
+      </w:r>
+      <w:r>
+        <w:rPr>
+          <w:rFonts w:hint="default" w:ascii="Calibri" w:hAnsi="Calibri" w:cs="Calibri"/>
+        </w:rPr>
+        <w:t xml:space="preserve"> failed outright. Swapped to Drizzle ORM — same schema, same Postgres, no functional loss, and Drizzle was already named as an acceptable alternative in the project's own docs. If a future environment </w:t>
+      </w:r>
+      <w:r>
+        <w:rPr>
+          <w:rStyle w:val="6"/>
+          <w:rFonts w:hint="default" w:ascii="Calibri" w:hAnsi="Calibri" w:cs="Calibri"/>
+        </w:rPr>
+        <w:t>can</w:t>
+      </w:r>
+      <w:r>
+        <w:rPr>
+          <w:rFonts w:hint="default" w:ascii="Calibri" w:hAnsi="Calibri" w:cs="Calibri"/>
+        </w:rPr>
+        <w:t xml:space="preserve"> reach Prisma's binaries and the team prefers Prisma, </w:t>
+      </w:r>
+      <w:r>
+        <w:rPr>
+          <w:rStyle w:val="7"/>
+          <w:rFonts w:hint="default" w:ascii="Calibri" w:hAnsi="Calibri" w:cs="Calibri"/>
+        </w:rPr>
+        <w:t>src/db/schema.ts</w:t>
+      </w:r>
+      <w:r>
+        <w:rPr>
+          <w:rFonts w:hint="default" w:ascii="Calibri" w:hAnsi="Calibri" w:cs="Calibri"/>
+        </w:rPr>
+        <w:t xml:space="preserve"> is a straightforward translation back (it mirrors the documented Prisma models field-for-field).</w:t>
+      </w:r>
+    </w:p>
+    <w:p>
+      <w:pPr>
+        <w:pStyle w:val="3"/>
+        <w:keepNext w:val="0"/>
+        <w:keepLines w:val="0"/>
+        <w:widowControl/>
+        <w:suppressLineNumbers w:val="0"/>
+        <w:bidi w:val="0"/>
+        <w:rPr>
+          <w:rFonts w:hint="default" w:ascii="Calibri" w:hAnsi="Calibri" w:cs="Calibri"/>
+        </w:rPr>
+      </w:pPr>
+      <w:r>
+        <w:rPr>
+          <w:rFonts w:hint="default" w:ascii="Calibri" w:hAnsi="Calibri" w:cs="Calibri"/>
+        </w:rPr>
+        <w:t>Item bank expansion</w:t>
+      </w:r>
+    </w:p>
+    <w:p>
+      <w:pPr>
+        <w:pStyle w:val="9"/>
+        <w:keepNext w:val="0"/>
+        <w:keepLines w:val="0"/>
+        <w:widowControl/>
+        <w:suppressLineNumbers w:val="0"/>
+        <w:bidi w:val="0"/>
+        <w:spacing w:before="0" w:beforeAutospacing="1" w:after="0" w:afterAutospacing="1"/>
+        <w:ind w:left="0" w:right="0"/>
+        <w:rPr>
+          <w:rFonts w:hint="default" w:ascii="Calibri" w:hAnsi="Calibri" w:cs="Calibri"/>
+        </w:rPr>
+      </w:pPr>
+      <w:r>
+        <w:rPr>
+          <w:rFonts w:hint="default" w:ascii="Calibri" w:hAnsi="Calibri" w:cs="Calibri"/>
+        </w:rPr>
+        <w:t xml:space="preserve">Generated 54 new practice items for the 5 Week 1 skills (M3N01, M3M01, E3LY03, E3LA04, E3LY09) following the project's own Maths/English item-generation prompt templates — </w:t>
+      </w:r>
+      <w:r>
+        <w:rPr>
+          <w:rStyle w:val="7"/>
+          <w:rFonts w:hint="default" w:ascii="Calibri" w:hAnsi="Calibri" w:cs="Calibri"/>
+        </w:rPr>
+        <w:t>src/db/seed/week1-item-bank.json</w:t>
+      </w:r>
+      <w:r>
+        <w:rPr>
+          <w:rFonts w:hint="default" w:ascii="Calibri" w:hAnsi="Calibri" w:cs="Calibri"/>
+        </w:rPr>
+        <w:t xml:space="preserve">. Each item has answer key, 3–6 step step-by-step solution, 2–3 common misconceptions, 2 scaffolded hints, difficulty, and tags, in Australian English, growth-oriented language. </w:t>
+      </w:r>
+      <w:r>
+        <w:rPr>
+          <w:rStyle w:val="10"/>
+          <w:rFonts w:hint="default" w:ascii="Calibri" w:hAnsi="Calibri" w:cs="Calibri"/>
+        </w:rPr>
+        <w:t>Not yet human-reviewed</w:t>
+      </w:r>
+      <w:r>
+        <w:rPr>
+          <w:rFonts w:hint="default" w:ascii="Calibri" w:hAnsi="Calibri" w:cs="Calibri"/>
+        </w:rPr>
+        <w:t xml:space="preserve"> — flagged as pending review in the file's own </w:t>
+      </w:r>
+      <w:r>
+        <w:rPr>
+          <w:rStyle w:val="7"/>
+          <w:rFonts w:hint="default" w:ascii="Calibri" w:hAnsi="Calibri" w:cs="Calibri"/>
+        </w:rPr>
+        <w:t>_note</w:t>
+      </w:r>
+      <w:r>
+        <w:rPr>
+          <w:rFonts w:hint="default" w:ascii="Calibri" w:hAnsi="Calibri" w:cs="Calibri"/>
+        </w:rPr>
+        <w:t xml:space="preserve"> field and in the README, per the project's QA requirement that all AI-generated items get human review before children see them.</w:t>
+      </w:r>
+    </w:p>
+    <w:p>
+      <w:pPr>
+        <w:pStyle w:val="9"/>
+        <w:keepNext w:val="0"/>
+        <w:keepLines w:val="0"/>
+        <w:widowControl/>
+        <w:suppressLineNumbers w:val="0"/>
+        <w:bidi w:val="0"/>
+        <w:spacing w:before="0" w:beforeAutospacing="1" w:after="0" w:afterAutospacing="1"/>
+        <w:ind w:left="0" w:right="0"/>
+        <w:rPr>
+          <w:rFonts w:hint="default" w:ascii="Calibri" w:hAnsi="Calibri" w:cs="Calibri"/>
+        </w:rPr>
+      </w:pPr>
+      <w:r>
+        <w:rPr>
+          <w:rFonts w:hint="default" w:ascii="Calibri" w:hAnsi="Calibri" w:cs="Calibri"/>
+        </w:rPr>
+        <w:t>Grading-compatibility design decisions baked into this content:</w:t>
+      </w:r>
+    </w:p>
+    <w:p>
+      <w:pPr>
+        <w:keepNext w:val="0"/>
+        <w:keepLines w:val="0"/>
+        <w:widowControl/>
+        <w:numPr>
+          <w:ilvl w:val="0"/>
+          <w:numId w:val="6"/>
+        </w:numPr>
+        <w:suppressLineNumbers w:val="0"/>
+        <w:spacing w:before="0" w:beforeAutospacing="1" w:after="0" w:afterAutospacing="1"/>
+        <w:ind w:left="720" w:hanging="360"/>
+        <w:rPr>
+          <w:rFonts w:hint="default" w:ascii="Calibri" w:hAnsi="Calibri" w:cs="Calibri"/>
+        </w:rPr>
+      </w:pPr>
+      <w:r>
+        <w:rPr>
+          <w:rFonts w:hint="default" w:ascii="Calibri" w:hAnsi="Calibri" w:cs="Calibri"/>
+        </w:rPr>
+        <w:t xml:space="preserve">Explanatory/word-problem items keep </w:t>
+      </w:r>
+      <w:r>
+        <w:rPr>
+          <w:rStyle w:val="7"/>
+          <w:rFonts w:hint="default" w:ascii="Calibri" w:hAnsi="Calibri" w:cs="Calibri"/>
+        </w:rPr>
+        <w:t>answerKey</w:t>
+      </w:r>
+      <w:r>
+        <w:rPr>
+          <w:rFonts w:hint="default" w:ascii="Calibri" w:hAnsi="Calibri" w:cs="Calibri"/>
+        </w:rPr>
+        <w:t xml:space="preserve"> to the core factual answer only (e.g. </w:t>
+      </w:r>
+      <w:r>
+        <w:rPr>
+          <w:rStyle w:val="7"/>
+          <w:rFonts w:hint="default" w:ascii="Calibri" w:hAnsi="Calibri" w:cs="Calibri"/>
+        </w:rPr>
+        <w:t>"Sunday"</w:t>
+      </w:r>
+      <w:r>
+        <w:rPr>
+          <w:rFonts w:hint="default" w:ascii="Calibri" w:hAnsi="Calibri" w:cs="Calibri"/>
+        </w:rPr>
+        <w:t xml:space="preserve">, </w:t>
+      </w:r>
+      <w:r>
+        <w:rPr>
+          <w:rStyle w:val="7"/>
+          <w:rFonts w:hint="default" w:ascii="Calibri" w:hAnsi="Calibri" w:cs="Calibri"/>
+        </w:rPr>
+        <w:t>"kilograms"</w:t>
+      </w:r>
+      <w:r>
+        <w:rPr>
+          <w:rFonts w:hint="default" w:ascii="Calibri" w:hAnsi="Calibri" w:cs="Calibri"/>
+        </w:rPr>
+        <w:t xml:space="preserve">), with reasoning moved into </w:t>
+      </w:r>
+      <w:r>
+        <w:rPr>
+          <w:rStyle w:val="7"/>
+          <w:rFonts w:hint="default" w:ascii="Calibri" w:hAnsi="Calibri" w:cs="Calibri"/>
+        </w:rPr>
+        <w:t>stepByStepSolution</w:t>
+      </w:r>
+      <w:r>
+        <w:rPr>
+          <w:rFonts w:hint="default" w:ascii="Calibri" w:hAnsi="Calibri" w:cs="Calibri"/>
+        </w:rPr>
+        <w:t xml:space="preserve"> — keeps them auto-gradable by the current string-match grader.</w:t>
+      </w:r>
+    </w:p>
+    <w:p>
+      <w:pPr>
+        <w:keepNext w:val="0"/>
+        <w:keepLines w:val="0"/>
+        <w:widowControl/>
+        <w:numPr>
+          <w:ilvl w:val="0"/>
+          <w:numId w:val="6"/>
+        </w:numPr>
+        <w:suppressLineNumbers w:val="0"/>
+        <w:spacing w:before="0" w:beforeAutospacing="1" w:after="0" w:afterAutospacing="1"/>
+        <w:ind w:left="720" w:hanging="360"/>
+        <w:rPr>
+          <w:rFonts w:hint="default" w:ascii="Calibri" w:hAnsi="Calibri" w:cs="Calibri"/>
+        </w:rPr>
+      </w:pPr>
+      <w:r>
+        <w:rPr>
+          <w:rFonts w:hint="default" w:ascii="Calibri" w:hAnsi="Calibri" w:cs="Calibri"/>
+        </w:rPr>
+        <w:t xml:space="preserve">A few items use array-valued </w:t>
+      </w:r>
+      <w:r>
+        <w:rPr>
+          <w:rStyle w:val="7"/>
+          <w:rFonts w:hint="default" w:ascii="Calibri" w:hAnsi="Calibri" w:cs="Calibri"/>
+        </w:rPr>
+        <w:t>answerKey</w:t>
+      </w:r>
+      <w:r>
+        <w:rPr>
+          <w:rFonts w:hint="default" w:ascii="Calibri" w:hAnsi="Calibri" w:cs="Calibri"/>
+        </w:rPr>
+        <w:t xml:space="preserve"> to accept multiple valid phrasings (e.g. </w:t>
+      </w:r>
+      <w:r>
+        <w:rPr>
+          <w:rStyle w:val="7"/>
+          <w:rFonts w:hint="default" w:ascii="Calibri" w:hAnsi="Calibri" w:cs="Calibri"/>
+        </w:rPr>
+        <w:t>["6000 + 500 + 0 + 9", "6000 + 500 + 9"]</w:t>
+      </w:r>
+      <w:r>
+        <w:rPr>
+          <w:rFonts w:hint="default" w:ascii="Calibri" w:hAnsi="Calibri" w:cs="Calibri"/>
+        </w:rPr>
+        <w:t xml:space="preserve">) — verified working via a live </w:t>
+      </w:r>
+      <w:r>
+        <w:rPr>
+          <w:rStyle w:val="7"/>
+          <w:rFonts w:hint="default" w:ascii="Calibri" w:hAnsi="Calibri" w:cs="Calibri"/>
+        </w:rPr>
+        <w:t>POST /api/reviews</w:t>
+      </w:r>
+      <w:r>
+        <w:rPr>
+          <w:rFonts w:hint="default" w:ascii="Calibri" w:hAnsi="Calibri" w:cs="Calibri"/>
+        </w:rPr>
+        <w:t xml:space="preserve"> test.</w:t>
+      </w:r>
+    </w:p>
+    <w:p>
+      <w:pPr>
+        <w:keepNext w:val="0"/>
+        <w:keepLines w:val="0"/>
+        <w:widowControl/>
+        <w:numPr>
+          <w:ilvl w:val="0"/>
+          <w:numId w:val="6"/>
+        </w:numPr>
+        <w:suppressLineNumbers w:val="0"/>
+        <w:spacing w:before="0" w:beforeAutospacing="1" w:after="0" w:afterAutospacing="1"/>
+        <w:ind w:left="720" w:hanging="360"/>
+        <w:rPr>
+          <w:rFonts w:hint="default" w:ascii="Calibri" w:hAnsi="Calibri" w:cs="Calibri"/>
+        </w:rPr>
+      </w:pPr>
+      <w:r>
+        <w:rPr>
+          <w:rFonts w:hint="default" w:ascii="Calibri" w:hAnsi="Calibri" w:cs="Calibri"/>
+        </w:rPr>
+        <w:t xml:space="preserve">4 </w:t>
+      </w:r>
+      <w:r>
+        <w:rPr>
+          <w:rStyle w:val="7"/>
+          <w:rFonts w:hint="default" w:ascii="Calibri" w:hAnsi="Calibri" w:cs="Calibri"/>
+        </w:rPr>
+        <w:t>multi_part</w:t>
+      </w:r>
+      <w:r>
+        <w:rPr>
+          <w:rFonts w:hint="default" w:ascii="Calibri" w:hAnsi="Calibri" w:cs="Calibri"/>
+        </w:rPr>
+        <w:t xml:space="preserve"> items have object-valued answer keys (e.g. </w:t>
+      </w:r>
+      <w:r>
+        <w:rPr>
+          <w:rStyle w:val="7"/>
+          <w:rFonts w:hint="default" w:ascii="Calibri" w:hAnsi="Calibri" w:cs="Calibri"/>
+        </w:rPr>
+        <w:t>{"largest":"8520","smallest":"2058"}</w:t>
+      </w:r>
+      <w:r>
+        <w:rPr>
+          <w:rFonts w:hint="default" w:ascii="Calibri" w:hAnsi="Calibri" w:cs="Calibri"/>
+        </w:rPr>
+        <w:t>) — not compatible with the current grader.</w:t>
+      </w:r>
+    </w:p>
+    <w:p>
+      <w:pPr>
+        <w:keepNext w:val="0"/>
+        <w:keepLines w:val="0"/>
+        <w:widowControl/>
+        <w:numPr>
+          <w:ilvl w:val="0"/>
+          <w:numId w:val="6"/>
+        </w:numPr>
+        <w:suppressLineNumbers w:val="0"/>
+        <w:spacing w:before="0" w:beforeAutospacing="1" w:after="0" w:afterAutospacing="1"/>
+        <w:ind w:left="720" w:hanging="360"/>
+        <w:rPr>
+          <w:rFonts w:hint="default" w:ascii="Calibri" w:hAnsi="Calibri" w:cs="Calibri"/>
+        </w:rPr>
+      </w:pPr>
+      <w:r>
+        <w:rPr>
+          <w:rFonts w:hint="default" w:ascii="Calibri" w:hAnsi="Calibri" w:cs="Calibri"/>
+        </w:rPr>
+        <w:t>2 items are genuinely open-ended creative writing (</w:t>
+      </w:r>
+      <w:r>
+        <w:rPr>
+          <w:rStyle w:val="7"/>
+          <w:rFonts w:hint="default" w:ascii="Calibri" w:hAnsi="Calibri" w:cs="Calibri"/>
+        </w:rPr>
+        <w:t>answerKey: "open response"</w:t>
+      </w:r>
+      <w:r>
+        <w:rPr>
+          <w:rFonts w:hint="default" w:ascii="Calibri" w:hAnsi="Calibri" w:cs="Calibri"/>
+        </w:rPr>
+        <w:t xml:space="preserve">, tagged </w:t>
+      </w:r>
+      <w:r>
+        <w:rPr>
+          <w:rStyle w:val="7"/>
+          <w:rFonts w:hint="default" w:ascii="Calibri" w:hAnsi="Calibri" w:cs="Calibri"/>
+        </w:rPr>
+        <w:t>"open_response"</w:t>
+      </w:r>
+      <w:r>
+        <w:rPr>
+          <w:rFonts w:hint="default" w:ascii="Calibri" w:hAnsi="Calibri" w:cs="Calibri"/>
+        </w:rPr>
+        <w:t>).</w:t>
+      </w:r>
+    </w:p>
+    <w:p>
+      <w:pPr>
+        <w:pStyle w:val="9"/>
+        <w:keepNext w:val="0"/>
+        <w:keepLines w:val="0"/>
+        <w:widowControl/>
+        <w:suppressLineNumbers w:val="0"/>
+        <w:bidi w:val="0"/>
+        <w:spacing w:before="0" w:beforeAutospacing="1" w:after="0" w:afterAutospacing="1"/>
+        <w:ind w:left="0" w:right="0"/>
+        <w:rPr>
+          <w:rFonts w:hint="default" w:ascii="Calibri" w:hAnsi="Calibri" w:cs="Calibri"/>
+        </w:rPr>
+      </w:pPr>
+      <w:r>
+        <w:rPr>
+          <w:rStyle w:val="7"/>
+          <w:rFonts w:hint="default" w:ascii="Calibri" w:hAnsi="Calibri" w:cs="Calibri"/>
+        </w:rPr>
+        <w:t>sessionBuilder.ts</w:t>
+      </w:r>
+      <w:r>
+        <w:rPr>
+          <w:rFonts w:hint="default" w:ascii="Calibri" w:hAnsi="Calibri" w:cs="Calibri"/>
+        </w:rPr>
+        <w:t xml:space="preserve">'s item-pool query excludes </w:t>
+      </w:r>
+      <w:r>
+        <w:rPr>
+          <w:rStyle w:val="7"/>
+          <w:rFonts w:hint="default" w:ascii="Calibri" w:hAnsi="Calibri" w:cs="Calibri"/>
+        </w:rPr>
+        <w:t>questionType = 'multi_part'</w:t>
+      </w:r>
+      <w:r>
+        <w:rPr>
+          <w:rFonts w:hint="default" w:ascii="Calibri" w:hAnsi="Calibri" w:cs="Calibri"/>
+        </w:rPr>
+        <w:t xml:space="preserve"> and any item tagged </w:t>
+      </w:r>
+      <w:r>
+        <w:rPr>
+          <w:rStyle w:val="7"/>
+          <w:rFonts w:hint="default" w:ascii="Calibri" w:hAnsi="Calibri" w:cs="Calibri"/>
+        </w:rPr>
+        <w:t>'open_response'</w:t>
+      </w:r>
+      <w:r>
+        <w:rPr>
+          <w:rFonts w:hint="default" w:ascii="Calibri" w:hAnsi="Calibri" w:cs="Calibri"/>
+        </w:rPr>
+        <w:t xml:space="preserve">, so only auto-gradable items reach children. </w:t>
+      </w:r>
+      <w:r>
+        <w:rPr>
+          <w:rStyle w:val="7"/>
+          <w:rFonts w:hint="default" w:ascii="Calibri" w:hAnsi="Calibri" w:cs="Calibri"/>
+        </w:rPr>
+        <w:t>seed-demo.ts</w:t>
+      </w:r>
+      <w:r>
+        <w:rPr>
+          <w:rFonts w:hint="default" w:ascii="Calibri" w:hAnsi="Calibri" w:cs="Calibri"/>
+        </w:rPr>
+        <w:t xml:space="preserve"> loads both </w:t>
+      </w:r>
+      <w:r>
+        <w:rPr>
+          <w:rStyle w:val="7"/>
+          <w:rFonts w:hint="default" w:ascii="Calibri" w:hAnsi="Calibri" w:cs="Calibri"/>
+        </w:rPr>
+        <w:t>sample-items.json</w:t>
+      </w:r>
+      <w:r>
+        <w:rPr>
+          <w:rFonts w:hint="default" w:ascii="Calibri" w:hAnsi="Calibri" w:cs="Calibri"/>
+        </w:rPr>
+        <w:t xml:space="preserve"> and </w:t>
+      </w:r>
+      <w:r>
+        <w:rPr>
+          <w:rStyle w:val="7"/>
+          <w:rFonts w:hint="default" w:ascii="Calibri" w:hAnsi="Calibri" w:cs="Calibri"/>
+        </w:rPr>
+        <w:t>week1-item-bank.json</w:t>
+      </w:r>
+      <w:r>
+        <w:rPr>
+          <w:rFonts w:hint="default" w:ascii="Calibri" w:hAnsi="Calibri" w:cs="Calibri"/>
+        </w:rPr>
+        <w:t>.</w:t>
+      </w:r>
+    </w:p>
+    <w:p>
+      <w:pPr>
+        <w:pStyle w:val="3"/>
+        <w:keepNext w:val="0"/>
+        <w:keepLines w:val="0"/>
+        <w:widowControl/>
+        <w:suppressLineNumbers w:val="0"/>
+        <w:bidi w:val="0"/>
+        <w:rPr>
+          <w:rFonts w:hint="default" w:ascii="Calibri" w:hAnsi="Calibri" w:cs="Calibri"/>
+        </w:rPr>
+      </w:pPr>
+      <w:r>
+        <w:rPr>
+          <w:rFonts w:hint="default" w:ascii="Calibri" w:hAnsi="Calibri" w:cs="Calibri"/>
+        </w:rPr>
+        <w:t>Parent onboarding + real curriculum-week derivation (this update)</w:t>
+      </w:r>
+    </w:p>
+    <w:p>
+      <w:pPr>
+        <w:pStyle w:val="9"/>
+        <w:keepNext w:val="0"/>
+        <w:keepLines w:val="0"/>
+        <w:widowControl/>
+        <w:suppressLineNumbers w:val="0"/>
+        <w:bidi w:val="0"/>
+        <w:spacing w:before="0" w:beforeAutospacing="1" w:after="0" w:afterAutospacing="1"/>
+        <w:ind w:left="0" w:right="0"/>
+        <w:rPr>
+          <w:rFonts w:hint="default" w:ascii="Calibri" w:hAnsi="Calibri" w:cs="Calibri"/>
+        </w:rPr>
+      </w:pPr>
+      <w:r>
+        <w:rPr>
+          <w:rFonts w:hint="default" w:ascii="Calibri" w:hAnsi="Calibri" w:cs="Calibri"/>
+        </w:rPr>
+        <w:t>Two MVP gaps closed together:</w:t>
+      </w:r>
+    </w:p>
+    <w:p>
+      <w:pPr>
+        <w:keepNext w:val="0"/>
+        <w:keepLines w:val="0"/>
+        <w:widowControl/>
+        <w:numPr>
+          <w:ilvl w:val="0"/>
+          <w:numId w:val="7"/>
+        </w:numPr>
+        <w:suppressLineNumbers w:val="0"/>
+        <w:spacing w:before="0" w:beforeAutospacing="1" w:after="0" w:afterAutospacing="1"/>
+        <w:ind w:left="720" w:hanging="360"/>
+        <w:rPr>
+          <w:rFonts w:hint="default" w:ascii="Calibri" w:hAnsi="Calibri" w:cs="Calibri"/>
+        </w:rPr>
+      </w:pPr>
+      <w:r>
+        <w:rPr>
+          <w:rStyle w:val="10"/>
+          <w:rFonts w:hint="default" w:ascii="Calibri" w:hAnsi="Calibri" w:cs="Calibri"/>
+        </w:rPr>
+        <w:t>Parent onboarding</w:t>
+      </w:r>
+      <w:r>
+        <w:rPr>
+          <w:rFonts w:hint="default" w:ascii="Calibri" w:hAnsi="Calibri" w:cs="Calibri"/>
+        </w:rPr>
+        <w:t xml:space="preserve"> (</w:t>
+      </w:r>
+      <w:r>
+        <w:rPr>
+          <w:rStyle w:val="7"/>
+          <w:rFonts w:hint="default" w:ascii="Calibri" w:hAnsi="Calibri" w:cs="Calibri"/>
+        </w:rPr>
+        <w:t>/parent/children</w:t>
+      </w:r>
+      <w:r>
+        <w:rPr>
+          <w:rFonts w:hint="default" w:ascii="Calibri" w:hAnsi="Calibri" w:cs="Calibri"/>
+        </w:rPr>
+        <w:t xml:space="preserve">, </w:t>
+      </w:r>
+      <w:r>
+        <w:rPr>
+          <w:rStyle w:val="7"/>
+          <w:rFonts w:hint="default" w:ascii="Calibri" w:hAnsi="Calibri" w:cs="Calibri"/>
+        </w:rPr>
+        <w:t>GET</w:t>
+      </w:r>
+      <w:r>
+        <w:rPr>
+          <w:rFonts w:hint="default" w:ascii="Calibri" w:hAnsi="Calibri" w:cs="Calibri"/>
+        </w:rPr>
+        <w:t>/</w:t>
+      </w:r>
+      <w:r>
+        <w:rPr>
+          <w:rStyle w:val="7"/>
+          <w:rFonts w:hint="default" w:ascii="Calibri" w:hAnsi="Calibri" w:cs="Calibri"/>
+        </w:rPr>
+        <w:t>POST /api/children</w:t>
+      </w:r>
+      <w:r>
+        <w:rPr>
+          <w:rFonts w:hint="default" w:ascii="Calibri" w:hAnsi="Calibri" w:cs="Calibri"/>
+        </w:rPr>
+        <w:t xml:space="preserve">): parents can now add multiple children (name, year level, state) instead of every page hard-coding </w:t>
+      </w:r>
+      <w:r>
+        <w:rPr>
+          <w:rStyle w:val="7"/>
+          <w:rFonts w:hint="default" w:ascii="Calibri" w:hAnsi="Calibri" w:cs="Calibri"/>
+        </w:rPr>
+        <w:t>demo_child_1</w:t>
+      </w:r>
+      <w:r>
+        <w:rPr>
+          <w:rFonts w:hint="default" w:ascii="Calibri" w:hAnsi="Calibri" w:cs="Calibri"/>
+        </w:rPr>
+        <w:t xml:space="preserve">. </w:t>
+      </w:r>
+      <w:r>
+        <w:rPr>
+          <w:rStyle w:val="7"/>
+          <w:rFonts w:hint="default" w:ascii="Calibri" w:hAnsi="Calibri" w:cs="Calibri"/>
+        </w:rPr>
+        <w:t>/child</w:t>
+      </w:r>
+      <w:r>
+        <w:rPr>
+          <w:rFonts w:hint="default" w:ascii="Calibri" w:hAnsi="Calibri" w:cs="Calibri"/>
+        </w:rPr>
+        <w:t xml:space="preserve"> and </w:t>
+      </w:r>
+      <w:r>
+        <w:rPr>
+          <w:rStyle w:val="7"/>
+          <w:rFonts w:hint="default" w:ascii="Calibri" w:hAnsi="Calibri" w:cs="Calibri"/>
+        </w:rPr>
+        <w:t>/parent/dashboard</w:t>
+      </w:r>
+      <w:r>
+        <w:rPr>
+          <w:rFonts w:hint="default" w:ascii="Calibri" w:hAnsi="Calibri" w:cs="Calibri"/>
+        </w:rPr>
+        <w:t xml:space="preserve"> now read </w:t>
+      </w:r>
+      <w:r>
+        <w:rPr>
+          <w:rStyle w:val="7"/>
+          <w:rFonts w:hint="default" w:ascii="Calibri" w:hAnsi="Calibri" w:cs="Calibri"/>
+        </w:rPr>
+        <w:t>?childId=</w:t>
+      </w:r>
+      <w:r>
+        <w:rPr>
+          <w:rFonts w:hint="default" w:ascii="Calibri" w:hAnsi="Calibri" w:cs="Calibri"/>
+        </w:rPr>
+        <w:t xml:space="preserve"> from the URL, falling back to the demo child if absent. Still no real auth — every call runs as one hard-coded demo parent (</w:t>
+      </w:r>
+      <w:r>
+        <w:rPr>
+          <w:rStyle w:val="7"/>
+          <w:rFonts w:hint="default" w:ascii="Calibri" w:hAnsi="Calibri" w:cs="Calibri"/>
+        </w:rPr>
+        <w:t>demo_parent_1</w:t>
+      </w:r>
+      <w:r>
+        <w:rPr>
+          <w:rFonts w:hint="default" w:ascii="Calibri" w:hAnsi="Calibri" w:cs="Calibri"/>
+        </w:rPr>
+        <w:t xml:space="preserve">); adding Clerk later means swapping that id for the authenticated user's id, no other changes needed. Adding a child outside Year 3 succeeds but the API returns </w:t>
+      </w:r>
+      <w:r>
+        <w:rPr>
+          <w:rStyle w:val="7"/>
+          <w:rFonts w:hint="default" w:ascii="Calibri" w:hAnsi="Calibri" w:cs="Calibri"/>
+        </w:rPr>
+        <w:t>hasContent: false</w:t>
+      </w:r>
+      <w:r>
+        <w:rPr>
+          <w:rFonts w:hint="default" w:ascii="Calibri" w:hAnsi="Calibri" w:cs="Calibri"/>
+        </w:rPr>
+        <w:t xml:space="preserve"> and the UI surfaces a "coming soon" note, since only Year 3 has curriculum content.</w:t>
+      </w:r>
+    </w:p>
+    <w:p>
+      <w:pPr>
+        <w:keepNext w:val="0"/>
+        <w:keepLines w:val="0"/>
+        <w:widowControl/>
+        <w:numPr>
+          <w:ilvl w:val="0"/>
+          <w:numId w:val="7"/>
+        </w:numPr>
+        <w:suppressLineNumbers w:val="0"/>
+        <w:spacing w:before="0" w:beforeAutospacing="1" w:after="0" w:afterAutospacing="1"/>
+        <w:ind w:left="720" w:hanging="360"/>
+        <w:rPr>
+          <w:rFonts w:hint="default" w:ascii="Calibri" w:hAnsi="Calibri" w:cs="Calibri"/>
+        </w:rPr>
+      </w:pPr>
+      <w:r>
+        <w:rPr>
+          <w:rStyle w:val="10"/>
+          <w:rFonts w:hint="default" w:ascii="Calibri" w:hAnsi="Calibri" w:cs="Calibri"/>
+        </w:rPr>
+        <w:t>Curriculum week derivation</w:t>
+      </w:r>
+      <w:r>
+        <w:rPr>
+          <w:rFonts w:hint="default" w:ascii="Calibri" w:hAnsi="Calibri" w:cs="Calibri"/>
+        </w:rPr>
+        <w:t xml:space="preserve"> (</w:t>
+      </w:r>
+      <w:r>
+        <w:rPr>
+          <w:rStyle w:val="7"/>
+          <w:rFonts w:hint="default" w:ascii="Calibri" w:hAnsi="Calibri" w:cs="Calibri"/>
+        </w:rPr>
+        <w:t>src/lib/curriculumWeek.ts</w:t>
+      </w:r>
+      <w:r>
+        <w:rPr>
+          <w:rFonts w:hint="default" w:ascii="Calibri" w:hAnsi="Calibri" w:cs="Calibri"/>
+        </w:rPr>
+        <w:t xml:space="preserve">): added a </w:t>
+      </w:r>
+      <w:r>
+        <w:rPr>
+          <w:rStyle w:val="7"/>
+          <w:rFonts w:hint="default" w:ascii="Calibri" w:hAnsi="Calibri" w:cs="Calibri"/>
+        </w:rPr>
+        <w:t>User.enrolledAt</w:t>
+      </w:r>
+      <w:r>
+        <w:rPr>
+          <w:rFonts w:hint="default" w:ascii="Calibri" w:hAnsi="Calibri" w:cs="Calibri"/>
+        </w:rPr>
+        <w:t xml:space="preserve"> column (migration </w:t>
+      </w:r>
+      <w:r>
+        <w:rPr>
+          <w:rStyle w:val="7"/>
+          <w:rFonts w:hint="default" w:ascii="Calibri" w:hAnsi="Calibri" w:cs="Calibri"/>
+        </w:rPr>
+        <w:t>0001_add_enrolled_at.sql</w:t>
+      </w:r>
+      <w:r>
+        <w:rPr>
+          <w:rFonts w:hint="default" w:ascii="Calibri" w:hAnsi="Calibri" w:cs="Calibri"/>
+        </w:rPr>
+        <w:t xml:space="preserve">, backfilled for pre-existing rows) and a </w:t>
+      </w:r>
+      <w:r>
+        <w:rPr>
+          <w:rStyle w:val="7"/>
+          <w:rFonts w:hint="default" w:ascii="Calibri" w:hAnsi="Calibri" w:cs="Calibri"/>
+        </w:rPr>
+        <w:t>computeCurrentTermWeek(enrolledAt, now)</w:t>
+      </w:r>
+      <w:r>
+        <w:rPr>
+          <w:rFonts w:hint="default" w:ascii="Calibri" w:hAnsi="Calibri" w:cs="Calibri"/>
+        </w:rPr>
+        <w:t xml:space="preserve"> helper (10-week terms), replacing the </w:t>
+      </w:r>
+      <w:r>
+        <w:rPr>
+          <w:rStyle w:val="7"/>
+          <w:rFonts w:hint="default" w:ascii="Calibri" w:hAnsi="Calibri" w:cs="Calibri"/>
+        </w:rPr>
+        <w:t>term: 1, week: 1</w:t>
+      </w:r>
+      <w:r>
+        <w:rPr>
+          <w:rFonts w:hint="default" w:ascii="Calibri" w:hAnsi="Calibri" w:cs="Calibri"/>
+        </w:rPr>
+        <w:t xml:space="preserve"> hard-code in </w:t>
+      </w:r>
+      <w:r>
+        <w:rPr>
+          <w:rStyle w:val="7"/>
+          <w:rFonts w:hint="default" w:ascii="Calibri" w:hAnsi="Calibri" w:cs="Calibri"/>
+        </w:rPr>
+        <w:t>/api/session/today</w:t>
+      </w:r>
+      <w:r>
+        <w:rPr>
+          <w:rFonts w:hint="default" w:ascii="Calibri" w:hAnsi="Calibri" w:cs="Calibri"/>
+        </w:rPr>
+        <w:t xml:space="preserve">. Currently clamped to term 1 / week 1 — deliberately, since that's the only week with real </w:t>
+      </w:r>
+      <w:r>
+        <w:rPr>
+          <w:rStyle w:val="7"/>
+          <w:rFonts w:hint="default" w:ascii="Calibri" w:hAnsi="Calibri" w:cs="Calibri"/>
+        </w:rPr>
+        <w:t>curriculumSequenceEntries</w:t>
+      </w:r>
+      <w:r>
+        <w:rPr>
+          <w:rFonts w:hint="default" w:ascii="Calibri" w:hAnsi="Calibri" w:cs="Calibri"/>
+        </w:rPr>
+        <w:t xml:space="preserve"> + item content right now. Verified via a manual test: backdating a test child's </w:t>
+      </w:r>
+      <w:r>
+        <w:rPr>
+          <w:rStyle w:val="7"/>
+          <w:rFonts w:hint="default" w:ascii="Calibri" w:hAnsi="Calibri" w:cs="Calibri"/>
+        </w:rPr>
+        <w:t>enrolledAt</w:t>
+      </w:r>
+      <w:r>
+        <w:rPr>
+          <w:rFonts w:hint="default" w:ascii="Calibri" w:hAnsi="Calibri" w:cs="Calibri"/>
+        </w:rPr>
+        <w:t xml:space="preserve"> by 25 days without the clamp caused an empty session (their computed week had no "new skill" entries and they had no prior review state to fall back on); with the clamp, they correctly get the Week 1 pool instead. Raising </w:t>
+      </w:r>
+      <w:r>
+        <w:rPr>
+          <w:rStyle w:val="7"/>
+          <w:rFonts w:hint="default" w:ascii="Calibri" w:hAnsi="Calibri" w:cs="Calibri"/>
+        </w:rPr>
+        <w:t>MAX_AVAILABLE_TERM</w:t>
+      </w:r>
+      <w:r>
+        <w:rPr>
+          <w:rFonts w:hint="default" w:ascii="Calibri" w:hAnsi="Calibri" w:cs="Calibri"/>
+        </w:rPr>
+        <w:t>/</w:t>
+      </w:r>
+      <w:r>
+        <w:rPr>
+          <w:rStyle w:val="7"/>
+          <w:rFonts w:hint="default" w:ascii="Calibri" w:hAnsi="Calibri" w:cs="Calibri"/>
+        </w:rPr>
+        <w:t>MAX_AVAILABLE_WEEK</w:t>
+      </w:r>
+      <w:r>
+        <w:rPr>
+          <w:rFonts w:hint="default" w:ascii="Calibri" w:hAnsi="Calibri" w:cs="Calibri"/>
+        </w:rPr>
+        <w:t xml:space="preserve"> in that file is the only change needed once more weeks of content exist.</w:t>
+      </w:r>
+    </w:p>
+    <w:p>
+      <w:pPr>
+        <w:pStyle w:val="9"/>
+        <w:keepNext w:val="0"/>
+        <w:keepLines w:val="0"/>
+        <w:widowControl/>
+        <w:suppressLineNumbers w:val="0"/>
+        <w:bidi w:val="0"/>
+        <w:spacing w:before="0" w:beforeAutospacing="1" w:after="0" w:afterAutospacing="1"/>
+        <w:ind w:left="0" w:right="0"/>
+        <w:rPr>
+          <w:rFonts w:hint="default" w:ascii="Calibri" w:hAnsi="Calibri" w:cs="Calibri"/>
+        </w:rPr>
+      </w:pPr>
+      <w:r>
+        <w:rPr>
+          <w:rStyle w:val="10"/>
+          <w:rFonts w:hint="default" w:ascii="Calibri" w:hAnsi="Calibri" w:cs="Calibri"/>
+        </w:rPr>
+        <w:t>Delivered to Chandana as two sequential git patches</w:t>
+      </w:r>
+      <w:r>
+        <w:rPr>
+          <w:rFonts w:hint="default" w:ascii="Calibri" w:hAnsi="Calibri" w:cs="Calibri"/>
+        </w:rPr>
+        <w:t xml:space="preserve"> (</w:t>
+      </w:r>
+      <w:r>
+        <w:rPr>
+          <w:rStyle w:val="7"/>
+          <w:rFonts w:hint="default" w:ascii="Calibri" w:hAnsi="Calibri" w:cs="Calibri"/>
+        </w:rPr>
+        <w:t>recallie-week1-items.patch</w:t>
+      </w:r>
+      <w:r>
+        <w:rPr>
+          <w:rFonts w:hint="default" w:ascii="Calibri" w:hAnsi="Calibri" w:cs="Calibri"/>
+        </w:rPr>
+        <w:t xml:space="preserve">, then </w:t>
+      </w:r>
+      <w:r>
+        <w:rPr>
+          <w:rStyle w:val="7"/>
+          <w:rFonts w:hint="default" w:ascii="Calibri" w:hAnsi="Calibri" w:cs="Calibri"/>
+        </w:rPr>
+        <w:t>recallie-parent-onboarding.patch</w:t>
+      </w:r>
+      <w:r>
+        <w:rPr>
+          <w:rFonts w:hint="default" w:ascii="Calibri" w:hAnsi="Calibri" w:cs="Calibri"/>
+        </w:rPr>
+        <w:t xml:space="preserve">) rather than tarballs, since her local </w:t>
+      </w:r>
+      <w:r>
+        <w:rPr>
+          <w:rStyle w:val="7"/>
+          <w:rFonts w:hint="default" w:ascii="Calibri" w:hAnsi="Calibri" w:cs="Calibri"/>
+        </w:rPr>
+        <w:t>C:\recallie-app</w:t>
+      </w:r>
+      <w:r>
+        <w:rPr>
+          <w:rFonts w:hint="default" w:ascii="Calibri" w:hAnsi="Calibri" w:cs="Calibri"/>
+        </w:rPr>
+        <w:t xml:space="preserve"> copy tracks this repo via git. Apply with </w:t>
+      </w:r>
+      <w:r>
+        <w:rPr>
+          <w:rStyle w:val="7"/>
+          <w:rFonts w:hint="default" w:ascii="Calibri" w:hAnsi="Calibri" w:cs="Calibri"/>
+        </w:rPr>
+        <w:t>git apply &lt;file&gt;</w:t>
+      </w:r>
+      <w:r>
+        <w:rPr>
+          <w:rFonts w:hint="default" w:ascii="Calibri" w:hAnsi="Calibri" w:cs="Calibri"/>
+        </w:rPr>
+        <w:t xml:space="preserve"> in order, then </w:t>
+      </w:r>
+      <w:r>
+        <w:rPr>
+          <w:rStyle w:val="7"/>
+          <w:rFonts w:hint="default" w:ascii="Calibri" w:hAnsi="Calibri" w:cs="Calibri"/>
+        </w:rPr>
+        <w:t>npm run db:migrate &amp;&amp; npm run db:seed:demo</w:t>
+      </w:r>
+      <w:r>
+        <w:rPr>
+          <w:rFonts w:hint="default" w:ascii="Calibri" w:hAnsi="Calibri" w:cs="Calibri"/>
+        </w:rPr>
+        <w:t>, then commit/push herself — sandbox git still can't push directly to her GitHub repo (token scoping), same as the initial scaffold.</w:t>
+      </w:r>
+    </w:p>
+    <w:p>
+      <w:pPr>
+        <w:pStyle w:val="3"/>
+        <w:keepNext w:val="0"/>
+        <w:keepLines w:val="0"/>
+        <w:widowControl/>
+        <w:suppressLineNumbers w:val="0"/>
+        <w:bidi w:val="0"/>
+        <w:rPr>
+          <w:rFonts w:hint="default" w:ascii="Calibri" w:hAnsi="Calibri" w:cs="Calibri"/>
+        </w:rPr>
+      </w:pPr>
+      <w:r>
+        <w:rPr>
+          <w:rFonts w:hint="default" w:ascii="Calibri" w:hAnsi="Calibri" w:cs="Calibri"/>
+        </w:rPr>
+        <w:t>Verified working (smoke-tested via curl + tsc against the sandbox's local Postgres)</w:t>
+      </w:r>
+    </w:p>
+    <w:p>
+      <w:pPr>
+        <w:keepNext w:val="0"/>
+        <w:keepLines w:val="0"/>
+        <w:widowControl/>
+        <w:numPr>
+          <w:ilvl w:val="0"/>
+          <w:numId w:val="8"/>
+        </w:numPr>
+        <w:suppressLineNumbers w:val="0"/>
+        <w:spacing w:before="0" w:beforeAutospacing="1" w:after="0" w:afterAutospacing="1"/>
+        <w:ind w:left="720" w:hanging="360"/>
+        <w:rPr>
+          <w:rFonts w:hint="default" w:ascii="Calibri" w:hAnsi="Calibri" w:cs="Calibri"/>
+        </w:rPr>
+      </w:pPr>
+      <w:r>
+        <w:rPr>
+          <w:rStyle w:val="7"/>
+          <w:rFonts w:hint="default" w:ascii="Calibri" w:hAnsi="Calibri" w:cs="Calibri"/>
+        </w:rPr>
+        <w:t>npx tsc --noEmit</w:t>
+      </w:r>
+      <w:r>
+        <w:rPr>
+          <w:rFonts w:hint="default" w:ascii="Calibri" w:hAnsi="Calibri" w:cs="Calibri"/>
+        </w:rPr>
+        <w:t xml:space="preserve"> clean across the whole app after all changes.</w:t>
+      </w:r>
+    </w:p>
+    <w:p>
+      <w:pPr>
+        <w:keepNext w:val="0"/>
+        <w:keepLines w:val="0"/>
+        <w:widowControl/>
+        <w:numPr>
+          <w:ilvl w:val="0"/>
+          <w:numId w:val="8"/>
+        </w:numPr>
+        <w:suppressLineNumbers w:val="0"/>
+        <w:spacing w:before="0" w:beforeAutospacing="1" w:after="0" w:afterAutospacing="1"/>
+        <w:ind w:left="720" w:hanging="360"/>
+        <w:rPr>
+          <w:rFonts w:hint="default" w:ascii="Calibri" w:hAnsi="Calibri" w:cs="Calibri"/>
+        </w:rPr>
+      </w:pPr>
+      <w:r>
+        <w:rPr>
+          <w:rFonts w:hint="default" w:ascii="Calibri" w:hAnsi="Calibri" w:cs="Calibri"/>
+        </w:rPr>
+        <w:t xml:space="preserve">Item bank: </w:t>
+      </w:r>
+      <w:r>
+        <w:rPr>
+          <w:rStyle w:val="7"/>
+          <w:rFonts w:hint="default" w:ascii="Calibri" w:hAnsi="Calibri" w:cs="Calibri"/>
+        </w:rPr>
+        <w:t>Item</w:t>
+      </w:r>
+      <w:r>
+        <w:rPr>
+          <w:rFonts w:hint="default" w:ascii="Calibri" w:hAnsi="Calibri" w:cs="Calibri"/>
+        </w:rPr>
+        <w:t xml:space="preserve"> table has 62 rows (26 multiple_choice, 32 short_answer, 4 multi_part — multi_part correctly never appears in </w:t>
+      </w:r>
+      <w:r>
+        <w:rPr>
+          <w:rStyle w:val="7"/>
+          <w:rFonts w:hint="default" w:ascii="Calibri" w:hAnsi="Calibri" w:cs="Calibri"/>
+        </w:rPr>
+        <w:t>/api/session/today</w:t>
+      </w:r>
+      <w:r>
+        <w:rPr>
+          <w:rFonts w:hint="default" w:ascii="Calibri" w:hAnsi="Calibri" w:cs="Calibri"/>
+        </w:rPr>
+        <w:t xml:space="preserve"> output); sessions are richer (8 items, real variety) for both subjects.</w:t>
+      </w:r>
+    </w:p>
+    <w:p>
+      <w:pPr>
+        <w:keepNext w:val="0"/>
+        <w:keepLines w:val="0"/>
+        <w:widowControl/>
+        <w:numPr>
+          <w:ilvl w:val="0"/>
+          <w:numId w:val="8"/>
+        </w:numPr>
+        <w:suppressLineNumbers w:val="0"/>
+        <w:spacing w:before="0" w:beforeAutospacing="1" w:after="0" w:afterAutospacing="1"/>
+        <w:ind w:left="720" w:hanging="360"/>
+        <w:rPr>
+          <w:rFonts w:hint="default" w:ascii="Calibri" w:hAnsi="Calibri" w:cs="Calibri"/>
+        </w:rPr>
+      </w:pPr>
+      <w:r>
+        <w:rPr>
+          <w:rStyle w:val="7"/>
+          <w:rFonts w:hint="default" w:ascii="Calibri" w:hAnsi="Calibri" w:cs="Calibri"/>
+        </w:rPr>
+        <w:t>POST /api/reviews</w:t>
+      </w:r>
+      <w:r>
+        <w:rPr>
+          <w:rFonts w:hint="default" w:ascii="Calibri" w:hAnsi="Calibri" w:cs="Calibri"/>
+        </w:rPr>
+        <w:t xml:space="preserve"> correctly grades an array-valued </w:t>
+      </w:r>
+      <w:r>
+        <w:rPr>
+          <w:rStyle w:val="7"/>
+          <w:rFonts w:hint="default" w:ascii="Calibri" w:hAnsi="Calibri" w:cs="Calibri"/>
+        </w:rPr>
+        <w:t>answerKey</w:t>
+      </w:r>
+      <w:r>
+        <w:rPr>
+          <w:rFonts w:hint="default" w:ascii="Calibri" w:hAnsi="Calibri" w:cs="Calibri"/>
+        </w:rPr>
+        <w:t xml:space="preserve"> item (accepted a non-primary phrasing), updates </w:t>
+      </w:r>
+      <w:r>
+        <w:rPr>
+          <w:rStyle w:val="7"/>
+          <w:rFonts w:hint="default" w:ascii="Calibri" w:hAnsi="Calibri" w:cs="Calibri"/>
+        </w:rPr>
+        <w:t>ChildSkillState</w:t>
+      </w:r>
+      <w:r>
+        <w:rPr>
+          <w:rFonts w:hint="default" w:ascii="Calibri" w:hAnsi="Calibri" w:cs="Calibri"/>
+        </w:rPr>
+        <w:t>, returns step-by-step solution + misconception.</w:t>
+      </w:r>
+    </w:p>
+    <w:p>
+      <w:pPr>
+        <w:keepNext w:val="0"/>
+        <w:keepLines w:val="0"/>
+        <w:widowControl/>
+        <w:numPr>
+          <w:ilvl w:val="0"/>
+          <w:numId w:val="8"/>
+        </w:numPr>
+        <w:suppressLineNumbers w:val="0"/>
+        <w:spacing w:before="0" w:beforeAutospacing="1" w:after="0" w:afterAutospacing="1"/>
+        <w:ind w:left="720" w:hanging="360"/>
+        <w:rPr>
+          <w:rFonts w:hint="default" w:ascii="Calibri" w:hAnsi="Calibri" w:cs="Calibri"/>
+        </w:rPr>
+      </w:pPr>
+      <w:r>
+        <w:rPr>
+          <w:rFonts w:hint="default" w:ascii="Calibri" w:hAnsi="Calibri" w:cs="Calibri"/>
+        </w:rPr>
+        <w:t xml:space="preserve">Parent onboarding: created a test child via </w:t>
+      </w:r>
+      <w:r>
+        <w:rPr>
+          <w:rStyle w:val="7"/>
+          <w:rFonts w:hint="default" w:ascii="Calibri" w:hAnsi="Calibri" w:cs="Calibri"/>
+        </w:rPr>
+        <w:t>POST /api/children</w:t>
+      </w:r>
+      <w:r>
+        <w:rPr>
+          <w:rFonts w:hint="default" w:ascii="Calibri" w:hAnsi="Calibri" w:cs="Calibri"/>
+        </w:rPr>
+        <w:t xml:space="preserve">, confirmed it appears in </w:t>
+      </w:r>
+      <w:r>
+        <w:rPr>
+          <w:rStyle w:val="7"/>
+          <w:rFonts w:hint="default" w:ascii="Calibri" w:hAnsi="Calibri" w:cs="Calibri"/>
+        </w:rPr>
+        <w:t>GET /api/children</w:t>
+      </w:r>
+      <w:r>
+        <w:rPr>
+          <w:rFonts w:hint="default" w:ascii="Calibri" w:hAnsi="Calibri" w:cs="Calibri"/>
+        </w:rPr>
+        <w:t xml:space="preserve">, confirmed their fresh session correctly computes term 1/week 1 (new skills), confirmed a Year 2 test child gets </w:t>
+      </w:r>
+      <w:r>
+        <w:rPr>
+          <w:rStyle w:val="7"/>
+          <w:rFonts w:hint="default" w:ascii="Calibri" w:hAnsi="Calibri" w:cs="Calibri"/>
+        </w:rPr>
+        <w:t>hasContent: false</w:t>
+      </w:r>
+      <w:r>
+        <w:rPr>
+          <w:rFonts w:hint="default" w:ascii="Calibri" w:hAnsi="Calibri" w:cs="Calibri"/>
+        </w:rPr>
+        <w:t>.</w:t>
+      </w:r>
+    </w:p>
+    <w:p>
+      <w:pPr>
+        <w:keepNext w:val="0"/>
+        <w:keepLines w:val="0"/>
+        <w:widowControl/>
+        <w:numPr>
+          <w:ilvl w:val="0"/>
+          <w:numId w:val="8"/>
+        </w:numPr>
+        <w:suppressLineNumbers w:val="0"/>
+        <w:spacing w:before="0" w:beforeAutospacing="1" w:after="0" w:afterAutospacing="1"/>
+        <w:ind w:left="720" w:hanging="360"/>
+        <w:rPr>
+          <w:rFonts w:hint="default" w:ascii="Calibri" w:hAnsi="Calibri" w:cs="Calibri"/>
+        </w:rPr>
+      </w:pPr>
+      <w:r>
+        <w:rPr>
+          <w:rFonts w:hint="default" w:ascii="Calibri" w:hAnsi="Calibri" w:cs="Calibri"/>
+        </w:rPr>
+        <w:t>Curriculum week clamp: confirmed the "backdated enrolment → empty session" edge case, then confirmed the fix (clamped week) resolves it — session still returns the Week 1 pool.</w:t>
+      </w:r>
+    </w:p>
+    <w:p>
+      <w:pPr>
+        <w:keepNext w:val="0"/>
+        <w:keepLines w:val="0"/>
+        <w:widowControl/>
+        <w:numPr>
+          <w:ilvl w:val="0"/>
+          <w:numId w:val="8"/>
+        </w:numPr>
+        <w:suppressLineNumbers w:val="0"/>
+        <w:spacing w:before="0" w:beforeAutospacing="1" w:after="0" w:afterAutospacing="1"/>
+        <w:ind w:left="720" w:hanging="360"/>
+        <w:rPr>
+          <w:rFonts w:hint="default" w:ascii="Calibri" w:hAnsi="Calibri" w:cs="Calibri"/>
+        </w:rPr>
+      </w:pPr>
+      <w:r>
+        <w:rPr>
+          <w:rFonts w:hint="default" w:ascii="Calibri" w:hAnsi="Calibri" w:cs="Calibri"/>
+        </w:rPr>
+        <w:t>All four pages (</w:t>
+      </w:r>
+      <w:r>
+        <w:rPr>
+          <w:rStyle w:val="7"/>
+          <w:rFonts w:hint="default" w:ascii="Calibri" w:hAnsi="Calibri" w:cs="Calibri"/>
+        </w:rPr>
+        <w:t>/</w:t>
+      </w:r>
+      <w:r>
+        <w:rPr>
+          <w:rFonts w:hint="default" w:ascii="Calibri" w:hAnsi="Calibri" w:cs="Calibri"/>
+        </w:rPr>
+        <w:t xml:space="preserve">, </w:t>
+      </w:r>
+      <w:r>
+        <w:rPr>
+          <w:rStyle w:val="7"/>
+          <w:rFonts w:hint="default" w:ascii="Calibri" w:hAnsi="Calibri" w:cs="Calibri"/>
+        </w:rPr>
+        <w:t>/child?childId=</w:t>
+      </w:r>
+      <w:r>
+        <w:rPr>
+          <w:rFonts w:hint="default" w:ascii="Calibri" w:hAnsi="Calibri" w:cs="Calibri"/>
+        </w:rPr>
+        <w:t xml:space="preserve">, </w:t>
+      </w:r>
+      <w:r>
+        <w:rPr>
+          <w:rStyle w:val="7"/>
+          <w:rFonts w:hint="default" w:ascii="Calibri" w:hAnsi="Calibri" w:cs="Calibri"/>
+        </w:rPr>
+        <w:t>/parent/dashboard?childId=</w:t>
+      </w:r>
+      <w:r>
+        <w:rPr>
+          <w:rFonts w:hint="default" w:ascii="Calibri" w:hAnsi="Calibri" w:cs="Calibri"/>
+        </w:rPr>
+        <w:t xml:space="preserve">, </w:t>
+      </w:r>
+      <w:r>
+        <w:rPr>
+          <w:rStyle w:val="7"/>
+          <w:rFonts w:hint="default" w:ascii="Calibri" w:hAnsi="Calibri" w:cs="Calibri"/>
+        </w:rPr>
+        <w:t>/parent/children</w:t>
+      </w:r>
+      <w:r>
+        <w:rPr>
+          <w:rFonts w:hint="default" w:ascii="Calibri" w:hAnsi="Calibri" w:cs="Calibri"/>
+        </w:rPr>
+        <w:t>) and all API routes return 200 against the sandbox's local Postgres.</w:t>
+      </w:r>
+    </w:p>
+    <w:p>
+      <w:pPr>
+        <w:keepNext w:val="0"/>
+        <w:keepLines w:val="0"/>
+        <w:widowControl/>
+        <w:numPr>
+          <w:ilvl w:val="0"/>
+          <w:numId w:val="8"/>
+        </w:numPr>
+        <w:suppressLineNumbers w:val="0"/>
+        <w:spacing w:before="0" w:beforeAutospacing="1" w:after="0" w:afterAutospacing="1"/>
+        <w:ind w:left="720" w:hanging="360"/>
+        <w:rPr>
+          <w:rFonts w:hint="default" w:ascii="Calibri" w:hAnsi="Calibri" w:cs="Calibri"/>
+        </w:rPr>
+      </w:pPr>
+      <w:r>
+        <w:rPr>
+          <w:rFonts w:hint="default" w:ascii="Calibri" w:hAnsi="Calibri" w:cs="Calibri"/>
+        </w:rPr>
+        <w:t>Two commits made to the sandbox's local git (</w:t>
+      </w:r>
+      <w:r>
+        <w:rPr>
+          <w:rStyle w:val="7"/>
+          <w:rFonts w:hint="default" w:ascii="Calibri" w:hAnsi="Calibri" w:cs="Calibri"/>
+        </w:rPr>
+        <w:t>ee4a1d6</w:t>
+      </w:r>
+      <w:r>
+        <w:rPr>
+          <w:rFonts w:hint="default" w:ascii="Calibri" w:hAnsi="Calibri" w:cs="Calibri"/>
+        </w:rPr>
+        <w:t xml:space="preserve">, </w:t>
+      </w:r>
+      <w:r>
+        <w:rPr>
+          <w:rStyle w:val="7"/>
+          <w:rFonts w:hint="default" w:ascii="Calibri" w:hAnsi="Calibri" w:cs="Calibri"/>
+        </w:rPr>
+        <w:t>7d7278d</w:t>
+      </w:r>
+      <w:r>
+        <w:rPr>
+          <w:rFonts w:hint="default" w:ascii="Calibri" w:hAnsi="Calibri" w:cs="Calibri"/>
+        </w:rPr>
+        <w:t>) and exported as patch files for Chandana to apply to her own tracked copy.</w:t>
+      </w:r>
+    </w:p>
+    <w:p>
+      <w:pPr>
+        <w:pStyle w:val="3"/>
+        <w:keepNext w:val="0"/>
+        <w:keepLines w:val="0"/>
+        <w:widowControl/>
+        <w:suppressLineNumbers w:val="0"/>
+        <w:bidi w:val="0"/>
+        <w:rPr>
+          <w:rFonts w:hint="default" w:ascii="Calibri" w:hAnsi="Calibri" w:cs="Calibri"/>
+        </w:rPr>
+      </w:pPr>
+      <w:r>
+        <w:rPr>
+          <w:rFonts w:hint="default" w:ascii="Calibri" w:hAnsi="Calibri" w:cs="Calibri"/>
+        </w:rPr>
+        <w:t>Known issue to resolve with Chandana</w:t>
+      </w:r>
+    </w:p>
+    <w:p>
+      <w:pPr>
+        <w:pStyle w:val="9"/>
+        <w:keepNext w:val="0"/>
+        <w:keepLines w:val="0"/>
+        <w:widowControl/>
+        <w:suppressLineNumbers w:val="0"/>
+        <w:bidi w:val="0"/>
+        <w:spacing w:before="0" w:beforeAutospacing="1" w:after="0" w:afterAutospacing="1"/>
+        <w:ind w:left="0" w:right="0"/>
+        <w:rPr>
+          <w:rFonts w:hint="default" w:ascii="Calibri" w:hAnsi="Calibri" w:cs="Calibri"/>
+        </w:rPr>
+      </w:pPr>
+      <w:r>
+        <w:rPr>
+          <w:rFonts w:hint="default" w:ascii="Calibri" w:hAnsi="Calibri" w:cs="Calibri"/>
+        </w:rPr>
+        <w:t xml:space="preserve">The "needs_attention" ("Area to give more attention") status triggers whenever </w:t>
+      </w:r>
+      <w:r>
+        <w:rPr>
+          <w:rStyle w:val="7"/>
+          <w:rFonts w:hint="default" w:ascii="Calibri" w:hAnsi="Calibri" w:cs="Calibri"/>
+        </w:rPr>
+        <w:t>stability &lt;= 7 days</w:t>
+      </w:r>
+      <w:r>
+        <w:rPr>
+          <w:rFonts w:hint="default" w:ascii="Calibri" w:hAnsi="Calibri" w:cs="Calibri"/>
+        </w:rPr>
+        <w:t>, which — per the documented thresholds — is true for essentially every skill during its first 1–2 weeks, even after several correct answers in a row (traced manually: 6 straight correct fast answers only reached stability ≈5.6). So new skills default to looking like they "need attention" until they mature past a week. This is a faithful port of the documented algorithm, not a bug introduced during the build — but it may read as discouraging to parents/children if shipped as-is. Options to discuss: raise thresholds, add a distinct "still building" status for skills younger than N days/reviews, or accept it.</w:t>
+      </w:r>
+    </w:p>
+    <w:p>
+      <w:pPr>
+        <w:pStyle w:val="3"/>
+        <w:keepNext w:val="0"/>
+        <w:keepLines w:val="0"/>
+        <w:widowControl/>
+        <w:suppressLineNumbers w:val="0"/>
+        <w:bidi w:val="0"/>
+        <w:rPr>
+          <w:rFonts w:hint="default" w:ascii="Calibri" w:hAnsi="Calibri" w:cs="Calibri"/>
+        </w:rPr>
+      </w:pPr>
+      <w:r>
+        <w:rPr>
+          <w:rFonts w:hint="default" w:ascii="Calibri" w:hAnsi="Calibri" w:cs="Calibri"/>
+        </w:rPr>
+        <w:t>Explicit next steps (not yet built)</w:t>
+      </w:r>
+    </w:p>
+    <w:p>
+      <w:pPr>
+        <w:keepNext w:val="0"/>
+        <w:keepLines w:val="0"/>
+        <w:widowControl/>
+        <w:numPr>
+          <w:ilvl w:val="0"/>
+          <w:numId w:val="9"/>
+        </w:numPr>
+        <w:suppressLineNumbers w:val="0"/>
+        <w:spacing w:before="0" w:beforeAutospacing="1" w:after="0" w:afterAutospacing="1"/>
+        <w:ind w:left="720" w:hanging="360"/>
+        <w:rPr>
+          <w:rFonts w:hint="default" w:ascii="Calibri" w:hAnsi="Calibri" w:cs="Calibri"/>
+        </w:rPr>
+      </w:pPr>
+      <w:r>
+        <w:rPr>
+          <w:rFonts w:hint="default" w:ascii="Calibri" w:hAnsi="Calibri" w:cs="Calibri"/>
+        </w:rPr>
+        <w:t xml:space="preserve">Auth (Clerk) — every add-child/dashboard/session call still runs as one hard-coded demo parent/child; no login flow. Schema already has </w:t>
+      </w:r>
+      <w:r>
+        <w:rPr>
+          <w:rStyle w:val="7"/>
+          <w:rFonts w:hint="default" w:ascii="Calibri" w:hAnsi="Calibri" w:cs="Calibri"/>
+        </w:rPr>
+        <w:t>clerkUserId</w:t>
+      </w:r>
+      <w:r>
+        <w:rPr>
+          <w:rFonts w:hint="default" w:ascii="Calibri" w:hAnsi="Calibri" w:cs="Calibri"/>
+        </w:rPr>
+        <w:t xml:space="preserve"> ready for this.</w:t>
+      </w:r>
+    </w:p>
+    <w:p>
+      <w:pPr>
+        <w:keepNext w:val="0"/>
+        <w:keepLines w:val="0"/>
+        <w:widowControl/>
+        <w:numPr>
+          <w:ilvl w:val="0"/>
+          <w:numId w:val="9"/>
+        </w:numPr>
+        <w:suppressLineNumbers w:val="0"/>
+        <w:spacing w:before="0" w:beforeAutospacing="1" w:after="0" w:afterAutospacing="1"/>
+        <w:ind w:left="720" w:hanging="360"/>
+        <w:rPr>
+          <w:rFonts w:hint="default" w:ascii="Calibri" w:hAnsi="Calibri" w:cs="Calibri"/>
+        </w:rPr>
+      </w:pPr>
+      <w:r>
+        <w:rPr>
+          <w:rFonts w:hint="default" w:ascii="Calibri" w:hAnsi="Calibri" w:cs="Calibri"/>
+        </w:rPr>
+        <w:t>Human review of the 54 newly generated items before they're considered production content.</w:t>
+      </w:r>
+    </w:p>
+    <w:p>
+      <w:pPr>
+        <w:keepNext w:val="0"/>
+        <w:keepLines w:val="0"/>
+        <w:widowControl/>
+        <w:numPr>
+          <w:ilvl w:val="0"/>
+          <w:numId w:val="9"/>
+        </w:numPr>
+        <w:suppressLineNumbers w:val="0"/>
+        <w:spacing w:before="0" w:beforeAutospacing="1" w:after="0" w:afterAutospacing="1"/>
+        <w:ind w:left="720" w:hanging="360"/>
+        <w:rPr>
+          <w:rFonts w:hint="default" w:ascii="Calibri" w:hAnsi="Calibri" w:cs="Calibri"/>
+        </w:rPr>
+      </w:pPr>
+      <w:r>
+        <w:rPr>
+          <w:rFonts w:hint="default" w:ascii="Calibri" w:hAnsi="Calibri" w:cs="Calibri"/>
+        </w:rPr>
+        <w:t xml:space="preserve">More curriculum content — only Term 1 Week 1 has both sequence entries and items, for Year 3 only. Weeks 2–10, other terms, and other year levels still need generating via the same prompt templates; </w:t>
+      </w:r>
+      <w:r>
+        <w:rPr>
+          <w:rStyle w:val="7"/>
+          <w:rFonts w:hint="default" w:ascii="Calibri" w:hAnsi="Calibri" w:cs="Calibri"/>
+        </w:rPr>
+        <w:t>curriculumWeek.ts</w:t>
+      </w:r>
+      <w:r>
+        <w:rPr>
+          <w:rFonts w:hint="default" w:ascii="Calibri" w:hAnsi="Calibri" w:cs="Calibri"/>
+        </w:rPr>
+        <w:t xml:space="preserve"> is ready to roll forward automatically once they exist (just raise its two constants).</w:t>
+      </w:r>
+    </w:p>
+    <w:p>
+      <w:pPr>
+        <w:keepNext w:val="0"/>
+        <w:keepLines w:val="0"/>
+        <w:widowControl/>
+        <w:numPr>
+          <w:ilvl w:val="0"/>
+          <w:numId w:val="9"/>
+        </w:numPr>
+        <w:suppressLineNumbers w:val="0"/>
+        <w:spacing w:before="0" w:beforeAutospacing="1" w:after="0" w:afterAutospacing="1"/>
+        <w:ind w:left="720" w:hanging="360"/>
+        <w:rPr>
+          <w:rFonts w:hint="default" w:ascii="Calibri" w:hAnsi="Calibri" w:cs="Calibri"/>
+        </w:rPr>
+      </w:pPr>
+      <w:r>
+        <w:rPr>
+          <w:rFonts w:hint="default" w:ascii="Calibri" w:hAnsi="Calibri" w:cs="Calibri"/>
+        </w:rPr>
+        <w:t xml:space="preserve">Grading support for </w:t>
+      </w:r>
+      <w:r>
+        <w:rPr>
+          <w:rStyle w:val="7"/>
+          <w:rFonts w:hint="default" w:ascii="Calibri" w:hAnsi="Calibri" w:cs="Calibri"/>
+        </w:rPr>
+        <w:t>multi_part</w:t>
+      </w:r>
+      <w:r>
+        <w:rPr>
+          <w:rFonts w:hint="default" w:ascii="Calibri" w:hAnsi="Calibri" w:cs="Calibri"/>
+        </w:rPr>
+        <w:t xml:space="preserve"> (object-valued answers) and </w:t>
+      </w:r>
+      <w:r>
+        <w:rPr>
+          <w:rStyle w:val="7"/>
+          <w:rFonts w:hint="default" w:ascii="Calibri" w:hAnsi="Calibri" w:cs="Calibri"/>
+        </w:rPr>
+        <w:t>open_response</w:t>
+      </w:r>
+      <w:r>
+        <w:rPr>
+          <w:rFonts w:hint="default" w:ascii="Calibri" w:hAnsi="Calibri" w:cs="Calibri"/>
+        </w:rPr>
+        <w:t xml:space="preserve"> (rubric/teacher-review) items — currently generated but excluded from live sessions.</w:t>
+      </w:r>
+    </w:p>
+    <w:p>
+      <w:pPr>
+        <w:keepNext w:val="0"/>
+        <w:keepLines w:val="0"/>
+        <w:widowControl/>
+        <w:numPr>
+          <w:ilvl w:val="0"/>
+          <w:numId w:val="9"/>
+        </w:numPr>
+        <w:suppressLineNumbers w:val="0"/>
+        <w:spacing w:before="0" w:beforeAutospacing="1" w:after="0" w:afterAutospacing="1"/>
+        <w:ind w:left="720" w:hanging="360"/>
+        <w:rPr>
+          <w:rFonts w:hint="default" w:ascii="Calibri" w:hAnsi="Calibri" w:cs="Calibri"/>
+        </w:rPr>
+      </w:pPr>
+      <w:r>
+        <w:rPr>
+          <w:rFonts w:hint="default" w:ascii="Calibri" w:hAnsi="Calibri" w:cs="Calibri"/>
+        </w:rPr>
+        <w:t>Stripe subscriptions / free trial gating.</w:t>
+      </w:r>
+    </w:p>
+    <w:p>
+      <w:pPr>
+        <w:keepNext w:val="0"/>
+        <w:keepLines w:val="0"/>
+        <w:widowControl/>
+        <w:numPr>
+          <w:ilvl w:val="0"/>
+          <w:numId w:val="9"/>
+        </w:numPr>
+        <w:suppressLineNumbers w:val="0"/>
+        <w:spacing w:before="0" w:beforeAutospacing="1" w:after="0" w:afterAutospacing="1"/>
+        <w:ind w:left="720" w:hanging="360"/>
+        <w:rPr>
+          <w:rFonts w:hint="default" w:ascii="Calibri" w:hAnsi="Calibri" w:cs="Calibri"/>
+        </w:rPr>
+      </w:pPr>
+      <w:r>
+        <w:rPr>
+          <w:rFonts w:hint="default" w:ascii="Calibri" w:hAnsi="Calibri" w:cs="Calibri"/>
+        </w:rPr>
+        <w:t>Gamification beyond points/streak (badges, progress map).</w:t>
+      </w:r>
+    </w:p>
+    <w:p>
+      <w:pPr>
+        <w:keepNext w:val="0"/>
+        <w:keepLines w:val="0"/>
+        <w:widowControl/>
+        <w:numPr>
+          <w:ilvl w:val="0"/>
+          <w:numId w:val="9"/>
+        </w:numPr>
+        <w:suppressLineNumbers w:val="0"/>
+        <w:spacing w:before="0" w:beforeAutospacing="1" w:after="0" w:afterAutospacing="1"/>
+        <w:ind w:left="720" w:hanging="360"/>
+        <w:rPr>
+          <w:rFonts w:hint="default" w:ascii="Calibri" w:hAnsi="Calibri" w:cs="Calibri"/>
+        </w:rPr>
+      </w:pPr>
+      <w:r>
+        <w:rPr>
+          <w:rFonts w:hint="default" w:ascii="Calibri" w:hAnsi="Calibri" w:cs="Calibri"/>
+        </w:rPr>
+        <w:t>Monthly parent report generation/email.</w:t>
+      </w:r>
+    </w:p>
+    <w:p>
+      <w:pPr>
+        <w:keepNext w:val="0"/>
+        <w:keepLines w:val="0"/>
+        <w:widowControl/>
+        <w:numPr>
+          <w:ilvl w:val="0"/>
+          <w:numId w:val="9"/>
+        </w:numPr>
+        <w:suppressLineNumbers w:val="0"/>
+        <w:spacing w:before="0" w:beforeAutospacing="1" w:after="0" w:afterAutospacing="1"/>
+        <w:ind w:left="720" w:hanging="360"/>
+        <w:rPr>
+          <w:rFonts w:hint="default" w:ascii="Calibri" w:hAnsi="Calibri" w:cs="Calibri"/>
+        </w:rPr>
+      </w:pPr>
+      <w:r>
+        <w:rPr>
+          <w:rFonts w:hint="default" w:ascii="Calibri" w:hAnsi="Calibri" w:cs="Calibri"/>
+        </w:rPr>
+        <w:t xml:space="preserve">Chandana hasn't yet connected a cloud Postgres (Neon/Supabase) to her local </w:t>
+      </w:r>
+      <w:r>
+        <w:rPr>
+          <w:rStyle w:val="7"/>
+          <w:rFonts w:hint="default" w:ascii="Calibri" w:hAnsi="Calibri" w:cs="Calibri"/>
+        </w:rPr>
+        <w:t>C:\recallie-app</w:t>
+      </w:r>
+      <w:r>
+        <w:rPr>
+          <w:rFonts w:hint="default" w:ascii="Calibri" w:hAnsi="Calibri" w:cs="Calibri"/>
+        </w:rPr>
+        <w:t xml:space="preserve"> copy — </w:t>
+      </w:r>
+      <w:r>
+        <w:rPr>
+          <w:rStyle w:val="7"/>
+          <w:rFonts w:hint="default" w:ascii="Calibri" w:hAnsi="Calibri" w:cs="Calibri"/>
+        </w:rPr>
+        <w:t>.env</w:t>
+      </w:r>
+      <w:r>
+        <w:rPr>
+          <w:rFonts w:hint="default" w:ascii="Calibri" w:hAnsi="Calibri" w:cs="Calibri"/>
+        </w:rPr>
+        <w:t xml:space="preserve"> there still needs a real </w:t>
+      </w:r>
+      <w:r>
+        <w:rPr>
+          <w:rStyle w:val="7"/>
+          <w:rFonts w:hint="default" w:ascii="Calibri" w:hAnsi="Calibri" w:cs="Calibri"/>
+        </w:rPr>
+        <w:t>DATABASE_URL</w:t>
+      </w:r>
+      <w:r>
+        <w:rPr>
+          <w:rFonts w:hint="default" w:ascii="Calibri" w:hAnsi="Calibri" w:cs="Calibri"/>
+        </w:rPr>
+        <w:t xml:space="preserve"> before </w:t>
+      </w:r>
+      <w:r>
+        <w:rPr>
+          <w:rStyle w:val="7"/>
+          <w:rFonts w:hint="default" w:ascii="Calibri" w:hAnsi="Calibri" w:cs="Calibri"/>
+        </w:rPr>
+        <w:t>npm run dev</w:t>
+      </w:r>
+      <w:r>
+        <w:rPr>
+          <w:rFonts w:hint="default" w:ascii="Calibri" w:hAnsi="Calibri" w:cs="Calibri"/>
+        </w:rPr>
+        <w:t xml:space="preserve"> will work locally (she is currently developing against local Postgres, which is fine for now).</w:t>
+      </w:r>
+    </w:p>
+    <w:p>
+      <w:pPr>
+        <w:keepNext w:val="0"/>
+        <w:keepLines w:val="0"/>
+        <w:widowControl/>
+        <w:suppressLineNumbers w:val="0"/>
+        <w:jc w:val="left"/>
+        <w:rPr>
+          <w:rFonts w:hint="default" w:ascii="Calibri" w:hAnsi="Calibri" w:cs="Calibri"/>
+        </w:rPr>
+      </w:pPr>
+      <w:r>
+        <w:rPr>
+          <w:rFonts w:hint="default" w:ascii="Calibri" w:hAnsi="Calibri" w:eastAsia="SimSun" w:cs="Calibri"/>
+          <w:kern w:val="0"/>
+          <w:sz w:val="24"/>
+          <w:szCs w:val="24"/>
+          <w:lang w:val="en-US" w:eastAsia="zh-CN" w:bidi="ar"/>
+        </w:rPr>
+        <w:t>Start local PostgreSQL and create recallie database</w:t>
+      </w:r>
+    </w:p>
+    <w:p>
+      <w:pPr>
+        <w:keepNext w:val="0"/>
+        <w:keepLines w:val="0"/>
+        <w:widowControl/>
+        <w:suppressLineNumbers w:val="0"/>
+        <w:jc w:val="left"/>
+        <w:rPr>
+          <w:rFonts w:hint="default" w:ascii="Calibri" w:hAnsi="Calibri" w:cs="Calibri"/>
+        </w:rPr>
+      </w:pPr>
+      <w:r>
+        <w:rPr>
+          <w:rFonts w:hint="default" w:ascii="Calibri" w:hAnsi="Calibri" w:eastAsia="SimSun" w:cs="Calibri"/>
+          <w:kern w:val="0"/>
+          <w:sz w:val="24"/>
+          <w:szCs w:val="24"/>
+          <w:lang w:val="en-US" w:eastAsia="zh-CN" w:bidi="ar"/>
+        </w:rPr>
+        <w:t>Scaffold Next.js 15 app (TypeScript + Tailwind)</w:t>
+      </w:r>
+    </w:p>
+    <w:p>
+      <w:pPr>
+        <w:keepNext w:val="0"/>
+        <w:keepLines w:val="0"/>
+        <w:widowControl/>
+        <w:suppressLineNumbers w:val="0"/>
+        <w:jc w:val="left"/>
+        <w:rPr>
+          <w:rFonts w:hint="default" w:ascii="Calibri" w:hAnsi="Calibri" w:cs="Calibri"/>
+        </w:rPr>
+      </w:pPr>
+      <w:r>
+        <w:rPr>
+          <w:rFonts w:hint="default" w:ascii="Calibri" w:hAnsi="Calibri" w:eastAsia="SimSun" w:cs="Calibri"/>
+          <w:kern w:val="0"/>
+          <w:sz w:val="24"/>
+          <w:szCs w:val="24"/>
+          <w:lang w:val="en-US" w:eastAsia="zh-CN" w:bidi="ar"/>
+        </w:rPr>
+        <w:t>Add Prisma schema and run initial migration</w:t>
+      </w:r>
+    </w:p>
+    <w:p>
+      <w:pPr>
+        <w:keepNext w:val="0"/>
+        <w:keepLines w:val="0"/>
+        <w:widowControl/>
+        <w:suppressLineNumbers w:val="0"/>
+        <w:jc w:val="left"/>
+        <w:rPr>
+          <w:rFonts w:hint="default" w:ascii="Calibri" w:hAnsi="Calibri" w:cs="Calibri"/>
+        </w:rPr>
+      </w:pPr>
+      <w:r>
+        <w:rPr>
+          <w:rFonts w:hint="default" w:ascii="Calibri" w:hAnsi="Calibri" w:eastAsia="SimSun" w:cs="Calibri"/>
+          <w:kern w:val="0"/>
+          <w:sz w:val="24"/>
+          <w:szCs w:val="24"/>
+          <w:lang w:val="en-US" w:eastAsia="zh-CN" w:bidi="ar"/>
+        </w:rPr>
+        <w:t>Implement spaced-repetition engine (lib/spacedRepetition.ts)</w:t>
+      </w:r>
+    </w:p>
+    <w:p>
+      <w:pPr>
+        <w:keepNext w:val="0"/>
+        <w:keepLines w:val="0"/>
+        <w:widowControl/>
+        <w:suppressLineNumbers w:val="0"/>
+        <w:jc w:val="left"/>
+        <w:rPr>
+          <w:rFonts w:hint="default" w:ascii="Calibri" w:hAnsi="Calibri" w:cs="Calibri"/>
+        </w:rPr>
+      </w:pPr>
+      <w:r>
+        <w:rPr>
+          <w:rFonts w:hint="default" w:ascii="Calibri" w:hAnsi="Calibri" w:eastAsia="SimSun" w:cs="Calibri"/>
+          <w:kern w:val="0"/>
+          <w:sz w:val="24"/>
+          <w:szCs w:val="24"/>
+          <w:lang w:val="en-US" w:eastAsia="zh-CN" w:bidi="ar"/>
+        </w:rPr>
+        <w:t>Seed Year 3 Maths &amp; English curriculum (skills + 10-week sequence)</w:t>
+      </w:r>
+    </w:p>
+    <w:p>
+      <w:pPr>
+        <w:keepNext w:val="0"/>
+        <w:keepLines w:val="0"/>
+        <w:widowControl/>
+        <w:suppressLineNumbers w:val="0"/>
+        <w:jc w:val="left"/>
+        <w:rPr>
+          <w:rFonts w:hint="default" w:ascii="Calibri" w:hAnsi="Calibri" w:cs="Calibri"/>
+        </w:rPr>
+      </w:pPr>
+      <w:r>
+        <w:rPr>
+          <w:rFonts w:hint="default" w:ascii="Calibri" w:hAnsi="Calibri" w:eastAsia="SimSun" w:cs="Calibri"/>
+          <w:kern w:val="0"/>
+          <w:sz w:val="24"/>
+          <w:szCs w:val="24"/>
+          <w:lang w:val="en-US" w:eastAsia="zh-CN" w:bidi="ar"/>
+        </w:rPr>
+        <w:t>Build session builder + core API routes</w:t>
+      </w:r>
+    </w:p>
+    <w:p>
+      <w:pPr>
+        <w:keepNext w:val="0"/>
+        <w:keepLines w:val="0"/>
+        <w:widowControl/>
+        <w:suppressLineNumbers w:val="0"/>
+        <w:jc w:val="left"/>
+        <w:rPr>
+          <w:rFonts w:hint="default" w:ascii="Calibri" w:hAnsi="Calibri" w:cs="Calibri"/>
+        </w:rPr>
+      </w:pPr>
+      <w:r>
+        <w:rPr>
+          <w:rFonts w:hint="default" w:ascii="Calibri" w:hAnsi="Calibri" w:eastAsia="SimSun" w:cs="Calibri"/>
+          <w:kern w:val="0"/>
+          <w:sz w:val="24"/>
+          <w:szCs w:val="24"/>
+          <w:lang w:val="en-US" w:eastAsia="zh-CN" w:bidi="ar"/>
+        </w:rPr>
+        <w:t>Build minimal UI: child session screen + parent dashboard skeleton</w:t>
+      </w:r>
+    </w:p>
+    <w:p>
+      <w:pPr>
+        <w:keepNext w:val="0"/>
+        <w:keepLines w:val="0"/>
+        <w:widowControl/>
+        <w:suppressLineNumbers w:val="0"/>
+        <w:jc w:val="left"/>
+        <w:rPr>
+          <w:rFonts w:hint="default" w:ascii="Calibri" w:hAnsi="Calibri" w:cs="Calibri"/>
+        </w:rPr>
+      </w:pPr>
+      <w:r>
+        <w:rPr>
+          <w:rFonts w:hint="default" w:ascii="Calibri" w:hAnsi="Calibri" w:eastAsia="SimSun" w:cs="Calibri"/>
+          <w:kern w:val="0"/>
+          <w:sz w:val="24"/>
+          <w:szCs w:val="24"/>
+          <w:lang w:val="en-US" w:eastAsia="zh-CN" w:bidi="ar"/>
+        </w:rPr>
+        <w:t>Verify: run dev server, smoke-test API routes and pages</w:t>
+      </w:r>
+    </w:p>
+    <w:p>
+      <w:pPr>
+        <w:keepNext w:val="0"/>
+        <w:keepLines w:val="0"/>
+        <w:widowControl/>
+        <w:suppressLineNumbers w:val="0"/>
+        <w:jc w:val="left"/>
+        <w:rPr>
+          <w:rFonts w:hint="default" w:ascii="Calibri" w:hAnsi="Calibri" w:cs="Calibri"/>
+        </w:rPr>
+      </w:pPr>
+      <w:r>
+        <w:rPr>
+          <w:rFonts w:hint="default" w:ascii="Calibri" w:hAnsi="Calibri" w:eastAsia="SimSun" w:cs="Calibri"/>
+          <w:kern w:val="0"/>
+          <w:sz w:val="24"/>
+          <w:szCs w:val="24"/>
+          <w:lang w:val="en-US" w:eastAsia="zh-CN" w:bidi="ar"/>
+        </w:rPr>
+        <w:t>9</w:t>
+      </w:r>
+    </w:p>
+    <w:p>
+      <w:pPr>
+        <w:keepNext w:val="0"/>
+        <w:keepLines w:val="0"/>
+        <w:widowControl/>
+        <w:suppressLineNumbers w:val="0"/>
+        <w:jc w:val="left"/>
+        <w:rPr>
+          <w:rFonts w:hint="default" w:ascii="Calibri" w:hAnsi="Calibri" w:cs="Calibri"/>
+        </w:rPr>
+      </w:pPr>
+      <w:r>
+        <w:rPr>
+          <w:rFonts w:hint="default" w:ascii="Calibri" w:hAnsi="Calibri" w:eastAsia="SimSun" w:cs="Calibri"/>
+          <w:kern w:val="0"/>
+          <w:sz w:val="24"/>
+          <w:szCs w:val="24"/>
+          <w:lang w:val="en-US" w:eastAsia="zh-CN" w:bidi="ar"/>
+        </w:rPr>
+        <w:t>Generate Week 1 Maths item bank (2 skills)</w:t>
+      </w:r>
+    </w:p>
+    <w:p>
+      <w:pPr>
+        <w:keepNext w:val="0"/>
+        <w:keepLines w:val="0"/>
+        <w:widowControl/>
+        <w:suppressLineNumbers w:val="0"/>
+        <w:jc w:val="left"/>
+        <w:rPr>
+          <w:rFonts w:hint="default" w:ascii="Calibri" w:hAnsi="Calibri" w:cs="Calibri"/>
+        </w:rPr>
+      </w:pPr>
+      <w:r>
+        <w:rPr>
+          <w:rFonts w:hint="default" w:ascii="Calibri" w:hAnsi="Calibri" w:eastAsia="SimSun" w:cs="Calibri"/>
+          <w:kern w:val="0"/>
+          <w:sz w:val="24"/>
+          <w:szCs w:val="24"/>
+          <w:lang w:val="en-US" w:eastAsia="zh-CN" w:bidi="ar"/>
+        </w:rPr>
+        <w:t>10</w:t>
+      </w:r>
+    </w:p>
+    <w:p>
+      <w:pPr>
+        <w:keepNext w:val="0"/>
+        <w:keepLines w:val="0"/>
+        <w:widowControl/>
+        <w:suppressLineNumbers w:val="0"/>
+        <w:jc w:val="left"/>
+        <w:rPr>
+          <w:rFonts w:hint="default" w:ascii="Calibri" w:hAnsi="Calibri" w:cs="Calibri"/>
+        </w:rPr>
+      </w:pPr>
+      <w:r>
+        <w:rPr>
+          <w:rFonts w:hint="default" w:ascii="Calibri" w:hAnsi="Calibri" w:eastAsia="SimSun" w:cs="Calibri"/>
+          <w:kern w:val="0"/>
+          <w:sz w:val="24"/>
+          <w:szCs w:val="24"/>
+          <w:lang w:val="en-US" w:eastAsia="zh-CN" w:bidi="ar"/>
+        </w:rPr>
+        <w:t>Generate Week 1 English item bank (3 skills)</w:t>
+      </w:r>
+    </w:p>
+    <w:p>
+      <w:pPr>
+        <w:keepNext w:val="0"/>
+        <w:keepLines w:val="0"/>
+        <w:widowControl/>
+        <w:suppressLineNumbers w:val="0"/>
+        <w:jc w:val="left"/>
+        <w:rPr>
+          <w:rFonts w:hint="default" w:ascii="Calibri" w:hAnsi="Calibri" w:cs="Calibri"/>
+        </w:rPr>
+      </w:pPr>
+      <w:r>
+        <w:rPr>
+          <w:rFonts w:hint="default" w:ascii="Calibri" w:hAnsi="Calibri" w:eastAsia="SimSun" w:cs="Calibri"/>
+          <w:kern w:val="0"/>
+          <w:sz w:val="24"/>
+          <w:szCs w:val="24"/>
+          <w:lang w:val="en-US" w:eastAsia="zh-CN" w:bidi="ar"/>
+        </w:rPr>
+        <w:t>11</w:t>
+      </w:r>
+    </w:p>
+    <w:p>
+      <w:pPr>
+        <w:keepNext w:val="0"/>
+        <w:keepLines w:val="0"/>
+        <w:widowControl/>
+        <w:suppressLineNumbers w:val="0"/>
+        <w:jc w:val="left"/>
+        <w:rPr>
+          <w:rFonts w:hint="default" w:ascii="Calibri" w:hAnsi="Calibri" w:cs="Calibri"/>
+        </w:rPr>
+      </w:pPr>
+      <w:r>
+        <w:rPr>
+          <w:rFonts w:hint="default" w:ascii="Calibri" w:hAnsi="Calibri" w:eastAsia="SimSun" w:cs="Calibri"/>
+          <w:kern w:val="0"/>
+          <w:sz w:val="24"/>
+          <w:szCs w:val="24"/>
+          <w:lang w:val="en-US" w:eastAsia="zh-CN" w:bidi="ar"/>
+        </w:rPr>
+        <w:t>Seed new item bank into sandbox DB and verify session builder</w:t>
+      </w:r>
+    </w:p>
+    <w:p>
+      <w:pPr>
+        <w:keepNext w:val="0"/>
+        <w:keepLines w:val="0"/>
+        <w:widowControl/>
+        <w:suppressLineNumbers w:val="0"/>
+        <w:jc w:val="left"/>
+        <w:rPr>
+          <w:rFonts w:hint="default" w:ascii="Calibri" w:hAnsi="Calibri" w:cs="Calibri"/>
+        </w:rPr>
+      </w:pPr>
+      <w:r>
+        <w:rPr>
+          <w:rFonts w:hint="default" w:ascii="Calibri" w:hAnsi="Calibri" w:eastAsia="SimSun" w:cs="Calibri"/>
+          <w:kern w:val="0"/>
+          <w:sz w:val="24"/>
+          <w:szCs w:val="24"/>
+          <w:lang w:val="en-US" w:eastAsia="zh-CN" w:bidi="ar"/>
+        </w:rPr>
+        <w:t>12</w:t>
+      </w:r>
+    </w:p>
+    <w:p>
+      <w:pPr>
+        <w:keepNext w:val="0"/>
+        <w:keepLines w:val="0"/>
+        <w:widowControl/>
+        <w:suppressLineNumbers w:val="0"/>
+        <w:jc w:val="left"/>
+        <w:rPr>
+          <w:rFonts w:hint="default" w:ascii="Calibri" w:hAnsi="Calibri" w:cs="Calibri"/>
+        </w:rPr>
+      </w:pPr>
+      <w:r>
+        <w:rPr>
+          <w:rFonts w:hint="default" w:ascii="Calibri" w:hAnsi="Calibri" w:eastAsia="SimSun" w:cs="Calibri"/>
+          <w:kern w:val="0"/>
+          <w:sz w:val="24"/>
+          <w:szCs w:val="24"/>
+          <w:lang w:val="en-US" w:eastAsia="zh-CN" w:bidi="ar"/>
+        </w:rPr>
+        <w:t>Package item bank + seed script update for the user's local repo</w:t>
+      </w:r>
+    </w:p>
+    <w:p>
+      <w:pPr>
+        <w:keepNext w:val="0"/>
+        <w:keepLines w:val="0"/>
+        <w:widowControl/>
+        <w:suppressLineNumbers w:val="0"/>
+        <w:jc w:val="left"/>
+        <w:rPr>
+          <w:rFonts w:hint="default" w:ascii="Calibri" w:hAnsi="Calibri" w:cs="Calibri"/>
+        </w:rPr>
+      </w:pPr>
+      <w:r>
+        <w:rPr>
+          <w:rFonts w:hint="default" w:ascii="Calibri" w:hAnsi="Calibri" w:eastAsia="SimSun" w:cs="Calibri"/>
+          <w:kern w:val="0"/>
+          <w:sz w:val="24"/>
+          <w:szCs w:val="24"/>
+          <w:lang w:val="en-US" w:eastAsia="zh-CN" w:bidi="ar"/>
+        </w:rPr>
+        <w:t>recallie-app-src.tar.gz1-home.png2-child.png3-parent-dashboard.pngrecallie-week1-items.patchrecallie-parent-onboarding.patchbuild-l</w:t>
+      </w:r>
+      <w:bookmarkStart w:id="0" w:name="_GoBack"/>
+      <w:bookmarkEnd w:id="0"/>
+      <w:r>
+        <w:rPr>
+          <w:rFonts w:hint="default" w:ascii="Calibri" w:hAnsi="Calibri" w:eastAsia="SimSun" w:cs="Calibri"/>
+          <w:kern w:val="0"/>
+          <w:sz w:val="24"/>
+          <w:szCs w:val="24"/>
+          <w:lang w:val="en-US" w:eastAsia="zh-CN" w:bidi="ar"/>
+        </w:rPr>
+        <w:t>og-2026-08-17.md</w:t>
+      </w:r>
+    </w:p>
+    <w:p>
+      <w:pPr>
+        <w:keepNext w:val="0"/>
+        <w:keepLines w:val="0"/>
+        <w:widowControl/>
+        <w:suppressLineNumbers w:val="0"/>
+        <w:jc w:val="left"/>
+        <w:rPr>
+          <w:rFonts w:hint="default" w:ascii="Calibri" w:hAnsi="Calibri" w:cs="Calibri"/>
+        </w:rPr>
+      </w:pPr>
+      <w:r>
+        <w:rPr>
+          <w:rFonts w:hint="default" w:ascii="Calibri" w:hAnsi="Calibri" w:eastAsia="SimSun" w:cs="Calibri"/>
+          <w:kern w:val="0"/>
+          <w:sz w:val="24"/>
+          <w:szCs w:val="24"/>
+          <w:lang w:val="en-US" w:eastAsia="zh-CN" w:bidi="ar"/>
+        </w:rPr>
+        <w:t>Recallie.com.au</w:t>
+      </w:r>
+    </w:p>
+    <w:p>
+      <w:pPr>
+        <w:keepNext w:val="0"/>
+        <w:keepLines w:val="0"/>
+        <w:widowControl/>
+        <w:suppressLineNumbers w:val="0"/>
+        <w:jc w:val="left"/>
+        <w:rPr>
+          <w:rFonts w:hint="default" w:ascii="Calibri" w:hAnsi="Calibri" w:cs="Calibri"/>
+        </w:rPr>
+      </w:pPr>
+      <w:r>
+        <w:rPr>
+          <w:rFonts w:hint="default" w:ascii="Calibri" w:hAnsi="Calibri" w:eastAsia="SimSun" w:cs="Calibri"/>
+          <w:kern w:val="0"/>
+          <w:sz w:val="24"/>
+          <w:szCs w:val="24"/>
+          <w:lang w:val="en-US" w:eastAsia="zh-CN" w:bidi="ar"/>
+        </w:rPr>
+        <w:t>Connectors</w:t>
+      </w:r>
+    </w:p>
+    <w:p>
+      <w:pPr>
+        <w:keepNext w:val="0"/>
+        <w:keepLines w:val="0"/>
+        <w:widowControl/>
+        <w:suppressLineNumbers w:val="0"/>
+        <w:jc w:val="left"/>
+        <w:rPr>
+          <w:rFonts w:hint="default" w:ascii="Calibri" w:hAnsi="Calibri" w:cs="Calibri"/>
+        </w:rPr>
+      </w:pPr>
+      <w:r>
+        <w:rPr>
+          <w:rFonts w:hint="default" w:ascii="Calibri" w:hAnsi="Calibri" w:eastAsia="SimSun" w:cs="Calibri"/>
+          <w:kern w:val="0"/>
+          <w:sz w:val="24"/>
+          <w:szCs w:val="24"/>
+          <w:lang w:val="en-US" w:eastAsia="zh-CN" w:bidi="ar"/>
+        </w:rPr>
+        <w:t>Web Search</w:t>
+      </w:r>
+    </w:p>
+    <w:p>
+      <w:pPr>
+        <w:keepNext w:val="0"/>
+        <w:keepLines w:val="0"/>
+        <w:widowControl/>
+        <w:suppressLineNumbers w:val="0"/>
+        <w:jc w:val="left"/>
+        <w:rPr>
+          <w:rFonts w:hint="default" w:ascii="Calibri" w:hAnsi="Calibri" w:cs="Calibri"/>
+        </w:rPr>
+      </w:pPr>
+      <w:r>
+        <w:rPr>
+          <w:rFonts w:hint="default" w:ascii="Calibri" w:hAnsi="Calibri" w:eastAsia="SimSun" w:cs="Calibri"/>
+          <w:kern w:val="0"/>
+          <w:sz w:val="24"/>
+          <w:szCs w:val="24"/>
+          <w:lang w:val="en-US" w:eastAsia="zh-CN" w:bidi="ar"/>
+        </w:rPr>
+        <w:t>Skills</w:t>
+      </w:r>
+    </w:p>
+    <w:p>
+      <w:pPr>
+        <w:keepNext w:val="0"/>
+        <w:keepLines w:val="0"/>
+        <w:widowControl/>
+        <w:suppressLineNumbers w:val="0"/>
+        <w:jc w:val="left"/>
+        <w:rPr>
+          <w:rFonts w:hint="default" w:ascii="Calibri" w:hAnsi="Calibri" w:cs="Calibri"/>
+        </w:rPr>
+      </w:pPr>
+      <w:r>
+        <w:rPr>
+          <w:rFonts w:hint="default" w:ascii="Calibri" w:hAnsi="Calibri" w:eastAsia="SimSun" w:cs="Calibri"/>
+          <w:kern w:val="0"/>
+          <w:sz w:val="24"/>
+          <w:szCs w:val="24"/>
+          <w:lang w:val="en-US" w:eastAsia="zh-CN" w:bidi="ar"/>
+        </w:rPr>
+        <w:t>Create a skill for this kind of task</w:t>
+      </w:r>
+    </w:p>
+    <w:p>
+      <w:pPr>
+        <w:pStyle w:val="3"/>
+        <w:keepNext w:val="0"/>
+        <w:keepLines w:val="0"/>
+        <w:widowControl/>
+        <w:suppressLineNumbers w:val="0"/>
+        <w:rPr>
+          <w:rFonts w:hint="default" w:ascii="Calibri" w:hAnsi="Calibri" w:cs="Calibri"/>
+        </w:rPr>
+      </w:pPr>
+      <w:r>
+        <w:rPr>
+          <w:rFonts w:hint="default" w:ascii="Calibri" w:hAnsi="Calibri" w:cs="Calibri"/>
+        </w:rPr>
+        <w:t>Downloaded recallie-parent-onboarding.patch S</w:t>
       </w:r>
     </w:p>
     <w:p>
@@ -1741,6 +4792,155 @@
 <file path=word/numbering.xml><?xml version="1.0" encoding="utf-8"?>
 <w:numbering xmlns:wpc="http://schemas.microsoft.com/office/word/2010/wordprocessingCanvas" xmlns:mc="http://schemas.openxmlformats.org/markup-compatibility/2006" xmlns:o="urn:schemas-microsoft-com:office:office" xmlns:r="http://schemas.openxmlformats.org/officeDocument/2006/relationships" xmlns:m="http://schemas.openxmlformats.org/officeDocument/2006/math" xmlns:v="urn:schemas-microsoft-com:vml" xmlns:wp14="http://schemas.microsoft.com/office/word/2010/wordprocessingDrawing" xmlns:wp="http://schemas.openxmlformats.org/drawingml/2006/wordprocessingDrawing" xmlns:w10="urn:schemas-microsoft-com:office:word" xmlns:w="http://schemas.openxmlformats.org/wordprocessingml/2006/main" xmlns:w14="http://schemas.microsoft.com/office/word/2010/wordml" xmlns:wpg="http://schemas.microsoft.com/office/word/2010/wordprocessingGroup" xmlns:wpi="http://schemas.microsoft.com/office/word/2010/wordprocessingInk" xmlns:wne="http://schemas.microsoft.com/office/word/2006/wordml" xmlns:wps="http://schemas.microsoft.com/office/word/2010/wordprocessingShape" xmlns:wpsCustomData="http://www.wps.cn/officeDocument/2013/wpsCustomData" mc:Ignorable="w14 wp14">
   <w:abstractNum w:abstractNumId="0">
+    <w:nsid w:val="8685B9C4"/>
+    <w:multiLevelType w:val="multilevel"/>
+    <w:tmpl w:val="8685B9C4"/>
+    <w:lvl w:ilvl="0" w:tentative="0">
+      <w:start w:val="1"/>
+      <w:numFmt w:val="bullet"/>
+      <w:lvlText w:val=""/>
+      <w:lvlJc w:val="left"/>
+      <w:pPr>
+        <w:tabs>
+          <w:tab w:val="left" w:pos="720"/>
+        </w:tabs>
+        <w:ind w:left="720" w:hanging="360"/>
+      </w:pPr>
+      <w:rPr>
+        <w:rFonts w:hint="default" w:ascii="Symbol" w:hAnsi="Symbol" w:cs="Symbol"/>
+        <w:sz w:val="20"/>
+      </w:rPr>
+    </w:lvl>
+    <w:lvl w:ilvl="1" w:tentative="0">
+      <w:start w:val="1"/>
+      <w:numFmt w:val="bullet"/>
+      <w:lvlText w:val="o"/>
+      <w:lvlJc w:val="left"/>
+      <w:pPr>
+        <w:tabs>
+          <w:tab w:val="left" w:pos="1440"/>
+        </w:tabs>
+        <w:ind w:left="1440" w:hanging="360"/>
+      </w:pPr>
+      <w:rPr>
+        <w:rFonts w:hint="default" w:ascii="Courier New" w:hAnsi="Courier New" w:cs="Courier New"/>
+        <w:sz w:val="20"/>
+      </w:rPr>
+    </w:lvl>
+    <w:lvl w:ilvl="2" w:tentative="0">
+      <w:start w:val="1"/>
+      <w:numFmt w:val="bullet"/>
+      <w:lvlText w:val=""/>
+      <w:lvlJc w:val="left"/>
+      <w:pPr>
+        <w:tabs>
+          <w:tab w:val="left" w:pos="2160"/>
+        </w:tabs>
+        <w:ind w:left="2160" w:hanging="360"/>
+      </w:pPr>
+      <w:rPr>
+        <w:rFonts w:hint="default" w:ascii="Wingdings" w:hAnsi="Wingdings" w:cs="Wingdings"/>
+        <w:sz w:val="20"/>
+      </w:rPr>
+    </w:lvl>
+    <w:lvl w:ilvl="3" w:tentative="0">
+      <w:start w:val="1"/>
+      <w:numFmt w:val="bullet"/>
+      <w:lvlText w:val=""/>
+      <w:lvlJc w:val="left"/>
+      <w:pPr>
+        <w:tabs>
+          <w:tab w:val="left" w:pos="2880"/>
+        </w:tabs>
+        <w:ind w:left="2880" w:hanging="360"/>
+      </w:pPr>
+      <w:rPr>
+        <w:rFonts w:hint="default" w:ascii="Wingdings" w:hAnsi="Wingdings" w:cs="Wingdings"/>
+        <w:sz w:val="20"/>
+      </w:rPr>
+    </w:lvl>
+    <w:lvl w:ilvl="4" w:tentative="0">
+      <w:start w:val="1"/>
+      <w:numFmt w:val="bullet"/>
+      <w:lvlText w:val=""/>
+      <w:lvlJc w:val="left"/>
+      <w:pPr>
+        <w:tabs>
+          <w:tab w:val="left" w:pos="3600"/>
+        </w:tabs>
+        <w:ind w:left="3600" w:hanging="360"/>
+      </w:pPr>
+      <w:rPr>
+        <w:rFonts w:hint="default" w:ascii="Wingdings" w:hAnsi="Wingdings" w:cs="Wingdings"/>
+        <w:sz w:val="20"/>
+      </w:rPr>
+    </w:lvl>
+    <w:lvl w:ilvl="5" w:tentative="0">
+      <w:start w:val="1"/>
+      <w:numFmt w:val="bullet"/>
+      <w:lvlText w:val=""/>
+      <w:lvlJc w:val="left"/>
+      <w:pPr>
+        <w:tabs>
+          <w:tab w:val="left" w:pos="4320"/>
+        </w:tabs>
+        <w:ind w:left="4320" w:hanging="360"/>
+      </w:pPr>
+      <w:rPr>
+        <w:rFonts w:hint="default" w:ascii="Wingdings" w:hAnsi="Wingdings" w:cs="Wingdings"/>
+        <w:sz w:val="20"/>
+      </w:rPr>
+    </w:lvl>
+    <w:lvl w:ilvl="6" w:tentative="0">
+      <w:start w:val="1"/>
+      <w:numFmt w:val="bullet"/>
+      <w:lvlText w:val=""/>
+      <w:lvlJc w:val="left"/>
+      <w:pPr>
+        <w:tabs>
+          <w:tab w:val="left" w:pos="5040"/>
+        </w:tabs>
+        <w:ind w:left="5040" w:hanging="360"/>
+      </w:pPr>
+      <w:rPr>
+        <w:rFonts w:hint="default" w:ascii="Wingdings" w:hAnsi="Wingdings" w:cs="Wingdings"/>
+        <w:sz w:val="20"/>
+      </w:rPr>
+    </w:lvl>
+    <w:lvl w:ilvl="7" w:tentative="0">
+      <w:start w:val="1"/>
+      <w:numFmt w:val="bullet"/>
+      <w:lvlText w:val=""/>
+      <w:lvlJc w:val="left"/>
+      <w:pPr>
+        <w:tabs>
+          <w:tab w:val="left" w:pos="5760"/>
+        </w:tabs>
+        <w:ind w:left="5760" w:hanging="360"/>
+      </w:pPr>
+      <w:rPr>
+        <w:rFonts w:hint="default" w:ascii="Wingdings" w:hAnsi="Wingdings" w:cs="Wingdings"/>
+        <w:sz w:val="20"/>
+      </w:rPr>
+    </w:lvl>
+    <w:lvl w:ilvl="8" w:tentative="0">
+      <w:start w:val="1"/>
+      <w:numFmt w:val="bullet"/>
+      <w:lvlText w:val=""/>
+      <w:lvlJc w:val="left"/>
+      <w:pPr>
+        <w:tabs>
+          <w:tab w:val="left" w:pos="6480"/>
+        </w:tabs>
+        <w:ind w:left="6480" w:hanging="360"/>
+      </w:pPr>
+      <w:rPr>
+        <w:rFonts w:hint="default" w:ascii="Wingdings" w:hAnsi="Wingdings" w:cs="Wingdings"/>
+        <w:sz w:val="20"/>
+      </w:rPr>
+    </w:lvl>
+  </w:abstractNum>
+  <w:abstractNum w:abstractNumId="1">
     <w:nsid w:val="F376E6D0"/>
     <w:multiLevelType w:val="multilevel"/>
     <w:tmpl w:val="F376E6D0"/>
@@ -1889,7 +5089,156 @@
       </w:rPr>
     </w:lvl>
   </w:abstractNum>
-  <w:abstractNum w:abstractNumId="1">
+  <w:abstractNum w:abstractNumId="2">
+    <w:nsid w:val="F4472441"/>
+    <w:multiLevelType w:val="multilevel"/>
+    <w:tmpl w:val="F4472441"/>
+    <w:lvl w:ilvl="0" w:tentative="0">
+      <w:start w:val="1"/>
+      <w:numFmt w:val="decimal"/>
+      <w:lvlText w:val="%1."/>
+      <w:lvlJc w:val="left"/>
+      <w:pPr>
+        <w:tabs>
+          <w:tab w:val="left" w:pos="720"/>
+        </w:tabs>
+        <w:ind w:left="720" w:hanging="360"/>
+      </w:pPr>
+      <w:rPr>
+        <w:sz w:val="24"/>
+        <w:szCs w:val="24"/>
+      </w:rPr>
+    </w:lvl>
+    <w:lvl w:ilvl="1" w:tentative="0">
+      <w:start w:val="1"/>
+      <w:numFmt w:val="decimal"/>
+      <w:lvlText w:val="%2."/>
+      <w:lvlJc w:val="left"/>
+      <w:pPr>
+        <w:tabs>
+          <w:tab w:val="left" w:pos="1440"/>
+        </w:tabs>
+        <w:ind w:left="1440" w:hanging="360"/>
+      </w:pPr>
+      <w:rPr>
+        <w:sz w:val="24"/>
+        <w:szCs w:val="24"/>
+      </w:rPr>
+    </w:lvl>
+    <w:lvl w:ilvl="2" w:tentative="0">
+      <w:start w:val="1"/>
+      <w:numFmt w:val="decimal"/>
+      <w:lvlText w:val="%3."/>
+      <w:lvlJc w:val="left"/>
+      <w:pPr>
+        <w:tabs>
+          <w:tab w:val="left" w:pos="2160"/>
+        </w:tabs>
+        <w:ind w:left="2160" w:hanging="360"/>
+      </w:pPr>
+      <w:rPr>
+        <w:sz w:val="24"/>
+        <w:szCs w:val="24"/>
+      </w:rPr>
+    </w:lvl>
+    <w:lvl w:ilvl="3" w:tentative="0">
+      <w:start w:val="1"/>
+      <w:numFmt w:val="decimal"/>
+      <w:lvlText w:val="%4."/>
+      <w:lvlJc w:val="left"/>
+      <w:pPr>
+        <w:tabs>
+          <w:tab w:val="left" w:pos="2517"/>
+        </w:tabs>
+        <w:ind w:left="2880" w:hanging="360"/>
+      </w:pPr>
+      <w:rPr>
+        <w:sz w:val="24"/>
+        <w:szCs w:val="24"/>
+      </w:rPr>
+    </w:lvl>
+    <w:lvl w:ilvl="4" w:tentative="0">
+      <w:start w:val="1"/>
+      <w:numFmt w:val="decimal"/>
+      <w:lvlText w:val="%5."/>
+      <w:lvlJc w:val="left"/>
+      <w:pPr>
+        <w:tabs>
+          <w:tab w:val="left" w:pos="3238"/>
+        </w:tabs>
+        <w:ind w:left="3600" w:hanging="360"/>
+      </w:pPr>
+      <w:rPr>
+        <w:sz w:val="24"/>
+        <w:szCs w:val="24"/>
+      </w:rPr>
+    </w:lvl>
+    <w:lvl w:ilvl="5" w:tentative="0">
+      <w:start w:val="1"/>
+      <w:numFmt w:val="decimal"/>
+      <w:lvlText w:val="%6."/>
+      <w:lvlJc w:val="left"/>
+      <w:pPr>
+        <w:tabs>
+          <w:tab w:val="left" w:pos="3958"/>
+        </w:tabs>
+        <w:ind w:left="4320" w:hanging="360"/>
+      </w:pPr>
+      <w:rPr>
+        <w:sz w:val="24"/>
+        <w:szCs w:val="24"/>
+      </w:rPr>
+    </w:lvl>
+    <w:lvl w:ilvl="6" w:tentative="0">
+      <w:start w:val="1"/>
+      <w:numFmt w:val="decimal"/>
+      <w:lvlText w:val="%7."/>
+      <w:lvlJc w:val="left"/>
+      <w:pPr>
+        <w:tabs>
+          <w:tab w:val="left" w:pos="4678"/>
+        </w:tabs>
+        <w:ind w:left="5040" w:hanging="360"/>
+      </w:pPr>
+      <w:rPr>
+        <w:sz w:val="24"/>
+        <w:szCs w:val="24"/>
+      </w:rPr>
+    </w:lvl>
+    <w:lvl w:ilvl="7" w:tentative="0">
+      <w:start w:val="1"/>
+      <w:numFmt w:val="decimal"/>
+      <w:lvlText w:val="%8."/>
+      <w:lvlJc w:val="left"/>
+      <w:pPr>
+        <w:tabs>
+          <w:tab w:val="left" w:pos="5398"/>
+        </w:tabs>
+        <w:ind w:left="5760" w:hanging="360"/>
+      </w:pPr>
+      <w:rPr>
+        <w:sz w:val="24"/>
+        <w:szCs w:val="24"/>
+      </w:rPr>
+    </w:lvl>
+    <w:lvl w:ilvl="8" w:tentative="0">
+      <w:start w:val="1"/>
+      <w:numFmt w:val="decimal"/>
+      <w:lvlText w:val="%9."/>
+      <w:lvlJc w:val="left"/>
+      <w:pPr>
+        <w:tabs>
+          <w:tab w:val="left" w:pos="6118"/>
+        </w:tabs>
+        <w:ind w:left="6480" w:hanging="360"/>
+      </w:pPr>
+      <w:rPr>
+        <w:sz w:val="24"/>
+        <w:szCs w:val="24"/>
+      </w:rPr>
+    </w:lvl>
+  </w:abstractNum>
+  <w:abstractNum w:abstractNumId="3">
     <w:nsid w:val="F922E12D"/>
     <w:multiLevelType w:val="multilevel"/>
     <w:tmpl w:val="F922E12D"/>
@@ -2038,7 +5387,7 @@
       </w:rPr>
     </w:lvl>
   </w:abstractNum>
-  <w:abstractNum w:abstractNumId="2">
+  <w:abstractNum w:abstractNumId="4">
     <w:nsid w:val="40BC5D75"/>
     <w:multiLevelType w:val="multilevel"/>
     <w:tmpl w:val="40BC5D75"/>
@@ -2187,7 +5536,454 @@
       </w:rPr>
     </w:lvl>
   </w:abstractNum>
-  <w:abstractNum w:abstractNumId="3">
+  <w:abstractNum w:abstractNumId="5">
+    <w:nsid w:val="5A8DDD35"/>
+    <w:multiLevelType w:val="multilevel"/>
+    <w:tmpl w:val="5A8DDD35"/>
+    <w:lvl w:ilvl="0" w:tentative="0">
+      <w:start w:val="1"/>
+      <w:numFmt w:val="bullet"/>
+      <w:lvlText w:val=""/>
+      <w:lvlJc w:val="left"/>
+      <w:pPr>
+        <w:tabs>
+          <w:tab w:val="left" w:pos="720"/>
+        </w:tabs>
+        <w:ind w:left="720" w:hanging="360"/>
+      </w:pPr>
+      <w:rPr>
+        <w:rFonts w:hint="default" w:ascii="Symbol" w:hAnsi="Symbol" w:cs="Symbol"/>
+        <w:sz w:val="20"/>
+      </w:rPr>
+    </w:lvl>
+    <w:lvl w:ilvl="1" w:tentative="0">
+      <w:start w:val="1"/>
+      <w:numFmt w:val="bullet"/>
+      <w:lvlText w:val="o"/>
+      <w:lvlJc w:val="left"/>
+      <w:pPr>
+        <w:tabs>
+          <w:tab w:val="left" w:pos="1440"/>
+        </w:tabs>
+        <w:ind w:left="1440" w:hanging="360"/>
+      </w:pPr>
+      <w:rPr>
+        <w:rFonts w:hint="default" w:ascii="Courier New" w:hAnsi="Courier New" w:cs="Courier New"/>
+        <w:sz w:val="20"/>
+      </w:rPr>
+    </w:lvl>
+    <w:lvl w:ilvl="2" w:tentative="0">
+      <w:start w:val="1"/>
+      <w:numFmt w:val="bullet"/>
+      <w:lvlText w:val=""/>
+      <w:lvlJc w:val="left"/>
+      <w:pPr>
+        <w:tabs>
+          <w:tab w:val="left" w:pos="2160"/>
+        </w:tabs>
+        <w:ind w:left="2160" w:hanging="360"/>
+      </w:pPr>
+      <w:rPr>
+        <w:rFonts w:hint="default" w:ascii="Wingdings" w:hAnsi="Wingdings" w:cs="Wingdings"/>
+        <w:sz w:val="20"/>
+      </w:rPr>
+    </w:lvl>
+    <w:lvl w:ilvl="3" w:tentative="0">
+      <w:start w:val="1"/>
+      <w:numFmt w:val="bullet"/>
+      <w:lvlText w:val=""/>
+      <w:lvlJc w:val="left"/>
+      <w:pPr>
+        <w:tabs>
+          <w:tab w:val="left" w:pos="2880"/>
+        </w:tabs>
+        <w:ind w:left="2880" w:hanging="360"/>
+      </w:pPr>
+      <w:rPr>
+        <w:rFonts w:hint="default" w:ascii="Wingdings" w:hAnsi="Wingdings" w:cs="Wingdings"/>
+        <w:sz w:val="20"/>
+      </w:rPr>
+    </w:lvl>
+    <w:lvl w:ilvl="4" w:tentative="0">
+      <w:start w:val="1"/>
+      <w:numFmt w:val="bullet"/>
+      <w:lvlText w:val=""/>
+      <w:lvlJc w:val="left"/>
+      <w:pPr>
+        <w:tabs>
+          <w:tab w:val="left" w:pos="3600"/>
+        </w:tabs>
+        <w:ind w:left="3600" w:hanging="360"/>
+      </w:pPr>
+      <w:rPr>
+        <w:rFonts w:hint="default" w:ascii="Wingdings" w:hAnsi="Wingdings" w:cs="Wingdings"/>
+        <w:sz w:val="20"/>
+      </w:rPr>
+    </w:lvl>
+    <w:lvl w:ilvl="5" w:tentative="0">
+      <w:start w:val="1"/>
+      <w:numFmt w:val="bullet"/>
+      <w:lvlText w:val=""/>
+      <w:lvlJc w:val="left"/>
+      <w:pPr>
+        <w:tabs>
+          <w:tab w:val="left" w:pos="4320"/>
+        </w:tabs>
+        <w:ind w:left="4320" w:hanging="360"/>
+      </w:pPr>
+      <w:rPr>
+        <w:rFonts w:hint="default" w:ascii="Wingdings" w:hAnsi="Wingdings" w:cs="Wingdings"/>
+        <w:sz w:val="20"/>
+      </w:rPr>
+    </w:lvl>
+    <w:lvl w:ilvl="6" w:tentative="0">
+      <w:start w:val="1"/>
+      <w:numFmt w:val="bullet"/>
+      <w:lvlText w:val=""/>
+      <w:lvlJc w:val="left"/>
+      <w:pPr>
+        <w:tabs>
+          <w:tab w:val="left" w:pos="5040"/>
+        </w:tabs>
+        <w:ind w:left="5040" w:hanging="360"/>
+      </w:pPr>
+      <w:rPr>
+        <w:rFonts w:hint="default" w:ascii="Wingdings" w:hAnsi="Wingdings" w:cs="Wingdings"/>
+        <w:sz w:val="20"/>
+      </w:rPr>
+    </w:lvl>
+    <w:lvl w:ilvl="7" w:tentative="0">
+      <w:start w:val="1"/>
+      <w:numFmt w:val="bullet"/>
+      <w:lvlText w:val=""/>
+      <w:lvlJc w:val="left"/>
+      <w:pPr>
+        <w:tabs>
+          <w:tab w:val="left" w:pos="5760"/>
+        </w:tabs>
+        <w:ind w:left="5760" w:hanging="360"/>
+      </w:pPr>
+      <w:rPr>
+        <w:rFonts w:hint="default" w:ascii="Wingdings" w:hAnsi="Wingdings" w:cs="Wingdings"/>
+        <w:sz w:val="20"/>
+      </w:rPr>
+    </w:lvl>
+    <w:lvl w:ilvl="8" w:tentative="0">
+      <w:start w:val="1"/>
+      <w:numFmt w:val="bullet"/>
+      <w:lvlText w:val=""/>
+      <w:lvlJc w:val="left"/>
+      <w:pPr>
+        <w:tabs>
+          <w:tab w:val="left" w:pos="6480"/>
+        </w:tabs>
+        <w:ind w:left="6480" w:hanging="360"/>
+      </w:pPr>
+      <w:rPr>
+        <w:rFonts w:hint="default" w:ascii="Wingdings" w:hAnsi="Wingdings" w:cs="Wingdings"/>
+        <w:sz w:val="20"/>
+      </w:rPr>
+    </w:lvl>
+  </w:abstractNum>
+  <w:abstractNum w:abstractNumId="6">
+    <w:nsid w:val="614F642F"/>
+    <w:multiLevelType w:val="multilevel"/>
+    <w:tmpl w:val="614F642F"/>
+    <w:lvl w:ilvl="0" w:tentative="0">
+      <w:start w:val="1"/>
+      <w:numFmt w:val="bullet"/>
+      <w:lvlText w:val=""/>
+      <w:lvlJc w:val="left"/>
+      <w:pPr>
+        <w:tabs>
+          <w:tab w:val="left" w:pos="720"/>
+        </w:tabs>
+        <w:ind w:left="720" w:hanging="360"/>
+      </w:pPr>
+      <w:rPr>
+        <w:rFonts w:ascii="Symbol" w:hAnsi="Symbol" w:cs="Symbol"/>
+        <w:sz w:val="20"/>
+      </w:rPr>
+    </w:lvl>
+    <w:lvl w:ilvl="1" w:tentative="0">
+      <w:start w:val="1"/>
+      <w:numFmt w:val="bullet"/>
+      <w:lvlText w:val="o"/>
+      <w:lvlJc w:val="left"/>
+      <w:pPr>
+        <w:tabs>
+          <w:tab w:val="left" w:pos="1440"/>
+        </w:tabs>
+        <w:ind w:left="1440" w:hanging="360"/>
+      </w:pPr>
+      <w:rPr>
+        <w:rFonts w:ascii="Courier New" w:hAnsi="Courier New" w:cs="Courier New"/>
+        <w:sz w:val="20"/>
+      </w:rPr>
+    </w:lvl>
+    <w:lvl w:ilvl="2" w:tentative="0">
+      <w:start w:val="1"/>
+      <w:numFmt w:val="bullet"/>
+      <w:lvlText w:val=""/>
+      <w:lvlJc w:val="left"/>
+      <w:pPr>
+        <w:tabs>
+          <w:tab w:val="left" w:pos="2160"/>
+        </w:tabs>
+        <w:ind w:left="2160" w:hanging="360"/>
+      </w:pPr>
+      <w:rPr>
+        <w:rFonts w:ascii="Wingdings" w:hAnsi="Wingdings" w:cs="Wingdings"/>
+        <w:sz w:val="20"/>
+      </w:rPr>
+    </w:lvl>
+    <w:lvl w:ilvl="3" w:tentative="0">
+      <w:start w:val="1"/>
+      <w:numFmt w:val="bullet"/>
+      <w:lvlText w:val=""/>
+      <w:lvlJc w:val="left"/>
+      <w:pPr>
+        <w:tabs>
+          <w:tab w:val="left" w:pos="2880"/>
+        </w:tabs>
+        <w:ind w:left="2880" w:hanging="360"/>
+      </w:pPr>
+      <w:rPr>
+        <w:rFonts w:hint="default" w:ascii="Wingdings" w:hAnsi="Wingdings" w:cs="Wingdings"/>
+        <w:sz w:val="20"/>
+      </w:rPr>
+    </w:lvl>
+    <w:lvl w:ilvl="4" w:tentative="0">
+      <w:start w:val="1"/>
+      <w:numFmt w:val="bullet"/>
+      <w:lvlText w:val=""/>
+      <w:lvlJc w:val="left"/>
+      <w:pPr>
+        <w:tabs>
+          <w:tab w:val="left" w:pos="3600"/>
+        </w:tabs>
+        <w:ind w:left="3600" w:hanging="360"/>
+      </w:pPr>
+      <w:rPr>
+        <w:rFonts w:hint="default" w:ascii="Wingdings" w:hAnsi="Wingdings" w:cs="Wingdings"/>
+        <w:sz w:val="20"/>
+      </w:rPr>
+    </w:lvl>
+    <w:lvl w:ilvl="5" w:tentative="0">
+      <w:start w:val="1"/>
+      <w:numFmt w:val="bullet"/>
+      <w:lvlText w:val=""/>
+      <w:lvlJc w:val="left"/>
+      <w:pPr>
+        <w:tabs>
+          <w:tab w:val="left" w:pos="4320"/>
+        </w:tabs>
+        <w:ind w:left="4320" w:hanging="360"/>
+      </w:pPr>
+      <w:rPr>
+        <w:rFonts w:hint="default" w:ascii="Wingdings" w:hAnsi="Wingdings" w:cs="Wingdings"/>
+        <w:sz w:val="20"/>
+      </w:rPr>
+    </w:lvl>
+    <w:lvl w:ilvl="6" w:tentative="0">
+      <w:start w:val="1"/>
+      <w:numFmt w:val="bullet"/>
+      <w:lvlText w:val=""/>
+      <w:lvlJc w:val="left"/>
+      <w:pPr>
+        <w:tabs>
+          <w:tab w:val="left" w:pos="5040"/>
+        </w:tabs>
+        <w:ind w:left="5040" w:hanging="360"/>
+      </w:pPr>
+      <w:rPr>
+        <w:rFonts w:hint="default" w:ascii="Wingdings" w:hAnsi="Wingdings" w:cs="Wingdings"/>
+        <w:sz w:val="20"/>
+      </w:rPr>
+    </w:lvl>
+    <w:lvl w:ilvl="7" w:tentative="0">
+      <w:start w:val="1"/>
+      <w:numFmt w:val="bullet"/>
+      <w:lvlText w:val=""/>
+      <w:lvlJc w:val="left"/>
+      <w:pPr>
+        <w:tabs>
+          <w:tab w:val="left" w:pos="5760"/>
+        </w:tabs>
+        <w:ind w:left="5760" w:hanging="360"/>
+      </w:pPr>
+      <w:rPr>
+        <w:rFonts w:hint="default" w:ascii="Wingdings" w:hAnsi="Wingdings" w:cs="Wingdings"/>
+        <w:sz w:val="20"/>
+      </w:rPr>
+    </w:lvl>
+    <w:lvl w:ilvl="8" w:tentative="0">
+      <w:start w:val="1"/>
+      <w:numFmt w:val="bullet"/>
+      <w:lvlText w:val=""/>
+      <w:lvlJc w:val="left"/>
+      <w:pPr>
+        <w:tabs>
+          <w:tab w:val="left" w:pos="6480"/>
+        </w:tabs>
+        <w:ind w:left="6480" w:hanging="360"/>
+      </w:pPr>
+      <w:rPr>
+        <w:rFonts w:hint="default" w:ascii="Wingdings" w:hAnsi="Wingdings" w:cs="Wingdings"/>
+        <w:sz w:val="20"/>
+      </w:rPr>
+    </w:lvl>
+  </w:abstractNum>
+  <w:abstractNum w:abstractNumId="7">
+    <w:nsid w:val="69B58DC0"/>
+    <w:multiLevelType w:val="multilevel"/>
+    <w:tmpl w:val="69B58DC0"/>
+    <w:lvl w:ilvl="0" w:tentative="0">
+      <w:start w:val="1"/>
+      <w:numFmt w:val="bullet"/>
+      <w:lvlText w:val=""/>
+      <w:lvlJc w:val="left"/>
+      <w:pPr>
+        <w:tabs>
+          <w:tab w:val="left" w:pos="720"/>
+        </w:tabs>
+        <w:ind w:left="720" w:hanging="360"/>
+      </w:pPr>
+      <w:rPr>
+        <w:rFonts w:hint="default" w:ascii="Symbol" w:hAnsi="Symbol" w:cs="Symbol"/>
+        <w:sz w:val="20"/>
+      </w:rPr>
+    </w:lvl>
+    <w:lvl w:ilvl="1" w:tentative="0">
+      <w:start w:val="1"/>
+      <w:numFmt w:val="bullet"/>
+      <w:lvlText w:val="o"/>
+      <w:lvlJc w:val="left"/>
+      <w:pPr>
+        <w:tabs>
+          <w:tab w:val="left" w:pos="1440"/>
+        </w:tabs>
+        <w:ind w:left="1440" w:hanging="360"/>
+      </w:pPr>
+      <w:rPr>
+        <w:rFonts w:hint="default" w:ascii="Courier New" w:hAnsi="Courier New" w:cs="Courier New"/>
+        <w:sz w:val="20"/>
+      </w:rPr>
+    </w:lvl>
+    <w:lvl w:ilvl="2" w:tentative="0">
+      <w:start w:val="1"/>
+      <w:numFmt w:val="bullet"/>
+      <w:lvlText w:val=""/>
+      <w:lvlJc w:val="left"/>
+      <w:pPr>
+        <w:tabs>
+          <w:tab w:val="left" w:pos="2160"/>
+        </w:tabs>
+        <w:ind w:left="2160" w:hanging="360"/>
+      </w:pPr>
+      <w:rPr>
+        <w:rFonts w:hint="default" w:ascii="Wingdings" w:hAnsi="Wingdings" w:cs="Wingdings"/>
+        <w:sz w:val="20"/>
+      </w:rPr>
+    </w:lvl>
+    <w:lvl w:ilvl="3" w:tentative="0">
+      <w:start w:val="1"/>
+      <w:numFmt w:val="bullet"/>
+      <w:lvlText w:val=""/>
+      <w:lvlJc w:val="left"/>
+      <w:pPr>
+        <w:tabs>
+          <w:tab w:val="left" w:pos="2880"/>
+        </w:tabs>
+        <w:ind w:left="2880" w:hanging="360"/>
+      </w:pPr>
+      <w:rPr>
+        <w:rFonts w:hint="default" w:ascii="Wingdings" w:hAnsi="Wingdings" w:cs="Wingdings"/>
+        <w:sz w:val="20"/>
+      </w:rPr>
+    </w:lvl>
+    <w:lvl w:ilvl="4" w:tentative="0">
+      <w:start w:val="1"/>
+      <w:numFmt w:val="bullet"/>
+      <w:lvlText w:val=""/>
+      <w:lvlJc w:val="left"/>
+      <w:pPr>
+        <w:tabs>
+          <w:tab w:val="left" w:pos="3600"/>
+        </w:tabs>
+        <w:ind w:left="3600" w:hanging="360"/>
+      </w:pPr>
+      <w:rPr>
+        <w:rFonts w:hint="default" w:ascii="Wingdings" w:hAnsi="Wingdings" w:cs="Wingdings"/>
+        <w:sz w:val="20"/>
+      </w:rPr>
+    </w:lvl>
+    <w:lvl w:ilvl="5" w:tentative="0">
+      <w:start w:val="1"/>
+      <w:numFmt w:val="bullet"/>
+      <w:lvlText w:val=""/>
+      <w:lvlJc w:val="left"/>
+      <w:pPr>
+        <w:tabs>
+          <w:tab w:val="left" w:pos="4320"/>
+        </w:tabs>
+        <w:ind w:left="4320" w:hanging="360"/>
+      </w:pPr>
+      <w:rPr>
+        <w:rFonts w:hint="default" w:ascii="Wingdings" w:hAnsi="Wingdings" w:cs="Wingdings"/>
+        <w:sz w:val="20"/>
+      </w:rPr>
+    </w:lvl>
+    <w:lvl w:ilvl="6" w:tentative="0">
+      <w:start w:val="1"/>
+      <w:numFmt w:val="bullet"/>
+      <w:lvlText w:val=""/>
+      <w:lvlJc w:val="left"/>
+      <w:pPr>
+        <w:tabs>
+          <w:tab w:val="left" w:pos="5040"/>
+        </w:tabs>
+        <w:ind w:left="5040" w:hanging="360"/>
+      </w:pPr>
+      <w:rPr>
+        <w:rFonts w:hint="default" w:ascii="Wingdings" w:hAnsi="Wingdings" w:cs="Wingdings"/>
+        <w:sz w:val="20"/>
+      </w:rPr>
+    </w:lvl>
+    <w:lvl w:ilvl="7" w:tentative="0">
+      <w:start w:val="1"/>
+      <w:numFmt w:val="bullet"/>
+      <w:lvlText w:val=""/>
+      <w:lvlJc w:val="left"/>
+      <w:pPr>
+        <w:tabs>
+          <w:tab w:val="left" w:pos="5760"/>
+        </w:tabs>
+        <w:ind w:left="5760" w:hanging="360"/>
+      </w:pPr>
+      <w:rPr>
+        <w:rFonts w:hint="default" w:ascii="Wingdings" w:hAnsi="Wingdings" w:cs="Wingdings"/>
+        <w:sz w:val="20"/>
+      </w:rPr>
+    </w:lvl>
+    <w:lvl w:ilvl="8" w:tentative="0">
+      <w:start w:val="1"/>
+      <w:numFmt w:val="bullet"/>
+      <w:lvlText w:val=""/>
+      <w:lvlJc w:val="left"/>
+      <w:pPr>
+        <w:tabs>
+          <w:tab w:val="left" w:pos="6480"/>
+        </w:tabs>
+        <w:ind w:left="6480" w:hanging="360"/>
+      </w:pPr>
+      <w:rPr>
+        <w:rFonts w:hint="default" w:ascii="Wingdings" w:hAnsi="Wingdings" w:cs="Wingdings"/>
+        <w:sz w:val="20"/>
+      </w:rPr>
+    </w:lvl>
+  </w:abstractNum>
+  <w:abstractNum w:abstractNumId="8">
     <w:nsid w:val="6B6DEB3A"/>
     <w:multiLevelType w:val="multilevel"/>
     <w:tmpl w:val="6B6DEB3A"/>
@@ -2337,16 +6133,31 @@
     </w:lvl>
   </w:abstractNum>
   <w:num w:numId="1">
+    <w:abstractNumId w:val="1"/>
+  </w:num>
+  <w:num w:numId="2">
+    <w:abstractNumId w:val="3"/>
+  </w:num>
+  <w:num w:numId="3">
+    <w:abstractNumId w:val="8"/>
+  </w:num>
+  <w:num w:numId="4">
+    <w:abstractNumId w:val="4"/>
+  </w:num>
+  <w:num w:numId="5">
+    <w:abstractNumId w:val="6"/>
+  </w:num>
+  <w:num w:numId="6">
+    <w:abstractNumId w:val="7"/>
+  </w:num>
+  <w:num w:numId="7">
+    <w:abstractNumId w:val="2"/>
+  </w:num>
+  <w:num w:numId="8">
     <w:abstractNumId w:val="0"/>
   </w:num>
-  <w:num w:numId="2">
-    <w:abstractNumId w:val="1"/>
-  </w:num>
-  <w:num w:numId="3">
-    <w:abstractNumId w:val="3"/>
-  </w:num>
-  <w:num w:numId="4">
-    <w:abstractNumId w:val="2"/>
+  <w:num w:numId="9">
+    <w:abstractNumId w:val="5"/>
   </w:num>
 </w:numbering>
 </file>

</xml_diff>

<commit_message>
Add gamification and fix session bugs
</commit_message>
<xml_diff>
--- a/Documents/Build log.docx
+++ b/Documents/Build log.docx
@@ -23,7 +23,7 @@
     </w:p>
     <w:p>
       <w:pPr>
-        <w:pStyle w:val="9"/>
+        <w:pStyle w:val="10"/>
         <w:keepNext w:val="0"/>
         <w:keepLines w:val="0"/>
         <w:widowControl/>
@@ -43,7 +43,7 @@
       </w:r>
       <w:r>
         <w:rPr>
-          <w:rStyle w:val="7"/>
+          <w:rStyle w:val="8"/>
           <w:rFonts w:hint="default" w:ascii="Calibri" w:hAnsi="Calibri" w:cs="Calibri"/>
         </w:rPr>
         <w:t>recallie-app-src.tar.gz</w:t>
@@ -76,7 +76,7 @@
     </w:p>
     <w:p>
       <w:pPr>
-        <w:pStyle w:val="9"/>
+        <w:pStyle w:val="10"/>
         <w:keepNext w:val="0"/>
         <w:keepLines w:val="0"/>
         <w:widowControl/>
@@ -90,35 +90,35 @@
       </w:pPr>
       <w:r>
         <w:rPr>
-          <w:rStyle w:val="10"/>
+          <w:rStyle w:val="11"/>
           <w:rFonts w:hint="default" w:ascii="Calibri" w:hAnsi="Calibri" w:cs="Calibri"/>
         </w:rPr>
         <w:fldChar w:fldCharType="begin"/>
       </w:r>
       <w:r>
         <w:rPr>
-          <w:rStyle w:val="10"/>
+          <w:rStyle w:val="11"/>
           <w:rFonts w:hint="default" w:ascii="Calibri" w:hAnsi="Calibri" w:cs="Calibri"/>
         </w:rPr>
         <w:instrText xml:space="preserve"> HYPERLINK "https://github.com/jayasingheck-afk/recallie-app" </w:instrText>
       </w:r>
       <w:r>
         <w:rPr>
-          <w:rStyle w:val="10"/>
+          <w:rStyle w:val="11"/>
           <w:rFonts w:hint="default" w:ascii="Calibri" w:hAnsi="Calibri" w:cs="Calibri"/>
         </w:rPr>
         <w:fldChar w:fldCharType="separate"/>
       </w:r>
       <w:r>
         <w:rPr>
-          <w:rStyle w:val="8"/>
+          <w:rStyle w:val="9"/>
           <w:rFonts w:hint="default" w:ascii="Calibri" w:hAnsi="Calibri" w:cs="Calibri"/>
         </w:rPr>
         <w:t>https://github.com/jayasingheck-afk/recallie-app</w:t>
       </w:r>
       <w:r>
         <w:rPr>
-          <w:rStyle w:val="10"/>
+          <w:rStyle w:val="11"/>
           <w:rFonts w:hint="default" w:ascii="Calibri" w:hAnsi="Calibri" w:cs="Calibri"/>
         </w:rPr>
         <w:fldChar w:fldCharType="end"/>
@@ -131,7 +131,7 @@
       </w:r>
       <w:r>
         <w:rPr>
-          <w:rStyle w:val="7"/>
+          <w:rStyle w:val="8"/>
           <w:rFonts w:hint="default" w:ascii="Calibri" w:hAnsi="Calibri" w:cs="Calibri"/>
         </w:rPr>
         <w:t>C:\recallie-app</w:t>
@@ -186,7 +186,7 @@
       </w:r>
       <w:r>
         <w:rPr>
-          <w:rStyle w:val="7"/>
+          <w:rStyle w:val="8"/>
           <w:rFonts w:hint="default" w:ascii="Calibri" w:hAnsi="Calibri" w:cs="Calibri"/>
         </w:rPr>
         <w:t>recallie-app</w:t>
@@ -222,7 +222,7 @@
       </w:r>
       <w:r>
         <w:rPr>
-          <w:rStyle w:val="10"/>
+          <w:rStyle w:val="11"/>
           <w:rFonts w:hint="default" w:ascii="Calibri" w:hAnsi="Calibri" w:cs="Calibri"/>
         </w:rPr>
         <w:t>Drizzle ORM, not Prisma</w:t>
@@ -281,7 +281,7 @@
       </w:r>
       <w:r>
         <w:rPr>
-          <w:rStyle w:val="7"/>
+          <w:rStyle w:val="8"/>
           <w:rFonts w:hint="default" w:ascii="Calibri" w:hAnsi="Calibri" w:cs="Calibri"/>
         </w:rPr>
         <w:t>src/lib/spacedRepetition.ts</w:t>
@@ -317,7 +317,7 @@
       </w:r>
       <w:r>
         <w:rPr>
-          <w:rStyle w:val="7"/>
+          <w:rStyle w:val="8"/>
           <w:rFonts w:hint="default" w:ascii="Calibri" w:hAnsi="Calibri" w:cs="Calibri"/>
         </w:rPr>
         <w:t>src/lib/sessionBuilder.ts</w:t>
@@ -330,7 +330,7 @@
       </w:r>
       <w:r>
         <w:rPr>
-          <w:rStyle w:val="7"/>
+          <w:rStyle w:val="8"/>
           <w:rFonts w:hint="default" w:ascii="Calibri" w:hAnsi="Calibri" w:cs="Calibri"/>
         </w:rPr>
         <w:t>multi_part</w:t>
@@ -343,7 +343,7 @@
       </w:r>
       <w:r>
         <w:rPr>
-          <w:rStyle w:val="7"/>
+          <w:rStyle w:val="8"/>
           <w:rFonts w:hint="default" w:ascii="Calibri" w:hAnsi="Calibri" w:cs="Calibri"/>
         </w:rPr>
         <w:t>open_response</w:t>
@@ -379,7 +379,7 @@
       </w:r>
       <w:r>
         <w:rPr>
-          <w:rStyle w:val="7"/>
+          <w:rStyle w:val="8"/>
           <w:rFonts w:hint="default" w:ascii="Calibri" w:hAnsi="Calibri" w:cs="Calibri"/>
         </w:rPr>
         <w:t>GET /api/session/today</w:t>
@@ -392,7 +392,7 @@
       </w:r>
       <w:r>
         <w:rPr>
-          <w:rStyle w:val="7"/>
+          <w:rStyle w:val="8"/>
           <w:rFonts w:hint="default" w:ascii="Calibri" w:hAnsi="Calibri" w:cs="Calibri"/>
         </w:rPr>
         <w:t>POST /api/reviews</w:t>
@@ -405,7 +405,7 @@
       </w:r>
       <w:r>
         <w:rPr>
-          <w:rStyle w:val="7"/>
+          <w:rStyle w:val="8"/>
           <w:rFonts w:hint="default" w:ascii="Calibri" w:hAnsi="Calibri" w:cs="Calibri"/>
         </w:rPr>
         <w:t>GET /api/dashboard</w:t>
@@ -441,7 +441,7 @@
       </w:r>
       <w:r>
         <w:rPr>
-          <w:rStyle w:val="7"/>
+          <w:rStyle w:val="8"/>
           <w:rFonts w:hint="default" w:ascii="Calibri" w:hAnsi="Calibri" w:cs="Calibri"/>
         </w:rPr>
         <w:t>/child</w:t>
@@ -454,7 +454,7 @@
       </w:r>
       <w:r>
         <w:rPr>
-          <w:rStyle w:val="7"/>
+          <w:rStyle w:val="8"/>
           <w:rFonts w:hint="default" w:ascii="Calibri" w:hAnsi="Calibri" w:cs="Calibri"/>
         </w:rPr>
         <w:t>/parent/dashboard</w:t>
@@ -507,16 +507,121 @@
       </w:pPr>
       <w:r>
         <w:rPr>
+          <w:rStyle w:val="8"/>
+          <w:rFonts w:hint="default" w:ascii="Calibri" w:hAnsi="Calibri" w:cs="Calibri"/>
+        </w:rPr>
+        <w:t>src/db/client.ts</w:t>
+      </w:r>
+      <w:r>
+        <w:rPr>
+          <w:rFonts w:hint="default" w:ascii="Calibri" w:hAnsi="Calibri" w:cs="Calibri"/>
+        </w:rPr>
+        <w:t xml:space="preserve"> auto-detects local vs. managed Postgres (Neon/Supabase/RDS) and enables SSL accordingly — no manual config needed either way.</w:t>
+      </w:r>
+    </w:p>
+    <w:p>
+      <w:pPr>
+        <w:pStyle w:val="3"/>
+        <w:keepNext w:val="0"/>
+        <w:keepLines w:val="0"/>
+        <w:widowControl/>
+        <w:suppressLineNumbers w:val="0"/>
+        <w:bidi w:val="0"/>
+        <w:rPr>
+          <w:rFonts w:hint="default" w:ascii="Calibri" w:hAnsi="Calibri" w:cs="Calibri"/>
+        </w:rPr>
+      </w:pPr>
+      <w:r>
+        <w:rPr>
+          <w:rFonts w:hint="default" w:ascii="Calibri" w:hAnsi="Calibri" w:cs="Calibri"/>
+        </w:rPr>
+        <w:t>Key decision: Prisma → Drizzle</w:t>
+      </w:r>
+    </w:p>
+    <w:p>
+      <w:pPr>
+        <w:pStyle w:val="10"/>
+        <w:keepNext w:val="0"/>
+        <w:keepLines w:val="0"/>
+        <w:widowControl/>
+        <w:suppressLineNumbers w:val="0"/>
+        <w:bidi w:val="0"/>
+        <w:spacing w:before="0" w:beforeAutospacing="1" w:after="0" w:afterAutospacing="1"/>
+        <w:ind w:left="0" w:right="0"/>
+        <w:rPr>
+          <w:rFonts w:hint="default" w:ascii="Calibri" w:hAnsi="Calibri" w:cs="Calibri"/>
+        </w:rPr>
+      </w:pPr>
+      <w:r>
+        <w:rPr>
+          <w:rFonts w:hint="default" w:ascii="Calibri" w:hAnsi="Calibri" w:cs="Calibri"/>
+        </w:rPr>
+        <w:t xml:space="preserve">The sandbox environment could not reach </w:t>
+      </w:r>
+      <w:r>
+        <w:rPr>
+          <w:rStyle w:val="8"/>
+          <w:rFonts w:hint="default" w:ascii="Calibri" w:hAnsi="Calibri" w:cs="Calibri"/>
+        </w:rPr>
+        <w:t>binaries.prisma.sh</w:t>
+      </w:r>
+      <w:r>
+        <w:rPr>
+          <w:rFonts w:hint="default" w:ascii="Calibri" w:hAnsi="Calibri" w:cs="Calibri"/>
+        </w:rPr>
+        <w:t xml:space="preserve"> (network allowlist covers npm registry only), so </w:t>
+      </w:r>
+      <w:r>
+        <w:rPr>
+          <w:rStyle w:val="8"/>
+          <w:rFonts w:hint="default" w:ascii="Calibri" w:hAnsi="Calibri" w:cs="Calibri"/>
+        </w:rPr>
+        <w:t>prisma init</w:t>
+      </w:r>
+      <w:r>
+        <w:rPr>
+          <w:rFonts w:hint="default" w:ascii="Calibri" w:hAnsi="Calibri" w:cs="Calibri"/>
+        </w:rPr>
+        <w:t>/</w:t>
+      </w:r>
+      <w:r>
+        <w:rPr>
+          <w:rStyle w:val="8"/>
+          <w:rFonts w:hint="default" w:ascii="Calibri" w:hAnsi="Calibri" w:cs="Calibri"/>
+        </w:rPr>
+        <w:t>migrate</w:t>
+      </w:r>
+      <w:r>
+        <w:rPr>
+          <w:rFonts w:hint="default" w:ascii="Calibri" w:hAnsi="Calibri" w:cs="Calibri"/>
+        </w:rPr>
+        <w:t xml:space="preserve"> failed outright. Swapped to Drizzle ORM — same schema, same Postgres, no functional loss, and Drizzle was already named as an acceptable alternative in the project's own docs. If a future environment </w:t>
+      </w:r>
+      <w:r>
+        <w:rPr>
           <w:rStyle w:val="7"/>
           <w:rFonts w:hint="default" w:ascii="Calibri" w:hAnsi="Calibri" w:cs="Calibri"/>
         </w:rPr>
-        <w:t>src/db/client.ts</w:t>
-      </w:r>
-      <w:r>
-        <w:rPr>
-          <w:rFonts w:hint="default" w:ascii="Calibri" w:hAnsi="Calibri" w:cs="Calibri"/>
-        </w:rPr>
-        <w:t xml:space="preserve"> auto-detects local vs. managed Postgres (Neon/Supabase/RDS) and enables SSL accordingly — no manual config needed either way.</w:t>
+        <w:t>can</w:t>
+      </w:r>
+      <w:r>
+        <w:rPr>
+          <w:rFonts w:hint="default" w:ascii="Calibri" w:hAnsi="Calibri" w:cs="Calibri"/>
+        </w:rPr>
+        <w:t xml:space="preserve"> reach Prisma's binaries and the team prefers Prisma, </w:t>
+      </w:r>
+      <w:r>
+        <w:rPr>
+          <w:rStyle w:val="8"/>
+          <w:rFonts w:hint="default" w:ascii="Calibri" w:hAnsi="Calibri" w:cs="Calibri"/>
+        </w:rPr>
+        <w:t>src/db/schema.ts</w:t>
+      </w:r>
+      <w:r>
+        <w:rPr>
+          <w:rFonts w:hint="default" w:ascii="Calibri" w:hAnsi="Calibri" w:cs="Calibri"/>
+        </w:rPr>
+        <w:t xml:space="preserve"> is a straightforward translation back (it mirrors the documented Prisma models field-for-field).</w:t>
       </w:r>
     </w:p>
     <w:p>
@@ -535,12 +640,12 @@
         <w:rPr>
           <w:rFonts w:hint="default" w:ascii="Calibri" w:hAnsi="Calibri" w:cs="Calibri"/>
         </w:rPr>
-        <w:t>Key decision: Prisma → Drizzle</w:t>
-      </w:r>
-    </w:p>
-    <w:p>
-      <w:pPr>
-        <w:pStyle w:val="9"/>
+        <w:t>Item bank expansion (this update)</w:t>
+      </w:r>
+    </w:p>
+    <w:p>
+      <w:pPr>
+        <w:pStyle w:val="10"/>
         <w:keepNext w:val="0"/>
         <w:keepLines w:val="0"/>
         <w:widowControl/>
@@ -556,116 +661,11 @@
         <w:rPr>
           <w:rFonts w:hint="default" w:ascii="Calibri" w:hAnsi="Calibri" w:cs="Calibri"/>
         </w:rPr>
-        <w:t xml:space="preserve">The sandbox environment could not reach </w:t>
-      </w:r>
-      <w:r>
-        <w:rPr>
-          <w:rStyle w:val="7"/>
-          <w:rFonts w:hint="default" w:ascii="Calibri" w:hAnsi="Calibri" w:cs="Calibri"/>
-        </w:rPr>
-        <w:t>binaries.prisma.sh</w:t>
-      </w:r>
-      <w:r>
-        <w:rPr>
-          <w:rFonts w:hint="default" w:ascii="Calibri" w:hAnsi="Calibri" w:cs="Calibri"/>
-        </w:rPr>
-        <w:t xml:space="preserve"> (network allowlist covers npm registry only), so </w:t>
-      </w:r>
-      <w:r>
-        <w:rPr>
-          <w:rStyle w:val="7"/>
-          <w:rFonts w:hint="default" w:ascii="Calibri" w:hAnsi="Calibri" w:cs="Calibri"/>
-        </w:rPr>
-        <w:t>prisma init</w:t>
-      </w:r>
-      <w:r>
-        <w:rPr>
-          <w:rFonts w:hint="default" w:ascii="Calibri" w:hAnsi="Calibri" w:cs="Calibri"/>
-        </w:rPr>
-        <w:t>/</w:t>
-      </w:r>
-      <w:r>
-        <w:rPr>
-          <w:rStyle w:val="7"/>
-          <w:rFonts w:hint="default" w:ascii="Calibri" w:hAnsi="Calibri" w:cs="Calibri"/>
-        </w:rPr>
-        <w:t>migrate</w:t>
-      </w:r>
-      <w:r>
-        <w:rPr>
-          <w:rFonts w:hint="default" w:ascii="Calibri" w:hAnsi="Calibri" w:cs="Calibri"/>
-        </w:rPr>
-        <w:t xml:space="preserve"> failed outright. Swapped to Drizzle ORM — same schema, same Postgres, no functional loss, and Drizzle was already named as an acceptable alternative in the project's own docs. If a future environment </w:t>
-      </w:r>
-      <w:r>
-        <w:rPr>
-          <w:rStyle w:val="6"/>
-          <w:rFonts w:hint="default" w:ascii="Calibri" w:hAnsi="Calibri" w:cs="Calibri"/>
-        </w:rPr>
-        <w:t>can</w:t>
-      </w:r>
-      <w:r>
-        <w:rPr>
-          <w:rFonts w:hint="default" w:ascii="Calibri" w:hAnsi="Calibri" w:cs="Calibri"/>
-        </w:rPr>
-        <w:t xml:space="preserve"> reach Prisma's binaries and the team prefers Prisma, </w:t>
-      </w:r>
-      <w:r>
-        <w:rPr>
-          <w:rStyle w:val="7"/>
-          <w:rFonts w:hint="default" w:ascii="Calibri" w:hAnsi="Calibri" w:cs="Calibri"/>
-        </w:rPr>
-        <w:t>src/db/schema.ts</w:t>
-      </w:r>
-      <w:r>
-        <w:rPr>
-          <w:rFonts w:hint="default" w:ascii="Calibri" w:hAnsi="Calibri" w:cs="Calibri"/>
-        </w:rPr>
-        <w:t xml:space="preserve"> is a straightforward translation back (it mirrors the documented Prisma models field-for-field).</w:t>
-      </w:r>
-    </w:p>
-    <w:p>
-      <w:pPr>
-        <w:pStyle w:val="3"/>
-        <w:keepNext w:val="0"/>
-        <w:keepLines w:val="0"/>
-        <w:widowControl/>
-        <w:suppressLineNumbers w:val="0"/>
-        <w:bidi w:val="0"/>
-        <w:rPr>
-          <w:rFonts w:hint="default" w:ascii="Calibri" w:hAnsi="Calibri" w:cs="Calibri"/>
-        </w:rPr>
-      </w:pPr>
-      <w:r>
-        <w:rPr>
-          <w:rFonts w:hint="default" w:ascii="Calibri" w:hAnsi="Calibri" w:cs="Calibri"/>
-        </w:rPr>
-        <w:t>Item bank expansion (this update)</w:t>
-      </w:r>
-    </w:p>
-    <w:p>
-      <w:pPr>
-        <w:pStyle w:val="9"/>
-        <w:keepNext w:val="0"/>
-        <w:keepLines w:val="0"/>
-        <w:widowControl/>
-        <w:suppressLineNumbers w:val="0"/>
-        <w:bidi w:val="0"/>
-        <w:spacing w:before="0" w:beforeAutospacing="1" w:after="0" w:afterAutospacing="1"/>
-        <w:ind w:left="0" w:right="0"/>
-        <w:rPr>
-          <w:rFonts w:hint="default" w:ascii="Calibri" w:hAnsi="Calibri" w:cs="Calibri"/>
-        </w:rPr>
-      </w:pPr>
-      <w:r>
-        <w:rPr>
-          <w:rFonts w:hint="default" w:ascii="Calibri" w:hAnsi="Calibri" w:cs="Calibri"/>
-        </w:rPr>
         <w:t xml:space="preserve">Generated 54 new practice items for the 5 Week 1 skills (M3N01, M3M01, E3LY03, E3LA04, E3LY09) following the project's own Maths/English item-generation prompt templates — </w:t>
       </w:r>
       <w:r>
         <w:rPr>
-          <w:rStyle w:val="7"/>
+          <w:rStyle w:val="8"/>
           <w:rFonts w:hint="default" w:ascii="Calibri" w:hAnsi="Calibri" w:cs="Calibri"/>
         </w:rPr>
         <w:t>src/db/seed/week1-item-bank.json</w:t>
@@ -678,7 +678,7 @@
       </w:r>
       <w:r>
         <w:rPr>
-          <w:rStyle w:val="10"/>
+          <w:rStyle w:val="11"/>
           <w:rFonts w:hint="default" w:ascii="Calibri" w:hAnsi="Calibri" w:cs="Calibri"/>
         </w:rPr>
         <w:t>Not yet human-reviewed</w:t>
@@ -691,7 +691,7 @@
       </w:r>
       <w:r>
         <w:rPr>
-          <w:rStyle w:val="7"/>
+          <w:rStyle w:val="8"/>
           <w:rFonts w:hint="default" w:ascii="Calibri" w:hAnsi="Calibri" w:cs="Calibri"/>
         </w:rPr>
         <w:t>_note</w:t>
@@ -705,7 +705,7 @@
     </w:p>
     <w:p>
       <w:pPr>
-        <w:pStyle w:val="9"/>
+        <w:pStyle w:val="10"/>
         <w:keepNext w:val="0"/>
         <w:keepLines w:val="0"/>
         <w:widowControl/>
@@ -748,7 +748,7 @@
       </w:r>
       <w:r>
         <w:rPr>
-          <w:rStyle w:val="7"/>
+          <w:rStyle w:val="8"/>
           <w:rFonts w:hint="default" w:ascii="Calibri" w:hAnsi="Calibri" w:cs="Calibri"/>
         </w:rPr>
         <w:t>answerKey</w:t>
@@ -761,7 +761,7 @@
       </w:r>
       <w:r>
         <w:rPr>
-          <w:rStyle w:val="7"/>
+          <w:rStyle w:val="8"/>
           <w:rFonts w:hint="default" w:ascii="Calibri" w:hAnsi="Calibri" w:cs="Calibri"/>
         </w:rPr>
         <w:t>"Sunday"</w:t>
@@ -774,7 +774,7 @@
       </w:r>
       <w:r>
         <w:rPr>
-          <w:rStyle w:val="7"/>
+          <w:rStyle w:val="8"/>
           <w:rFonts w:hint="default" w:ascii="Calibri" w:hAnsi="Calibri" w:cs="Calibri"/>
         </w:rPr>
         <w:t>"kilograms"</w:t>
@@ -787,7 +787,7 @@
       </w:r>
       <w:r>
         <w:rPr>
-          <w:rStyle w:val="7"/>
+          <w:rStyle w:val="8"/>
           <w:rFonts w:hint="default" w:ascii="Calibri" w:hAnsi="Calibri" w:cs="Calibri"/>
         </w:rPr>
         <w:t>stepByStepSolution</w:t>
@@ -823,7 +823,7 @@
       </w:r>
       <w:r>
         <w:rPr>
-          <w:rStyle w:val="7"/>
+          <w:rStyle w:val="8"/>
           <w:rFonts w:hint="default" w:ascii="Calibri" w:hAnsi="Calibri" w:cs="Calibri"/>
         </w:rPr>
         <w:t>answerKey</w:t>
@@ -836,7 +836,7 @@
       </w:r>
       <w:r>
         <w:rPr>
-          <w:rStyle w:val="7"/>
+          <w:rStyle w:val="8"/>
           <w:rFonts w:hint="default" w:ascii="Calibri" w:hAnsi="Calibri" w:cs="Calibri"/>
         </w:rPr>
         <w:t>["6000 + 500 + 0 + 9", "6000 + 500 + 9"]</w:t>
@@ -849,7 +849,7 @@
       </w:r>
       <w:r>
         <w:rPr>
-          <w:rStyle w:val="7"/>
+          <w:rStyle w:val="8"/>
           <w:rFonts w:hint="default" w:ascii="Calibri" w:hAnsi="Calibri" w:cs="Calibri"/>
         </w:rPr>
         <w:t>POST /api/reviews</w:t>
@@ -885,7 +885,7 @@
       </w:r>
       <w:r>
         <w:rPr>
-          <w:rStyle w:val="7"/>
+          <w:rStyle w:val="8"/>
           <w:rFonts w:hint="default" w:ascii="Calibri" w:hAnsi="Calibri" w:cs="Calibri"/>
         </w:rPr>
         <w:t>multi_part</w:t>
@@ -898,7 +898,7 @@
       </w:r>
       <w:r>
         <w:rPr>
-          <w:rStyle w:val="7"/>
+          <w:rStyle w:val="8"/>
           <w:rFonts w:hint="default" w:ascii="Calibri" w:hAnsi="Calibri" w:cs="Calibri"/>
         </w:rPr>
         <w:t>{"largest":"8520","smallest":"2058"}</w:t>
@@ -934,7 +934,7 @@
       </w:r>
       <w:r>
         <w:rPr>
-          <w:rStyle w:val="7"/>
+          <w:rStyle w:val="8"/>
           <w:rFonts w:hint="default" w:ascii="Calibri" w:hAnsi="Calibri" w:cs="Calibri"/>
         </w:rPr>
         <w:t>answerKey: "open response"</w:t>
@@ -947,7 +947,7 @@
       </w:r>
       <w:r>
         <w:rPr>
-          <w:rStyle w:val="7"/>
+          <w:rStyle w:val="8"/>
           <w:rFonts w:hint="default" w:ascii="Calibri" w:hAnsi="Calibri" w:cs="Calibri"/>
         </w:rPr>
         <w:t>"open_response"</w:t>
@@ -961,7 +961,7 @@
     </w:p>
     <w:p>
       <w:pPr>
-        <w:pStyle w:val="9"/>
+        <w:pStyle w:val="10"/>
         <w:keepNext w:val="0"/>
         <w:keepLines w:val="0"/>
         <w:widowControl/>
@@ -975,7 +975,7 @@
       </w:pPr>
       <w:r>
         <w:rPr>
-          <w:rStyle w:val="7"/>
+          <w:rStyle w:val="8"/>
           <w:rFonts w:hint="default" w:ascii="Calibri" w:hAnsi="Calibri" w:cs="Calibri"/>
         </w:rPr>
         <w:t>sessionBuilder.ts</w:t>
@@ -988,7 +988,7 @@
       </w:r>
       <w:r>
         <w:rPr>
-          <w:rStyle w:val="7"/>
+          <w:rStyle w:val="8"/>
           <w:rFonts w:hint="default" w:ascii="Calibri" w:hAnsi="Calibri" w:cs="Calibri"/>
         </w:rPr>
         <w:t>questionType = 'multi_part'</w:t>
@@ -1001,7 +1001,7 @@
       </w:r>
       <w:r>
         <w:rPr>
-          <w:rStyle w:val="7"/>
+          <w:rStyle w:val="8"/>
           <w:rFonts w:hint="default" w:ascii="Calibri" w:hAnsi="Calibri" w:cs="Calibri"/>
         </w:rPr>
         <w:t>'open_response'</w:t>
@@ -1014,7 +1014,7 @@
       </w:r>
       <w:r>
         <w:rPr>
-          <w:rStyle w:val="7"/>
+          <w:rStyle w:val="8"/>
           <w:rFonts w:hint="default" w:ascii="Calibri" w:hAnsi="Calibri" w:cs="Calibri"/>
         </w:rPr>
         <w:t>seed-demo.ts</w:t>
@@ -1027,7 +1027,7 @@
       </w:r>
       <w:r>
         <w:rPr>
-          <w:rStyle w:val="7"/>
+          <w:rStyle w:val="8"/>
           <w:rFonts w:hint="default" w:ascii="Calibri" w:hAnsi="Calibri" w:cs="Calibri"/>
         </w:rPr>
         <w:t>sample-items.json</w:t>
@@ -1040,7 +1040,7 @@
       </w:r>
       <w:r>
         <w:rPr>
-          <w:rStyle w:val="7"/>
+          <w:rStyle w:val="8"/>
           <w:rFonts w:hint="default" w:ascii="Calibri" w:hAnsi="Calibri" w:cs="Calibri"/>
         </w:rPr>
         <w:t>week1-item-bank.json</w:t>
@@ -1054,7 +1054,7 @@
     </w:p>
     <w:p>
       <w:pPr>
-        <w:pStyle w:val="9"/>
+        <w:pStyle w:val="10"/>
         <w:keepNext w:val="0"/>
         <w:keepLines w:val="0"/>
         <w:widowControl/>
@@ -1068,7 +1068,7 @@
       </w:pPr>
       <w:r>
         <w:rPr>
-          <w:rStyle w:val="10"/>
+          <w:rStyle w:val="11"/>
           <w:rFonts w:hint="default" w:ascii="Calibri" w:hAnsi="Calibri" w:cs="Calibri"/>
         </w:rPr>
         <w:t>Delivered to Chandana as a git patch</w:t>
@@ -1081,7 +1081,7 @@
       </w:r>
       <w:r>
         <w:rPr>
-          <w:rStyle w:val="7"/>
+          <w:rStyle w:val="8"/>
           <w:rFonts w:hint="default" w:ascii="Calibri" w:hAnsi="Calibri" w:cs="Calibri"/>
         </w:rPr>
         <w:t>recallie-week1-items.patch</w:t>
@@ -1094,7 +1094,7 @@
       </w:r>
       <w:r>
         <w:rPr>
-          <w:rStyle w:val="7"/>
+          <w:rStyle w:val="8"/>
           <w:rFonts w:hint="default" w:ascii="Calibri" w:hAnsi="Calibri" w:cs="Calibri"/>
         </w:rPr>
         <w:t>C:\recallie-app</w:t>
@@ -1107,7 +1107,7 @@
       </w:r>
       <w:r>
         <w:rPr>
-          <w:rStyle w:val="7"/>
+          <w:rStyle w:val="8"/>
           <w:rFonts w:hint="default" w:ascii="Calibri" w:hAnsi="Calibri" w:cs="Calibri"/>
         </w:rPr>
         <w:t>git apply</w:t>
@@ -1156,7 +1156,7 @@
       </w:pPr>
       <w:r>
         <w:rPr>
-          <w:rStyle w:val="7"/>
+          <w:rStyle w:val="8"/>
           <w:rFonts w:hint="default" w:ascii="Calibri" w:hAnsi="Calibri" w:cs="Calibri"/>
         </w:rPr>
         <w:t>npx tsc --noEmit</w:t>
@@ -1192,7 +1192,7 @@
       </w:r>
       <w:r>
         <w:rPr>
-          <w:rStyle w:val="7"/>
+          <w:rStyle w:val="8"/>
           <w:rFonts w:hint="default" w:ascii="Calibri" w:hAnsi="Calibri" w:cs="Calibri"/>
         </w:rPr>
         <w:t>Item</w:t>
@@ -1205,7 +1205,7 @@
       </w:r>
       <w:r>
         <w:rPr>
-          <w:rStyle w:val="7"/>
+          <w:rStyle w:val="8"/>
           <w:rFonts w:hint="default" w:ascii="Calibri" w:hAnsi="Calibri" w:cs="Calibri"/>
         </w:rPr>
         <w:t>/api/session/today</w:t>
@@ -1235,7 +1235,7 @@
       </w:pPr>
       <w:r>
         <w:rPr>
-          <w:rStyle w:val="7"/>
+          <w:rStyle w:val="8"/>
           <w:rFonts w:hint="default" w:ascii="Calibri" w:hAnsi="Calibri" w:cs="Calibri"/>
         </w:rPr>
         <w:t>GET /api/session/today</w:t>
@@ -1265,7 +1265,7 @@
       </w:pPr>
       <w:r>
         <w:rPr>
-          <w:rStyle w:val="7"/>
+          <w:rStyle w:val="8"/>
           <w:rFonts w:hint="default" w:ascii="Calibri" w:hAnsi="Calibri" w:cs="Calibri"/>
         </w:rPr>
         <w:t>POST /api/reviews</w:t>
@@ -1278,7 +1278,7 @@
       </w:r>
       <w:r>
         <w:rPr>
-          <w:rStyle w:val="7"/>
+          <w:rStyle w:val="8"/>
           <w:rFonts w:hint="default" w:ascii="Calibri" w:hAnsi="Calibri" w:cs="Calibri"/>
         </w:rPr>
         <w:t>answerKey</w:t>
@@ -1291,7 +1291,7 @@
       </w:r>
       <w:r>
         <w:rPr>
-          <w:rStyle w:val="7"/>
+          <w:rStyle w:val="8"/>
           <w:rFonts w:hint="default" w:ascii="Calibri" w:hAnsi="Calibri" w:cs="Calibri"/>
         </w:rPr>
         <w:t>ChildSkillState</w:t>
@@ -1327,7 +1327,7 @@
       </w:r>
       <w:r>
         <w:rPr>
-          <w:rStyle w:val="7"/>
+          <w:rStyle w:val="8"/>
           <w:rFonts w:hint="default" w:ascii="Calibri" w:hAnsi="Calibri" w:cs="Calibri"/>
         </w:rPr>
         <w:t>ee4a1d6</w:t>
@@ -1360,7 +1360,7 @@
     </w:p>
     <w:p>
       <w:pPr>
-        <w:pStyle w:val="9"/>
+        <w:pStyle w:val="10"/>
         <w:keepNext w:val="0"/>
         <w:keepLines w:val="0"/>
         <w:widowControl/>
@@ -1380,7 +1380,7 @@
       </w:r>
       <w:r>
         <w:rPr>
-          <w:rStyle w:val="7"/>
+          <w:rStyle w:val="8"/>
           <w:rFonts w:hint="default" w:ascii="Calibri" w:hAnsi="Calibri" w:cs="Calibri"/>
         </w:rPr>
         <w:t>stability &lt;= 7 days</w:t>
@@ -1504,7 +1504,7 @@
       </w:r>
       <w:r>
         <w:rPr>
-          <w:rStyle w:val="7"/>
+          <w:rStyle w:val="8"/>
           <w:rFonts w:hint="default" w:ascii="Calibri" w:hAnsi="Calibri" w:cs="Calibri"/>
         </w:rPr>
         <w:t>multi_part</w:t>
@@ -1517,7 +1517,7 @@
       </w:r>
       <w:r>
         <w:rPr>
-          <w:rStyle w:val="7"/>
+          <w:rStyle w:val="8"/>
           <w:rFonts w:hint="default" w:ascii="Calibri" w:hAnsi="Calibri" w:cs="Calibri"/>
         </w:rPr>
         <w:t>open_response</w:t>
@@ -1668,7 +1668,7 @@
       </w:r>
       <w:r>
         <w:rPr>
-          <w:rStyle w:val="7"/>
+          <w:rStyle w:val="8"/>
           <w:rFonts w:hint="default" w:ascii="Calibri" w:hAnsi="Calibri" w:cs="Calibri"/>
         </w:rPr>
         <w:t>C:\recallie-app</w:t>
@@ -1681,7 +1681,7 @@
       </w:r>
       <w:r>
         <w:rPr>
-          <w:rStyle w:val="7"/>
+          <w:rStyle w:val="8"/>
           <w:rFonts w:hint="default" w:ascii="Calibri" w:hAnsi="Calibri" w:cs="Calibri"/>
         </w:rPr>
         <w:t>.env</w:t>
@@ -1694,7 +1694,7 @@
       </w:r>
       <w:r>
         <w:rPr>
-          <w:rStyle w:val="7"/>
+          <w:rStyle w:val="8"/>
           <w:rFonts w:hint="default" w:ascii="Calibri" w:hAnsi="Calibri" w:cs="Calibri"/>
         </w:rPr>
         <w:t>DATABASE_URL</w:t>
@@ -1707,7 +1707,7 @@
       </w:r>
       <w:r>
         <w:rPr>
-          <w:rStyle w:val="7"/>
+          <w:rStyle w:val="8"/>
           <w:rFonts w:hint="default" w:ascii="Calibri" w:hAnsi="Calibri" w:cs="Calibri"/>
         </w:rPr>
         <w:t>npm run dev</w:t>
@@ -1936,7 +1936,7 @@
     </w:p>
     <w:p>
       <w:pPr>
-        <w:pStyle w:val="9"/>
+        <w:pStyle w:val="10"/>
         <w:keepNext w:val="0"/>
         <w:keepLines w:val="0"/>
         <w:widowControl/>
@@ -1956,7 +1956,7 @@
       </w:r>
       <w:r>
         <w:rPr>
-          <w:rStyle w:val="7"/>
+          <w:rStyle w:val="8"/>
           <w:rFonts w:hint="default" w:ascii="Calibri" w:hAnsi="Calibri" w:cs="Calibri"/>
         </w:rPr>
         <w:t>recallie-app-src.tar.gz</w:t>
@@ -1989,7 +1989,7 @@
     </w:p>
     <w:p>
       <w:pPr>
-        <w:pStyle w:val="9"/>
+        <w:pStyle w:val="10"/>
         <w:keepNext w:val="0"/>
         <w:keepLines w:val="0"/>
         <w:widowControl/>
@@ -2003,35 +2003,35 @@
       </w:pPr>
       <w:r>
         <w:rPr>
-          <w:rStyle w:val="10"/>
+          <w:rStyle w:val="11"/>
           <w:rFonts w:hint="default" w:ascii="Calibri" w:hAnsi="Calibri" w:cs="Calibri"/>
         </w:rPr>
         <w:fldChar w:fldCharType="begin"/>
       </w:r>
       <w:r>
         <w:rPr>
-          <w:rStyle w:val="10"/>
+          <w:rStyle w:val="11"/>
           <w:rFonts w:hint="default" w:ascii="Calibri" w:hAnsi="Calibri" w:cs="Calibri"/>
         </w:rPr>
         <w:instrText xml:space="preserve"> HYPERLINK "https://github.com/jayasingheck-afk/recallie-app" </w:instrText>
       </w:r>
       <w:r>
         <w:rPr>
-          <w:rStyle w:val="10"/>
+          <w:rStyle w:val="11"/>
           <w:rFonts w:hint="default" w:ascii="Calibri" w:hAnsi="Calibri" w:cs="Calibri"/>
         </w:rPr>
         <w:fldChar w:fldCharType="separate"/>
       </w:r>
       <w:r>
         <w:rPr>
-          <w:rStyle w:val="8"/>
+          <w:rStyle w:val="9"/>
           <w:rFonts w:hint="default" w:ascii="Calibri" w:hAnsi="Calibri" w:cs="Calibri"/>
         </w:rPr>
         <w:t>https://github.com/jayasingheck-afk/recallie-app</w:t>
       </w:r>
       <w:r>
         <w:rPr>
-          <w:rStyle w:val="10"/>
+          <w:rStyle w:val="11"/>
           <w:rFonts w:hint="default" w:ascii="Calibri" w:hAnsi="Calibri" w:cs="Calibri"/>
         </w:rPr>
         <w:fldChar w:fldCharType="end"/>
@@ -2044,7 +2044,7 @@
       </w:r>
       <w:r>
         <w:rPr>
-          <w:rStyle w:val="7"/>
+          <w:rStyle w:val="8"/>
           <w:rFonts w:hint="default" w:ascii="Calibri" w:hAnsi="Calibri" w:cs="Calibri"/>
         </w:rPr>
         <w:t>C:\recallie-app</w:t>
@@ -2099,7 +2099,7 @@
       </w:r>
       <w:r>
         <w:rPr>
-          <w:rStyle w:val="7"/>
+          <w:rStyle w:val="8"/>
           <w:rFonts w:hint="default" w:ascii="Calibri" w:hAnsi="Calibri" w:cs="Calibri"/>
         </w:rPr>
         <w:t>recallie-app</w:t>
@@ -2135,7 +2135,7 @@
       </w:r>
       <w:r>
         <w:rPr>
-          <w:rStyle w:val="10"/>
+          <w:rStyle w:val="11"/>
           <w:rFonts w:hint="default" w:ascii="Calibri" w:hAnsi="Calibri" w:cs="Calibri"/>
         </w:rPr>
         <w:t>Drizzle ORM, not Prisma</w:t>
@@ -2148,7 +2148,7 @@
       </w:r>
       <w:r>
         <w:rPr>
-          <w:rStyle w:val="7"/>
+          <w:rStyle w:val="8"/>
           <w:rFonts w:hint="default" w:ascii="Calibri" w:hAnsi="Calibri" w:cs="Calibri"/>
         </w:rPr>
         <w:t>User</w:t>
@@ -2161,7 +2161,7 @@
       </w:r>
       <w:r>
         <w:rPr>
-          <w:rStyle w:val="7"/>
+          <w:rStyle w:val="8"/>
           <w:rFonts w:hint="default" w:ascii="Calibri" w:hAnsi="Calibri" w:cs="Calibri"/>
         </w:rPr>
         <w:t>enrolledAt</w:t>
@@ -2197,7 +2197,7 @@
       </w:r>
       <w:r>
         <w:rPr>
-          <w:rStyle w:val="6"/>
+          <w:rStyle w:val="7"/>
           <w:rFonts w:hint="default" w:ascii="Calibri" w:hAnsi="Calibri" w:cs="Calibri"/>
         </w:rPr>
         <w:t>weekly sequence</w:t>
@@ -2210,7 +2210,7 @@
       </w:r>
       <w:r>
         <w:rPr>
-          <w:rStyle w:val="10"/>
+          <w:rStyle w:val="11"/>
           <w:rFonts w:hint="default" w:ascii="Calibri" w:hAnsi="Calibri" w:cs="Calibri"/>
         </w:rPr>
         <w:t>Week 1</w:t>
@@ -2246,7 +2246,7 @@
       </w:r>
       <w:r>
         <w:rPr>
-          <w:rStyle w:val="7"/>
+          <w:rStyle w:val="8"/>
           <w:rFonts w:hint="default" w:ascii="Calibri" w:hAnsi="Calibri" w:cs="Calibri"/>
         </w:rPr>
         <w:t>src/lib/spacedRepetition.ts</w:t>
@@ -2282,7 +2282,7 @@
       </w:r>
       <w:r>
         <w:rPr>
-          <w:rStyle w:val="7"/>
+          <w:rStyle w:val="8"/>
           <w:rFonts w:hint="default" w:ascii="Calibri" w:hAnsi="Calibri" w:cs="Calibri"/>
         </w:rPr>
         <w:t>src/lib/sessionBuilder.ts</w:t>
@@ -2295,7 +2295,7 @@
       </w:r>
       <w:r>
         <w:rPr>
-          <w:rStyle w:val="7"/>
+          <w:rStyle w:val="8"/>
           <w:rFonts w:hint="default" w:ascii="Calibri" w:hAnsi="Calibri" w:cs="Calibri"/>
         </w:rPr>
         <w:t>multi_part</w:t>
@@ -2308,7 +2308,7 @@
       </w:r>
       <w:r>
         <w:rPr>
-          <w:rStyle w:val="7"/>
+          <w:rStyle w:val="8"/>
           <w:rFonts w:hint="default" w:ascii="Calibri" w:hAnsi="Calibri" w:cs="Calibri"/>
         </w:rPr>
         <w:t>open_response</w:t>
@@ -2321,7 +2321,7 @@
       </w:r>
       <w:r>
         <w:rPr>
-          <w:rStyle w:val="7"/>
+          <w:rStyle w:val="8"/>
           <w:rFonts w:hint="default" w:ascii="Calibri" w:hAnsi="Calibri" w:cs="Calibri"/>
         </w:rPr>
         <w:t>curriculumWeek.ts</w:t>
@@ -2357,7 +2357,7 @@
       </w:r>
       <w:r>
         <w:rPr>
-          <w:rStyle w:val="7"/>
+          <w:rStyle w:val="8"/>
           <w:rFonts w:hint="default" w:ascii="Calibri" w:hAnsi="Calibri" w:cs="Calibri"/>
         </w:rPr>
         <w:t>GET /api/session/today</w:t>
@@ -2370,7 +2370,7 @@
       </w:r>
       <w:r>
         <w:rPr>
-          <w:rStyle w:val="7"/>
+          <w:rStyle w:val="8"/>
           <w:rFonts w:hint="default" w:ascii="Calibri" w:hAnsi="Calibri" w:cs="Calibri"/>
         </w:rPr>
         <w:t>POST /api/reviews</w:t>
@@ -2383,7 +2383,7 @@
       </w:r>
       <w:r>
         <w:rPr>
-          <w:rStyle w:val="7"/>
+          <w:rStyle w:val="8"/>
           <w:rFonts w:hint="default" w:ascii="Calibri" w:hAnsi="Calibri" w:cs="Calibri"/>
         </w:rPr>
         <w:t>GET /api/dashboard</w:t>
@@ -2396,7 +2396,7 @@
       </w:r>
       <w:r>
         <w:rPr>
-          <w:rStyle w:val="7"/>
+          <w:rStyle w:val="8"/>
           <w:rFonts w:hint="default" w:ascii="Calibri" w:hAnsi="Calibri" w:cs="Calibri"/>
         </w:rPr>
         <w:t>GET</w:t>
@@ -2409,7 +2409,7 @@
       </w:r>
       <w:r>
         <w:rPr>
-          <w:rStyle w:val="7"/>
+          <w:rStyle w:val="8"/>
           <w:rFonts w:hint="default" w:ascii="Calibri" w:hAnsi="Calibri" w:cs="Calibri"/>
         </w:rPr>
         <w:t>POST /api/children</w:t>
@@ -2445,7 +2445,7 @@
       </w:r>
       <w:r>
         <w:rPr>
-          <w:rStyle w:val="7"/>
+          <w:rStyle w:val="8"/>
           <w:rFonts w:hint="default" w:ascii="Calibri" w:hAnsi="Calibri" w:cs="Calibri"/>
         </w:rPr>
         <w:t>/child</w:t>
@@ -2458,7 +2458,7 @@
       </w:r>
       <w:r>
         <w:rPr>
-          <w:rStyle w:val="7"/>
+          <w:rStyle w:val="8"/>
           <w:rFonts w:hint="default" w:ascii="Calibri" w:hAnsi="Calibri" w:cs="Calibri"/>
         </w:rPr>
         <w:t>?childId=</w:t>
@@ -2471,7 +2471,7 @@
       </w:r>
       <w:r>
         <w:rPr>
-          <w:rStyle w:val="7"/>
+          <w:rStyle w:val="8"/>
           <w:rFonts w:hint="default" w:ascii="Calibri" w:hAnsi="Calibri" w:cs="Calibri"/>
         </w:rPr>
         <w:t>/parent/dashboard</w:t>
@@ -2484,7 +2484,7 @@
       </w:r>
       <w:r>
         <w:rPr>
-          <w:rStyle w:val="7"/>
+          <w:rStyle w:val="8"/>
           <w:rFonts w:hint="default" w:ascii="Calibri" w:hAnsi="Calibri" w:cs="Calibri"/>
         </w:rPr>
         <w:t>?childId=</w:t>
@@ -2497,7 +2497,7 @@
       </w:r>
       <w:r>
         <w:rPr>
-          <w:rStyle w:val="7"/>
+          <w:rStyle w:val="8"/>
           <w:rFonts w:hint="default" w:ascii="Calibri" w:hAnsi="Calibri" w:cs="Calibri"/>
         </w:rPr>
         <w:t>/parent/children</w:t>
@@ -2550,16 +2550,121 @@
       </w:pPr>
       <w:r>
         <w:rPr>
+          <w:rStyle w:val="8"/>
+          <w:rFonts w:hint="default" w:ascii="Calibri" w:hAnsi="Calibri" w:cs="Calibri"/>
+        </w:rPr>
+        <w:t>src/db/client.ts</w:t>
+      </w:r>
+      <w:r>
+        <w:rPr>
+          <w:rFonts w:hint="default" w:ascii="Calibri" w:hAnsi="Calibri" w:cs="Calibri"/>
+        </w:rPr>
+        <w:t xml:space="preserve"> auto-detects local vs. managed Postgres (Neon/Supabase/RDS) and enables SSL accordingly — no manual config needed either way.</w:t>
+      </w:r>
+    </w:p>
+    <w:p>
+      <w:pPr>
+        <w:pStyle w:val="3"/>
+        <w:keepNext w:val="0"/>
+        <w:keepLines w:val="0"/>
+        <w:widowControl/>
+        <w:suppressLineNumbers w:val="0"/>
+        <w:bidi w:val="0"/>
+        <w:rPr>
+          <w:rFonts w:hint="default" w:ascii="Calibri" w:hAnsi="Calibri" w:cs="Calibri"/>
+        </w:rPr>
+      </w:pPr>
+      <w:r>
+        <w:rPr>
+          <w:rFonts w:hint="default" w:ascii="Calibri" w:hAnsi="Calibri" w:cs="Calibri"/>
+        </w:rPr>
+        <w:t>Key decision: Prisma → Drizzle</w:t>
+      </w:r>
+    </w:p>
+    <w:p>
+      <w:pPr>
+        <w:pStyle w:val="10"/>
+        <w:keepNext w:val="0"/>
+        <w:keepLines w:val="0"/>
+        <w:widowControl/>
+        <w:suppressLineNumbers w:val="0"/>
+        <w:bidi w:val="0"/>
+        <w:spacing w:before="0" w:beforeAutospacing="1" w:after="0" w:afterAutospacing="1"/>
+        <w:ind w:left="0" w:right="0"/>
+        <w:rPr>
+          <w:rFonts w:hint="default" w:ascii="Calibri" w:hAnsi="Calibri" w:cs="Calibri"/>
+        </w:rPr>
+      </w:pPr>
+      <w:r>
+        <w:rPr>
+          <w:rFonts w:hint="default" w:ascii="Calibri" w:hAnsi="Calibri" w:cs="Calibri"/>
+        </w:rPr>
+        <w:t xml:space="preserve">The sandbox environment could not reach </w:t>
+      </w:r>
+      <w:r>
+        <w:rPr>
+          <w:rStyle w:val="8"/>
+          <w:rFonts w:hint="default" w:ascii="Calibri" w:hAnsi="Calibri" w:cs="Calibri"/>
+        </w:rPr>
+        <w:t>binaries.prisma.sh</w:t>
+      </w:r>
+      <w:r>
+        <w:rPr>
+          <w:rFonts w:hint="default" w:ascii="Calibri" w:hAnsi="Calibri" w:cs="Calibri"/>
+        </w:rPr>
+        <w:t xml:space="preserve"> (network allowlist covers npm registry only), so </w:t>
+      </w:r>
+      <w:r>
+        <w:rPr>
+          <w:rStyle w:val="8"/>
+          <w:rFonts w:hint="default" w:ascii="Calibri" w:hAnsi="Calibri" w:cs="Calibri"/>
+        </w:rPr>
+        <w:t>prisma init</w:t>
+      </w:r>
+      <w:r>
+        <w:rPr>
+          <w:rFonts w:hint="default" w:ascii="Calibri" w:hAnsi="Calibri" w:cs="Calibri"/>
+        </w:rPr>
+        <w:t>/</w:t>
+      </w:r>
+      <w:r>
+        <w:rPr>
+          <w:rStyle w:val="8"/>
+          <w:rFonts w:hint="default" w:ascii="Calibri" w:hAnsi="Calibri" w:cs="Calibri"/>
+        </w:rPr>
+        <w:t>migrate</w:t>
+      </w:r>
+      <w:r>
+        <w:rPr>
+          <w:rFonts w:hint="default" w:ascii="Calibri" w:hAnsi="Calibri" w:cs="Calibri"/>
+        </w:rPr>
+        <w:t xml:space="preserve"> failed outright. Swapped to Drizzle ORM — same schema, same Postgres, no functional loss, and Drizzle was already named as an acceptable alternative in the project's own docs. If a future environment </w:t>
+      </w:r>
+      <w:r>
+        <w:rPr>
           <w:rStyle w:val="7"/>
           <w:rFonts w:hint="default" w:ascii="Calibri" w:hAnsi="Calibri" w:cs="Calibri"/>
         </w:rPr>
-        <w:t>src/db/client.ts</w:t>
-      </w:r>
-      <w:r>
-        <w:rPr>
-          <w:rFonts w:hint="default" w:ascii="Calibri" w:hAnsi="Calibri" w:cs="Calibri"/>
-        </w:rPr>
-        <w:t xml:space="preserve"> auto-detects local vs. managed Postgres (Neon/Supabase/RDS) and enables SSL accordingly — no manual config needed either way.</w:t>
+        <w:t>can</w:t>
+      </w:r>
+      <w:r>
+        <w:rPr>
+          <w:rFonts w:hint="default" w:ascii="Calibri" w:hAnsi="Calibri" w:cs="Calibri"/>
+        </w:rPr>
+        <w:t xml:space="preserve"> reach Prisma's binaries and the team prefers Prisma, </w:t>
+      </w:r>
+      <w:r>
+        <w:rPr>
+          <w:rStyle w:val="8"/>
+          <w:rFonts w:hint="default" w:ascii="Calibri" w:hAnsi="Calibri" w:cs="Calibri"/>
+        </w:rPr>
+        <w:t>src/db/schema.ts</w:t>
+      </w:r>
+      <w:r>
+        <w:rPr>
+          <w:rFonts w:hint="default" w:ascii="Calibri" w:hAnsi="Calibri" w:cs="Calibri"/>
+        </w:rPr>
+        <w:t xml:space="preserve"> is a straightforward translation back (it mirrors the documented Prisma models field-for-field).</w:t>
       </w:r>
     </w:p>
     <w:p>
@@ -2578,12 +2683,12 @@
         <w:rPr>
           <w:rFonts w:hint="default" w:ascii="Calibri" w:hAnsi="Calibri" w:cs="Calibri"/>
         </w:rPr>
-        <w:t>Key decision: Prisma → Drizzle</w:t>
-      </w:r>
-    </w:p>
-    <w:p>
-      <w:pPr>
-        <w:pStyle w:val="9"/>
+        <w:t>Item bank expansion</w:t>
+      </w:r>
+    </w:p>
+    <w:p>
+      <w:pPr>
+        <w:pStyle w:val="10"/>
         <w:keepNext w:val="0"/>
         <w:keepLines w:val="0"/>
         <w:widowControl/>
@@ -2599,116 +2704,11 @@
         <w:rPr>
           <w:rFonts w:hint="default" w:ascii="Calibri" w:hAnsi="Calibri" w:cs="Calibri"/>
         </w:rPr>
-        <w:t xml:space="preserve">The sandbox environment could not reach </w:t>
-      </w:r>
-      <w:r>
-        <w:rPr>
-          <w:rStyle w:val="7"/>
-          <w:rFonts w:hint="default" w:ascii="Calibri" w:hAnsi="Calibri" w:cs="Calibri"/>
-        </w:rPr>
-        <w:t>binaries.prisma.sh</w:t>
-      </w:r>
-      <w:r>
-        <w:rPr>
-          <w:rFonts w:hint="default" w:ascii="Calibri" w:hAnsi="Calibri" w:cs="Calibri"/>
-        </w:rPr>
-        <w:t xml:space="preserve"> (network allowlist covers npm registry only), so </w:t>
-      </w:r>
-      <w:r>
-        <w:rPr>
-          <w:rStyle w:val="7"/>
-          <w:rFonts w:hint="default" w:ascii="Calibri" w:hAnsi="Calibri" w:cs="Calibri"/>
-        </w:rPr>
-        <w:t>prisma init</w:t>
-      </w:r>
-      <w:r>
-        <w:rPr>
-          <w:rFonts w:hint="default" w:ascii="Calibri" w:hAnsi="Calibri" w:cs="Calibri"/>
-        </w:rPr>
-        <w:t>/</w:t>
-      </w:r>
-      <w:r>
-        <w:rPr>
-          <w:rStyle w:val="7"/>
-          <w:rFonts w:hint="default" w:ascii="Calibri" w:hAnsi="Calibri" w:cs="Calibri"/>
-        </w:rPr>
-        <w:t>migrate</w:t>
-      </w:r>
-      <w:r>
-        <w:rPr>
-          <w:rFonts w:hint="default" w:ascii="Calibri" w:hAnsi="Calibri" w:cs="Calibri"/>
-        </w:rPr>
-        <w:t xml:space="preserve"> failed outright. Swapped to Drizzle ORM — same schema, same Postgres, no functional loss, and Drizzle was already named as an acceptable alternative in the project's own docs. If a future environment </w:t>
-      </w:r>
-      <w:r>
-        <w:rPr>
-          <w:rStyle w:val="6"/>
-          <w:rFonts w:hint="default" w:ascii="Calibri" w:hAnsi="Calibri" w:cs="Calibri"/>
-        </w:rPr>
-        <w:t>can</w:t>
-      </w:r>
-      <w:r>
-        <w:rPr>
-          <w:rFonts w:hint="default" w:ascii="Calibri" w:hAnsi="Calibri" w:cs="Calibri"/>
-        </w:rPr>
-        <w:t xml:space="preserve"> reach Prisma's binaries and the team prefers Prisma, </w:t>
-      </w:r>
-      <w:r>
-        <w:rPr>
-          <w:rStyle w:val="7"/>
-          <w:rFonts w:hint="default" w:ascii="Calibri" w:hAnsi="Calibri" w:cs="Calibri"/>
-        </w:rPr>
-        <w:t>src/db/schema.ts</w:t>
-      </w:r>
-      <w:r>
-        <w:rPr>
-          <w:rFonts w:hint="default" w:ascii="Calibri" w:hAnsi="Calibri" w:cs="Calibri"/>
-        </w:rPr>
-        <w:t xml:space="preserve"> is a straightforward translation back (it mirrors the documented Prisma models field-for-field).</w:t>
-      </w:r>
-    </w:p>
-    <w:p>
-      <w:pPr>
-        <w:pStyle w:val="3"/>
-        <w:keepNext w:val="0"/>
-        <w:keepLines w:val="0"/>
-        <w:widowControl/>
-        <w:suppressLineNumbers w:val="0"/>
-        <w:bidi w:val="0"/>
-        <w:rPr>
-          <w:rFonts w:hint="default" w:ascii="Calibri" w:hAnsi="Calibri" w:cs="Calibri"/>
-        </w:rPr>
-      </w:pPr>
-      <w:r>
-        <w:rPr>
-          <w:rFonts w:hint="default" w:ascii="Calibri" w:hAnsi="Calibri" w:cs="Calibri"/>
-        </w:rPr>
-        <w:t>Item bank expansion</w:t>
-      </w:r>
-    </w:p>
-    <w:p>
-      <w:pPr>
-        <w:pStyle w:val="9"/>
-        <w:keepNext w:val="0"/>
-        <w:keepLines w:val="0"/>
-        <w:widowControl/>
-        <w:suppressLineNumbers w:val="0"/>
-        <w:bidi w:val="0"/>
-        <w:spacing w:before="0" w:beforeAutospacing="1" w:after="0" w:afterAutospacing="1"/>
-        <w:ind w:left="0" w:right="0"/>
-        <w:rPr>
-          <w:rFonts w:hint="default" w:ascii="Calibri" w:hAnsi="Calibri" w:cs="Calibri"/>
-        </w:rPr>
-      </w:pPr>
-      <w:r>
-        <w:rPr>
-          <w:rFonts w:hint="default" w:ascii="Calibri" w:hAnsi="Calibri" w:cs="Calibri"/>
-        </w:rPr>
         <w:t xml:space="preserve">Generated 54 new practice items for the 5 Week 1 skills (M3N01, M3M01, E3LY03, E3LA04, E3LY09) following the project's own Maths/English item-generation prompt templates — </w:t>
       </w:r>
       <w:r>
         <w:rPr>
-          <w:rStyle w:val="7"/>
+          <w:rStyle w:val="8"/>
           <w:rFonts w:hint="default" w:ascii="Calibri" w:hAnsi="Calibri" w:cs="Calibri"/>
         </w:rPr>
         <w:t>src/db/seed/week1-item-bank.json</w:t>
@@ -2721,7 +2721,7 @@
       </w:r>
       <w:r>
         <w:rPr>
-          <w:rStyle w:val="10"/>
+          <w:rStyle w:val="11"/>
           <w:rFonts w:hint="default" w:ascii="Calibri" w:hAnsi="Calibri" w:cs="Calibri"/>
         </w:rPr>
         <w:t>Not yet human-reviewed</w:t>
@@ -2734,7 +2734,7 @@
       </w:r>
       <w:r>
         <w:rPr>
-          <w:rStyle w:val="7"/>
+          <w:rStyle w:val="8"/>
           <w:rFonts w:hint="default" w:ascii="Calibri" w:hAnsi="Calibri" w:cs="Calibri"/>
         </w:rPr>
         <w:t>_note</w:t>
@@ -2748,7 +2748,7 @@
     </w:p>
     <w:p>
       <w:pPr>
-        <w:pStyle w:val="9"/>
+        <w:pStyle w:val="10"/>
         <w:keepNext w:val="0"/>
         <w:keepLines w:val="0"/>
         <w:widowControl/>
@@ -2791,7 +2791,7 @@
       </w:r>
       <w:r>
         <w:rPr>
-          <w:rStyle w:val="7"/>
+          <w:rStyle w:val="8"/>
           <w:rFonts w:hint="default" w:ascii="Calibri" w:hAnsi="Calibri" w:cs="Calibri"/>
         </w:rPr>
         <w:t>answerKey</w:t>
@@ -2804,7 +2804,7 @@
       </w:r>
       <w:r>
         <w:rPr>
-          <w:rStyle w:val="7"/>
+          <w:rStyle w:val="8"/>
           <w:rFonts w:hint="default" w:ascii="Calibri" w:hAnsi="Calibri" w:cs="Calibri"/>
         </w:rPr>
         <w:t>"Sunday"</w:t>
@@ -2817,7 +2817,7 @@
       </w:r>
       <w:r>
         <w:rPr>
-          <w:rStyle w:val="7"/>
+          <w:rStyle w:val="8"/>
           <w:rFonts w:hint="default" w:ascii="Calibri" w:hAnsi="Calibri" w:cs="Calibri"/>
         </w:rPr>
         <w:t>"kilograms"</w:t>
@@ -2830,7 +2830,7 @@
       </w:r>
       <w:r>
         <w:rPr>
-          <w:rStyle w:val="7"/>
+          <w:rStyle w:val="8"/>
           <w:rFonts w:hint="default" w:ascii="Calibri" w:hAnsi="Calibri" w:cs="Calibri"/>
         </w:rPr>
         <w:t>stepByStepSolution</w:t>
@@ -2866,7 +2866,7 @@
       </w:r>
       <w:r>
         <w:rPr>
-          <w:rStyle w:val="7"/>
+          <w:rStyle w:val="8"/>
           <w:rFonts w:hint="default" w:ascii="Calibri" w:hAnsi="Calibri" w:cs="Calibri"/>
         </w:rPr>
         <w:t>answerKey</w:t>
@@ -2879,7 +2879,7 @@
       </w:r>
       <w:r>
         <w:rPr>
-          <w:rStyle w:val="7"/>
+          <w:rStyle w:val="8"/>
           <w:rFonts w:hint="default" w:ascii="Calibri" w:hAnsi="Calibri" w:cs="Calibri"/>
         </w:rPr>
         <w:t>["6000 + 500 + 0 + 9", "6000 + 500 + 9"]</w:t>
@@ -2892,7 +2892,7 @@
       </w:r>
       <w:r>
         <w:rPr>
-          <w:rStyle w:val="7"/>
+          <w:rStyle w:val="8"/>
           <w:rFonts w:hint="default" w:ascii="Calibri" w:hAnsi="Calibri" w:cs="Calibri"/>
         </w:rPr>
         <w:t>POST /api/reviews</w:t>
@@ -2928,7 +2928,7 @@
       </w:r>
       <w:r>
         <w:rPr>
-          <w:rStyle w:val="7"/>
+          <w:rStyle w:val="8"/>
           <w:rFonts w:hint="default" w:ascii="Calibri" w:hAnsi="Calibri" w:cs="Calibri"/>
         </w:rPr>
         <w:t>multi_part</w:t>
@@ -2941,7 +2941,7 @@
       </w:r>
       <w:r>
         <w:rPr>
-          <w:rStyle w:val="7"/>
+          <w:rStyle w:val="8"/>
           <w:rFonts w:hint="default" w:ascii="Calibri" w:hAnsi="Calibri" w:cs="Calibri"/>
         </w:rPr>
         <w:t>{"largest":"8520","smallest":"2058"}</w:t>
@@ -2977,7 +2977,7 @@
       </w:r>
       <w:r>
         <w:rPr>
-          <w:rStyle w:val="7"/>
+          <w:rStyle w:val="8"/>
           <w:rFonts w:hint="default" w:ascii="Calibri" w:hAnsi="Calibri" w:cs="Calibri"/>
         </w:rPr>
         <w:t>answerKey: "open response"</w:t>
@@ -2990,7 +2990,7 @@
       </w:r>
       <w:r>
         <w:rPr>
-          <w:rStyle w:val="7"/>
+          <w:rStyle w:val="8"/>
           <w:rFonts w:hint="default" w:ascii="Calibri" w:hAnsi="Calibri" w:cs="Calibri"/>
         </w:rPr>
         <w:t>"open_response"</w:t>
@@ -3004,7 +3004,7 @@
     </w:p>
     <w:p>
       <w:pPr>
-        <w:pStyle w:val="9"/>
+        <w:pStyle w:val="10"/>
         <w:keepNext w:val="0"/>
         <w:keepLines w:val="0"/>
         <w:widowControl/>
@@ -3018,7 +3018,7 @@
       </w:pPr>
       <w:r>
         <w:rPr>
-          <w:rStyle w:val="7"/>
+          <w:rStyle w:val="8"/>
           <w:rFonts w:hint="default" w:ascii="Calibri" w:hAnsi="Calibri" w:cs="Calibri"/>
         </w:rPr>
         <w:t>sessionBuilder.ts</w:t>
@@ -3031,7 +3031,7 @@
       </w:r>
       <w:r>
         <w:rPr>
-          <w:rStyle w:val="7"/>
+          <w:rStyle w:val="8"/>
           <w:rFonts w:hint="default" w:ascii="Calibri" w:hAnsi="Calibri" w:cs="Calibri"/>
         </w:rPr>
         <w:t>questionType = 'multi_part'</w:t>
@@ -3044,7 +3044,7 @@
       </w:r>
       <w:r>
         <w:rPr>
-          <w:rStyle w:val="7"/>
+          <w:rStyle w:val="8"/>
           <w:rFonts w:hint="default" w:ascii="Calibri" w:hAnsi="Calibri" w:cs="Calibri"/>
         </w:rPr>
         <w:t>'open_response'</w:t>
@@ -3057,7 +3057,7 @@
       </w:r>
       <w:r>
         <w:rPr>
-          <w:rStyle w:val="7"/>
+          <w:rStyle w:val="8"/>
           <w:rFonts w:hint="default" w:ascii="Calibri" w:hAnsi="Calibri" w:cs="Calibri"/>
         </w:rPr>
         <w:t>seed-demo.ts</w:t>
@@ -3070,7 +3070,7 @@
       </w:r>
       <w:r>
         <w:rPr>
-          <w:rStyle w:val="7"/>
+          <w:rStyle w:val="8"/>
           <w:rFonts w:hint="default" w:ascii="Calibri" w:hAnsi="Calibri" w:cs="Calibri"/>
         </w:rPr>
         <w:t>sample-items.json</w:t>
@@ -3083,7 +3083,7 @@
       </w:r>
       <w:r>
         <w:rPr>
-          <w:rStyle w:val="7"/>
+          <w:rStyle w:val="8"/>
           <w:rFonts w:hint="default" w:ascii="Calibri" w:hAnsi="Calibri" w:cs="Calibri"/>
         </w:rPr>
         <w:t>week1-item-bank.json</w:t>
@@ -3116,7 +3116,7 @@
     </w:p>
     <w:p>
       <w:pPr>
-        <w:pStyle w:val="9"/>
+        <w:pStyle w:val="10"/>
         <w:keepNext w:val="0"/>
         <w:keepLines w:val="0"/>
         <w:widowControl/>
@@ -3153,7 +3153,7 @@
       </w:pPr>
       <w:r>
         <w:rPr>
-          <w:rStyle w:val="10"/>
+          <w:rStyle w:val="11"/>
           <w:rFonts w:hint="default" w:ascii="Calibri" w:hAnsi="Calibri" w:cs="Calibri"/>
         </w:rPr>
         <w:t>Parent onboarding</w:t>
@@ -3166,7 +3166,7 @@
       </w:r>
       <w:r>
         <w:rPr>
-          <w:rStyle w:val="7"/>
+          <w:rStyle w:val="8"/>
           <w:rFonts w:hint="default" w:ascii="Calibri" w:hAnsi="Calibri" w:cs="Calibri"/>
         </w:rPr>
         <w:t>/parent/children</w:t>
@@ -3179,7 +3179,7 @@
       </w:r>
       <w:r>
         <w:rPr>
-          <w:rStyle w:val="7"/>
+          <w:rStyle w:val="8"/>
           <w:rFonts w:hint="default" w:ascii="Calibri" w:hAnsi="Calibri" w:cs="Calibri"/>
         </w:rPr>
         <w:t>GET</w:t>
@@ -3192,7 +3192,7 @@
       </w:r>
       <w:r>
         <w:rPr>
-          <w:rStyle w:val="7"/>
+          <w:rStyle w:val="8"/>
           <w:rFonts w:hint="default" w:ascii="Calibri" w:hAnsi="Calibri" w:cs="Calibri"/>
         </w:rPr>
         <w:t>POST /api/children</w:t>
@@ -3205,7 +3205,7 @@
       </w:r>
       <w:r>
         <w:rPr>
-          <w:rStyle w:val="7"/>
+          <w:rStyle w:val="8"/>
           <w:rFonts w:hint="default" w:ascii="Calibri" w:hAnsi="Calibri" w:cs="Calibri"/>
         </w:rPr>
         <w:t>demo_child_1</w:t>
@@ -3218,7 +3218,7 @@
       </w:r>
       <w:r>
         <w:rPr>
-          <w:rStyle w:val="7"/>
+          <w:rStyle w:val="8"/>
           <w:rFonts w:hint="default" w:ascii="Calibri" w:hAnsi="Calibri" w:cs="Calibri"/>
         </w:rPr>
         <w:t>/child</w:t>
@@ -3231,7 +3231,7 @@
       </w:r>
       <w:r>
         <w:rPr>
-          <w:rStyle w:val="7"/>
+          <w:rStyle w:val="8"/>
           <w:rFonts w:hint="default" w:ascii="Calibri" w:hAnsi="Calibri" w:cs="Calibri"/>
         </w:rPr>
         <w:t>/parent/dashboard</w:t>
@@ -3244,7 +3244,7 @@
       </w:r>
       <w:r>
         <w:rPr>
-          <w:rStyle w:val="7"/>
+          <w:rStyle w:val="8"/>
           <w:rFonts w:hint="default" w:ascii="Calibri" w:hAnsi="Calibri" w:cs="Calibri"/>
         </w:rPr>
         <w:t>?childId=</w:t>
@@ -3257,7 +3257,7 @@
       </w:r>
       <w:r>
         <w:rPr>
-          <w:rStyle w:val="7"/>
+          <w:rStyle w:val="8"/>
           <w:rFonts w:hint="default" w:ascii="Calibri" w:hAnsi="Calibri" w:cs="Calibri"/>
         </w:rPr>
         <w:t>demo_parent_1</w:t>
@@ -3270,7 +3270,7 @@
       </w:r>
       <w:r>
         <w:rPr>
-          <w:rStyle w:val="7"/>
+          <w:rStyle w:val="8"/>
           <w:rFonts w:hint="default" w:ascii="Calibri" w:hAnsi="Calibri" w:cs="Calibri"/>
         </w:rPr>
         <w:t>hasContent: false</w:t>
@@ -3300,7 +3300,7 @@
       </w:pPr>
       <w:r>
         <w:rPr>
-          <w:rStyle w:val="10"/>
+          <w:rStyle w:val="11"/>
           <w:rFonts w:hint="default" w:ascii="Calibri" w:hAnsi="Calibri" w:cs="Calibri"/>
         </w:rPr>
         <w:t>Curriculum week derivation</w:t>
@@ -3313,7 +3313,7 @@
       </w:r>
       <w:r>
         <w:rPr>
-          <w:rStyle w:val="7"/>
+          <w:rStyle w:val="8"/>
           <w:rFonts w:hint="default" w:ascii="Calibri" w:hAnsi="Calibri" w:cs="Calibri"/>
         </w:rPr>
         <w:t>src/lib/curriculumWeek.ts</w:t>
@@ -3326,7 +3326,7 @@
       </w:r>
       <w:r>
         <w:rPr>
-          <w:rStyle w:val="7"/>
+          <w:rStyle w:val="8"/>
           <w:rFonts w:hint="default" w:ascii="Calibri" w:hAnsi="Calibri" w:cs="Calibri"/>
         </w:rPr>
         <w:t>User.enrolledAt</w:t>
@@ -3339,7 +3339,7 @@
       </w:r>
       <w:r>
         <w:rPr>
-          <w:rStyle w:val="7"/>
+          <w:rStyle w:val="8"/>
           <w:rFonts w:hint="default" w:ascii="Calibri" w:hAnsi="Calibri" w:cs="Calibri"/>
         </w:rPr>
         <w:t>0001_add_enrolled_at.sql</w:t>
@@ -3352,7 +3352,7 @@
       </w:r>
       <w:r>
         <w:rPr>
-          <w:rStyle w:val="7"/>
+          <w:rStyle w:val="8"/>
           <w:rFonts w:hint="default" w:ascii="Calibri" w:hAnsi="Calibri" w:cs="Calibri"/>
         </w:rPr>
         <w:t>computeCurrentTermWeek(enrolledAt, now)</w:t>
@@ -3365,7 +3365,7 @@
       </w:r>
       <w:r>
         <w:rPr>
-          <w:rStyle w:val="7"/>
+          <w:rStyle w:val="8"/>
           <w:rFonts w:hint="default" w:ascii="Calibri" w:hAnsi="Calibri" w:cs="Calibri"/>
         </w:rPr>
         <w:t>term: 1, week: 1</w:t>
@@ -3378,7 +3378,7 @@
       </w:r>
       <w:r>
         <w:rPr>
-          <w:rStyle w:val="7"/>
+          <w:rStyle w:val="8"/>
           <w:rFonts w:hint="default" w:ascii="Calibri" w:hAnsi="Calibri" w:cs="Calibri"/>
         </w:rPr>
         <w:t>/api/session/today</w:t>
@@ -3391,7 +3391,7 @@
       </w:r>
       <w:r>
         <w:rPr>
-          <w:rStyle w:val="7"/>
+          <w:rStyle w:val="8"/>
           <w:rFonts w:hint="default" w:ascii="Calibri" w:hAnsi="Calibri" w:cs="Calibri"/>
         </w:rPr>
         <w:t>curriculumSequenceEntries</w:t>
@@ -3404,7 +3404,7 @@
       </w:r>
       <w:r>
         <w:rPr>
-          <w:rStyle w:val="7"/>
+          <w:rStyle w:val="8"/>
           <w:rFonts w:hint="default" w:ascii="Calibri" w:hAnsi="Calibri" w:cs="Calibri"/>
         </w:rPr>
         <w:t>enrolledAt</w:t>
@@ -3417,7 +3417,7 @@
       </w:r>
       <w:r>
         <w:rPr>
-          <w:rStyle w:val="7"/>
+          <w:rStyle w:val="8"/>
           <w:rFonts w:hint="default" w:ascii="Calibri" w:hAnsi="Calibri" w:cs="Calibri"/>
         </w:rPr>
         <w:t>MAX_AVAILABLE_TERM</w:t>
@@ -3430,7 +3430,7 @@
       </w:r>
       <w:r>
         <w:rPr>
-          <w:rStyle w:val="7"/>
+          <w:rStyle w:val="8"/>
           <w:rFonts w:hint="default" w:ascii="Calibri" w:hAnsi="Calibri" w:cs="Calibri"/>
         </w:rPr>
         <w:t>MAX_AVAILABLE_WEEK</w:t>
@@ -3444,7 +3444,7 @@
     </w:p>
     <w:p>
       <w:pPr>
-        <w:pStyle w:val="9"/>
+        <w:pStyle w:val="10"/>
         <w:keepNext w:val="0"/>
         <w:keepLines w:val="0"/>
         <w:widowControl/>
@@ -3458,7 +3458,7 @@
       </w:pPr>
       <w:r>
         <w:rPr>
-          <w:rStyle w:val="10"/>
+          <w:rStyle w:val="11"/>
           <w:rFonts w:hint="default" w:ascii="Calibri" w:hAnsi="Calibri" w:cs="Calibri"/>
         </w:rPr>
         <w:t>Delivered to Chandana as two sequential git patches</w:t>
@@ -3471,7 +3471,7 @@
       </w:r>
       <w:r>
         <w:rPr>
-          <w:rStyle w:val="7"/>
+          <w:rStyle w:val="8"/>
           <w:rFonts w:hint="default" w:ascii="Calibri" w:hAnsi="Calibri" w:cs="Calibri"/>
         </w:rPr>
         <w:t>recallie-week1-items.patch</w:t>
@@ -3484,7 +3484,7 @@
       </w:r>
       <w:r>
         <w:rPr>
-          <w:rStyle w:val="7"/>
+          <w:rStyle w:val="8"/>
           <w:rFonts w:hint="default" w:ascii="Calibri" w:hAnsi="Calibri" w:cs="Calibri"/>
         </w:rPr>
         <w:t>recallie-parent-onboarding.patch</w:t>
@@ -3497,7 +3497,7 @@
       </w:r>
       <w:r>
         <w:rPr>
-          <w:rStyle w:val="7"/>
+          <w:rStyle w:val="8"/>
           <w:rFonts w:hint="default" w:ascii="Calibri" w:hAnsi="Calibri" w:cs="Calibri"/>
         </w:rPr>
         <w:t>C:\recallie-app</w:t>
@@ -3510,7 +3510,7 @@
       </w:r>
       <w:r>
         <w:rPr>
-          <w:rStyle w:val="7"/>
+          <w:rStyle w:val="8"/>
           <w:rFonts w:hint="default" w:ascii="Calibri" w:hAnsi="Calibri" w:cs="Calibri"/>
         </w:rPr>
         <w:t>git apply &lt;file&gt;</w:t>
@@ -3523,7 +3523,7 @@
       </w:r>
       <w:r>
         <w:rPr>
-          <w:rStyle w:val="7"/>
+          <w:rStyle w:val="8"/>
           <w:rFonts w:hint="default" w:ascii="Calibri" w:hAnsi="Calibri" w:cs="Calibri"/>
         </w:rPr>
         <w:t>npm run db:migrate &amp;&amp; npm run db:seed:demo</w:t>
@@ -3572,7 +3572,7 @@
       </w:pPr>
       <w:r>
         <w:rPr>
-          <w:rStyle w:val="7"/>
+          <w:rStyle w:val="8"/>
           <w:rFonts w:hint="default" w:ascii="Calibri" w:hAnsi="Calibri" w:cs="Calibri"/>
         </w:rPr>
         <w:t>npx tsc --noEmit</w:t>
@@ -3608,7 +3608,7 @@
       </w:r>
       <w:r>
         <w:rPr>
-          <w:rStyle w:val="7"/>
+          <w:rStyle w:val="8"/>
           <w:rFonts w:hint="default" w:ascii="Calibri" w:hAnsi="Calibri" w:cs="Calibri"/>
         </w:rPr>
         <w:t>Item</w:t>
@@ -3621,7 +3621,7 @@
       </w:r>
       <w:r>
         <w:rPr>
-          <w:rStyle w:val="7"/>
+          <w:rStyle w:val="8"/>
           <w:rFonts w:hint="default" w:ascii="Calibri" w:hAnsi="Calibri" w:cs="Calibri"/>
         </w:rPr>
         <w:t>/api/session/today</w:t>
@@ -3651,7 +3651,7 @@
       </w:pPr>
       <w:r>
         <w:rPr>
-          <w:rStyle w:val="7"/>
+          <w:rStyle w:val="8"/>
           <w:rFonts w:hint="default" w:ascii="Calibri" w:hAnsi="Calibri" w:cs="Calibri"/>
         </w:rPr>
         <w:t>POST /api/reviews</w:t>
@@ -3664,7 +3664,7 @@
       </w:r>
       <w:r>
         <w:rPr>
-          <w:rStyle w:val="7"/>
+          <w:rStyle w:val="8"/>
           <w:rFonts w:hint="default" w:ascii="Calibri" w:hAnsi="Calibri" w:cs="Calibri"/>
         </w:rPr>
         <w:t>answerKey</w:t>
@@ -3677,7 +3677,7 @@
       </w:r>
       <w:r>
         <w:rPr>
-          <w:rStyle w:val="7"/>
+          <w:rStyle w:val="8"/>
           <w:rFonts w:hint="default" w:ascii="Calibri" w:hAnsi="Calibri" w:cs="Calibri"/>
         </w:rPr>
         <w:t>ChildSkillState</w:t>
@@ -3713,7 +3713,7 @@
       </w:r>
       <w:r>
         <w:rPr>
-          <w:rStyle w:val="7"/>
+          <w:rStyle w:val="8"/>
           <w:rFonts w:hint="default" w:ascii="Calibri" w:hAnsi="Calibri" w:cs="Calibri"/>
         </w:rPr>
         <w:t>POST /api/children</w:t>
@@ -3726,7 +3726,7 @@
       </w:r>
       <w:r>
         <w:rPr>
-          <w:rStyle w:val="7"/>
+          <w:rStyle w:val="8"/>
           <w:rFonts w:hint="default" w:ascii="Calibri" w:hAnsi="Calibri" w:cs="Calibri"/>
         </w:rPr>
         <w:t>GET /api/children</w:t>
@@ -3739,7 +3739,7 @@
       </w:r>
       <w:r>
         <w:rPr>
-          <w:rStyle w:val="7"/>
+          <w:rStyle w:val="8"/>
           <w:rFonts w:hint="default" w:ascii="Calibri" w:hAnsi="Calibri" w:cs="Calibri"/>
         </w:rPr>
         <w:t>hasContent: false</w:t>
@@ -3798,7 +3798,7 @@
       </w:r>
       <w:r>
         <w:rPr>
-          <w:rStyle w:val="7"/>
+          <w:rStyle w:val="8"/>
           <w:rFonts w:hint="default" w:ascii="Calibri" w:hAnsi="Calibri" w:cs="Calibri"/>
         </w:rPr>
         <w:t>/</w:t>
@@ -3811,7 +3811,7 @@
       </w:r>
       <w:r>
         <w:rPr>
-          <w:rStyle w:val="7"/>
+          <w:rStyle w:val="8"/>
           <w:rFonts w:hint="default" w:ascii="Calibri" w:hAnsi="Calibri" w:cs="Calibri"/>
         </w:rPr>
         <w:t>/child?childId=</w:t>
@@ -3824,7 +3824,7 @@
       </w:r>
       <w:r>
         <w:rPr>
-          <w:rStyle w:val="7"/>
+          <w:rStyle w:val="8"/>
           <w:rFonts w:hint="default" w:ascii="Calibri" w:hAnsi="Calibri" w:cs="Calibri"/>
         </w:rPr>
         <w:t>/parent/dashboard?childId=</w:t>
@@ -3837,7 +3837,7 @@
       </w:r>
       <w:r>
         <w:rPr>
-          <w:rStyle w:val="7"/>
+          <w:rStyle w:val="8"/>
           <w:rFonts w:hint="default" w:ascii="Calibri" w:hAnsi="Calibri" w:cs="Calibri"/>
         </w:rPr>
         <w:t>/parent/children</w:t>
@@ -3873,7 +3873,7 @@
       </w:r>
       <w:r>
         <w:rPr>
-          <w:rStyle w:val="7"/>
+          <w:rStyle w:val="8"/>
           <w:rFonts w:hint="default" w:ascii="Calibri" w:hAnsi="Calibri" w:cs="Calibri"/>
         </w:rPr>
         <w:t>ee4a1d6</w:t>
@@ -3886,7 +3886,7 @@
       </w:r>
       <w:r>
         <w:rPr>
-          <w:rStyle w:val="7"/>
+          <w:rStyle w:val="8"/>
           <w:rFonts w:hint="default" w:ascii="Calibri" w:hAnsi="Calibri" w:cs="Calibri"/>
         </w:rPr>
         <w:t>7d7278d</w:t>
@@ -3919,7 +3919,7 @@
     </w:p>
     <w:p>
       <w:pPr>
-        <w:pStyle w:val="9"/>
+        <w:pStyle w:val="10"/>
         <w:keepNext w:val="0"/>
         <w:keepLines w:val="0"/>
         <w:widowControl/>
@@ -3939,7 +3939,7 @@
       </w:r>
       <w:r>
         <w:rPr>
-          <w:rStyle w:val="7"/>
+          <w:rStyle w:val="8"/>
           <w:rFonts w:hint="default" w:ascii="Calibri" w:hAnsi="Calibri" w:cs="Calibri"/>
         </w:rPr>
         <w:t>stability &lt;= 7 days</w:t>
@@ -3994,7 +3994,7 @@
       </w:r>
       <w:r>
         <w:rPr>
-          <w:rStyle w:val="7"/>
+          <w:rStyle w:val="8"/>
           <w:rFonts w:hint="default" w:ascii="Calibri" w:hAnsi="Calibri" w:cs="Calibri"/>
         </w:rPr>
         <w:t>clerkUserId</w:t>
@@ -4053,7 +4053,7 @@
       </w:r>
       <w:r>
         <w:rPr>
-          <w:rStyle w:val="7"/>
+          <w:rStyle w:val="8"/>
           <w:rFonts w:hint="default" w:ascii="Calibri" w:hAnsi="Calibri" w:cs="Calibri"/>
         </w:rPr>
         <w:t>curriculumWeek.ts</w:t>
@@ -4089,7 +4089,7 @@
       </w:r>
       <w:r>
         <w:rPr>
-          <w:rStyle w:val="7"/>
+          <w:rStyle w:val="8"/>
           <w:rFonts w:hint="default" w:ascii="Calibri" w:hAnsi="Calibri" w:cs="Calibri"/>
         </w:rPr>
         <w:t>multi_part</w:t>
@@ -4102,7 +4102,7 @@
       </w:r>
       <w:r>
         <w:rPr>
-          <w:rStyle w:val="7"/>
+          <w:rStyle w:val="8"/>
           <w:rFonts w:hint="default" w:ascii="Calibri" w:hAnsi="Calibri" w:cs="Calibri"/>
         </w:rPr>
         <w:t>open_response</w:t>
@@ -4207,7 +4207,7 @@
       </w:r>
       <w:r>
         <w:rPr>
-          <w:rStyle w:val="7"/>
+          <w:rStyle w:val="8"/>
           <w:rFonts w:hint="default" w:ascii="Calibri" w:hAnsi="Calibri" w:cs="Calibri"/>
         </w:rPr>
         <w:t>C:\recallie-app</w:t>
@@ -4220,7 +4220,7 @@
       </w:r>
       <w:r>
         <w:rPr>
-          <w:rStyle w:val="7"/>
+          <w:rStyle w:val="8"/>
           <w:rFonts w:hint="default" w:ascii="Calibri" w:hAnsi="Calibri" w:cs="Calibri"/>
         </w:rPr>
         <w:t>.env</w:t>
@@ -4233,7 +4233,7 @@
       </w:r>
       <w:r>
         <w:rPr>
-          <w:rStyle w:val="7"/>
+          <w:rStyle w:val="8"/>
           <w:rFonts w:hint="default" w:ascii="Calibri" w:hAnsi="Calibri" w:cs="Calibri"/>
         </w:rPr>
         <w:t>DATABASE_URL</w:t>
@@ -4246,7 +4246,7 @@
       </w:r>
       <w:r>
         <w:rPr>
-          <w:rStyle w:val="7"/>
+          <w:rStyle w:val="8"/>
           <w:rFonts w:hint="default" w:ascii="Calibri" w:hAnsi="Calibri" w:cs="Calibri"/>
         </w:rPr>
         <w:t>npm run dev</w:t>
@@ -4629,10 +4629,20 @@
           <w:szCs w:val="24"/>
           <w:lang w:val="en-US" w:eastAsia="zh-CN" w:bidi="ar"/>
         </w:rPr>
-        <w:t>recallie-app-src.tar.gz1-home.png2-child.png3-parent-dashboard.pngrecallie-week1-items.patchrecallie-parent-onboarding.patchbuild-l</w:t>
-      </w:r>
-      <w:bookmarkStart w:id="0" w:name="_GoBack"/>
-      <w:bookmarkEnd w:id="0"/>
+        <w:t>recallie-app-src.tar.gz1-home.png2-child.png3-parent-dashboard.pngrecallie-week1-items.patchrecallie-parent-onboarding.patchbuild-log-2026-08-17.md</w:t>
+      </w:r>
+    </w:p>
+    <w:p>
+      <w:pPr>
+        <w:keepNext w:val="0"/>
+        <w:keepLines w:val="0"/>
+        <w:widowControl/>
+        <w:suppressLineNumbers w:val="0"/>
+        <w:jc w:val="left"/>
+        <w:rPr>
+          <w:rFonts w:hint="default" w:ascii="Calibri" w:hAnsi="Calibri" w:cs="Calibri"/>
+        </w:rPr>
+      </w:pPr>
       <w:r>
         <w:rPr>
           <w:rFonts w:hint="default" w:ascii="Calibri" w:hAnsi="Calibri" w:eastAsia="SimSun" w:cs="Calibri"/>
@@ -4641,7 +4651,7 @@
           <w:szCs w:val="24"/>
           <w:lang w:val="en-US" w:eastAsia="zh-CN" w:bidi="ar"/>
         </w:rPr>
-        <w:t>og-2026-08-17.md</w:t>
+        <w:t>Recallie.com.au</w:t>
       </w:r>
     </w:p>
     <w:p>
@@ -4663,7 +4673,7 @@
           <w:szCs w:val="24"/>
           <w:lang w:val="en-US" w:eastAsia="zh-CN" w:bidi="ar"/>
         </w:rPr>
-        <w:t>Recallie.com.au</w:t>
+        <w:t>Connectors</w:t>
       </w:r>
     </w:p>
     <w:p>
@@ -4685,7 +4695,7 @@
           <w:szCs w:val="24"/>
           <w:lang w:val="en-US" w:eastAsia="zh-CN" w:bidi="ar"/>
         </w:rPr>
-        <w:t>Connectors</w:t>
+        <w:t>Web Search</w:t>
       </w:r>
     </w:p>
     <w:p>
@@ -4707,7 +4717,7 @@
           <w:szCs w:val="24"/>
           <w:lang w:val="en-US" w:eastAsia="zh-CN" w:bidi="ar"/>
         </w:rPr>
-        <w:t>Web Search</w:t>
+        <w:t>Skills</w:t>
       </w:r>
     </w:p>
     <w:p>
@@ -4729,28 +4739,6 @@
           <w:szCs w:val="24"/>
           <w:lang w:val="en-US" w:eastAsia="zh-CN" w:bidi="ar"/>
         </w:rPr>
-        <w:t>Skills</w:t>
-      </w:r>
-    </w:p>
-    <w:p>
-      <w:pPr>
-        <w:keepNext w:val="0"/>
-        <w:keepLines w:val="0"/>
-        <w:widowControl/>
-        <w:suppressLineNumbers w:val="0"/>
-        <w:jc w:val="left"/>
-        <w:rPr>
-          <w:rFonts w:hint="default" w:ascii="Calibri" w:hAnsi="Calibri" w:cs="Calibri"/>
-        </w:rPr>
-      </w:pPr>
-      <w:r>
-        <w:rPr>
-          <w:rFonts w:hint="default" w:ascii="Calibri" w:hAnsi="Calibri" w:eastAsia="SimSun" w:cs="Calibri"/>
-          <w:kern w:val="0"/>
-          <w:sz w:val="24"/>
-          <w:szCs w:val="24"/>
-          <w:lang w:val="en-US" w:eastAsia="zh-CN" w:bidi="ar"/>
-        </w:rPr>
         <w:t>Create a skill for this kind of task</w:t>
       </w:r>
     </w:p>
@@ -4774,10 +4762,1727 @@
     </w:p>
     <w:p>
       <w:pPr>
-        <w:rPr>
-          <w:rFonts w:hint="default" w:ascii="Calibri" w:hAnsi="Calibri" w:cs="Calibri"/>
-        </w:rPr>
-      </w:pPr>
+        <w:pStyle w:val="2"/>
+        <w:keepNext w:val="0"/>
+        <w:keepLines w:val="0"/>
+        <w:widowControl/>
+        <w:suppressLineNumbers w:val="0"/>
+      </w:pPr>
+      <w:r>
+        <w:t>Build log — 2026-08-17/18: first working scaffold → gamification</w:t>
+      </w:r>
+    </w:p>
+    <w:p>
+      <w:pPr>
+        <w:pStyle w:val="10"/>
+        <w:keepNext w:val="0"/>
+        <w:keepLines w:val="0"/>
+        <w:widowControl/>
+        <w:suppressLineNumbers w:val="0"/>
+      </w:pPr>
+      <w:r>
+        <w:t xml:space="preserve">Built the first runnable slice of Recallie end-to-end in a Claude session (cloud sandbox), following the tech-stack and pedagogy docs already in this project. Source delivered to Chandana as </w:t>
+      </w:r>
+      <w:r>
+        <w:rPr>
+          <w:rStyle w:val="8"/>
+        </w:rPr>
+        <w:t>recallie-app-src.tar.gz</w:t>
+      </w:r>
+      <w:r>
+        <w:t xml:space="preserve"> and pushed to GitHub, then extended over several follow-up sessions via git patches. Summary below so a future session has context.</w:t>
+      </w:r>
+    </w:p>
+    <w:p>
+      <w:pPr>
+        <w:pStyle w:val="3"/>
+        <w:keepNext w:val="0"/>
+        <w:keepLines w:val="0"/>
+        <w:widowControl/>
+        <w:suppressLineNumbers w:val="0"/>
+      </w:pPr>
+      <w:r>
+        <w:t>Repo</w:t>
+      </w:r>
+    </w:p>
+    <w:p>
+      <w:pPr>
+        <w:pStyle w:val="10"/>
+        <w:keepNext w:val="0"/>
+        <w:keepLines w:val="0"/>
+        <w:widowControl/>
+        <w:suppressLineNumbers w:val="0"/>
+      </w:pPr>
+      <w:r>
+        <w:rPr>
+          <w:rStyle w:val="11"/>
+        </w:rPr>
+        <w:t>https://github.com/jayasingheck-afk/recallie-app</w:t>
+      </w:r>
+      <w:r>
+        <w:t xml:space="preserve"> — pushed and confirmed live 2026-08-17. Local dev copy on Chandana's Windows machine at </w:t>
+      </w:r>
+      <w:r>
+        <w:rPr>
+          <w:rStyle w:val="8"/>
+        </w:rPr>
+        <w:t>C:\recallie-app</w:t>
+      </w:r>
+      <w:r>
+        <w:t>.</w:t>
+      </w:r>
+    </w:p>
+    <w:p>
+      <w:pPr>
+        <w:pStyle w:val="3"/>
+        <w:keepNext w:val="0"/>
+        <w:keepLines w:val="0"/>
+        <w:widowControl/>
+        <w:suppressLineNumbers w:val="0"/>
+      </w:pPr>
+      <w:r>
+        <w:t>What exists now</w:t>
+      </w:r>
+    </w:p>
+    <w:p>
+      <w:pPr>
+        <w:keepNext w:val="0"/>
+        <w:keepLines w:val="0"/>
+        <w:widowControl/>
+        <w:numPr>
+          <w:ilvl w:val="0"/>
+          <w:numId w:val="10"/>
+        </w:numPr>
+        <w:suppressLineNumbers w:val="0"/>
+        <w:spacing w:before="0" w:beforeAutospacing="1" w:after="0" w:afterAutospacing="1"/>
+        <w:ind w:left="720" w:hanging="360"/>
+      </w:pPr>
+      <w:r>
+        <w:t xml:space="preserve">Next.js 16 (App Router, TS, Tailwind v4) app named </w:t>
+      </w:r>
+      <w:r>
+        <w:rPr>
+          <w:rStyle w:val="8"/>
+        </w:rPr>
+        <w:t>recallie-app</w:t>
+      </w:r>
+      <w:r>
+        <w:t>.</w:t>
+      </w:r>
+    </w:p>
+    <w:p>
+      <w:pPr>
+        <w:keepNext w:val="0"/>
+        <w:keepLines w:val="0"/>
+        <w:widowControl/>
+        <w:numPr>
+          <w:ilvl w:val="0"/>
+          <w:numId w:val="10"/>
+        </w:numPr>
+        <w:suppressLineNumbers w:val="0"/>
+        <w:spacing w:before="0" w:beforeAutospacing="1" w:after="0" w:afterAutospacing="1"/>
+        <w:ind w:left="720" w:hanging="360"/>
+      </w:pPr>
+      <w:r>
+        <w:t xml:space="preserve">PostgreSQL schema (9 tables) matching the project's documented Prisma schema exactly — User, ParentChildLink, Skill, CurriculumSequenceEntry, ChildSkillState, ReviewEvent, Item, Session, Subscription — but implemented with </w:t>
+      </w:r>
+      <w:r>
+        <w:rPr>
+          <w:rStyle w:val="11"/>
+        </w:rPr>
+        <w:t>Drizzle ORM, not Prisma</w:t>
+      </w:r>
+      <w:r>
+        <w:t xml:space="preserve">. </w:t>
+      </w:r>
+      <w:r>
+        <w:rPr>
+          <w:rStyle w:val="8"/>
+        </w:rPr>
+        <w:t>User</w:t>
+      </w:r>
+      <w:r>
+        <w:t xml:space="preserve"> also has </w:t>
+      </w:r>
+      <w:r>
+        <w:rPr>
+          <w:rStyle w:val="8"/>
+        </w:rPr>
+        <w:t>enrolledAt</w:t>
+      </w:r>
+      <w:r>
+        <w:t xml:space="preserve"> (see "Parent onboarding").</w:t>
+      </w:r>
+    </w:p>
+    <w:p>
+      <w:pPr>
+        <w:keepNext w:val="0"/>
+        <w:keepLines w:val="0"/>
+        <w:widowControl/>
+        <w:numPr>
+          <w:ilvl w:val="0"/>
+          <w:numId w:val="10"/>
+        </w:numPr>
+        <w:suppressLineNumbers w:val="0"/>
+        <w:spacing w:before="0" w:beforeAutospacing="1" w:after="0" w:afterAutospacing="1"/>
+        <w:ind w:left="720" w:hanging="360"/>
+      </w:pPr>
+      <w:r>
+        <w:t xml:space="preserve">Full Year 3 Term 1 curriculum seeded: 25 Maths skills + 30 English skills, with AC/VIC/NSW mappings, taken directly from the project's curriculum docs. Note: the </w:t>
+      </w:r>
+      <w:r>
+        <w:rPr>
+          <w:rStyle w:val="7"/>
+        </w:rPr>
+        <w:t>weekly sequence</w:t>
+      </w:r>
+      <w:r>
+        <w:t xml:space="preserve"> (which skills are "new" each week) currently only has entries for </w:t>
+      </w:r>
+      <w:r>
+        <w:rPr>
+          <w:rStyle w:val="11"/>
+        </w:rPr>
+        <w:t>Week 1</w:t>
+      </w:r>
+      <w:r>
+        <w:t xml:space="preserve"> — see next steps.</w:t>
+      </w:r>
+    </w:p>
+    <w:p>
+      <w:pPr>
+        <w:keepNext w:val="0"/>
+        <w:keepLines w:val="0"/>
+        <w:widowControl/>
+        <w:numPr>
+          <w:ilvl w:val="0"/>
+          <w:numId w:val="10"/>
+        </w:numPr>
+        <w:suppressLineNumbers w:val="0"/>
+        <w:spacing w:before="0" w:beforeAutospacing="1" w:after="0" w:afterAutospacing="1"/>
+        <w:ind w:left="720" w:hanging="360"/>
+      </w:pPr>
+      <w:r>
+        <w:t>Spaced-repetition engine (</w:t>
+      </w:r>
+      <w:r>
+        <w:rPr>
+          <w:rStyle w:val="8"/>
+        </w:rPr>
+        <w:t>src/lib/spacedRepetition.ts</w:t>
+      </w:r>
+      <w:r>
+        <w:t>) ported from the project's TypeScript pseudocode doc.</w:t>
+      </w:r>
+    </w:p>
+    <w:p>
+      <w:pPr>
+        <w:keepNext w:val="0"/>
+        <w:keepLines w:val="0"/>
+        <w:widowControl/>
+        <w:numPr>
+          <w:ilvl w:val="0"/>
+          <w:numId w:val="10"/>
+        </w:numPr>
+        <w:suppressLineNumbers w:val="0"/>
+        <w:spacing w:before="0" w:beforeAutospacing="1" w:after="0" w:afterAutospacing="1"/>
+        <w:ind w:left="720" w:hanging="360"/>
+      </w:pPr>
+      <w:r>
+        <w:t>Session builder (</w:t>
+      </w:r>
+      <w:r>
+        <w:rPr>
+          <w:rStyle w:val="8"/>
+        </w:rPr>
+        <w:t>src/lib/sessionBuilder.ts</w:t>
+      </w:r>
+      <w:r>
+        <w:t xml:space="preserve">) implementing the ~40/35/25 review/new/mixed allocation and same-skill interleave cap from the session-builder doc. Excludes </w:t>
+      </w:r>
+      <w:r>
+        <w:rPr>
+          <w:rStyle w:val="8"/>
+        </w:rPr>
+        <w:t>multi_part</w:t>
+      </w:r>
+      <w:r>
+        <w:t xml:space="preserve"> and </w:t>
+      </w:r>
+      <w:r>
+        <w:rPr>
+          <w:rStyle w:val="8"/>
+        </w:rPr>
+        <w:t>open_response</w:t>
+      </w:r>
+      <w:r>
+        <w:t xml:space="preserve">-tagged items from live sessions. Term/week derived per child via </w:t>
+      </w:r>
+      <w:r>
+        <w:rPr>
+          <w:rStyle w:val="8"/>
+        </w:rPr>
+        <w:t>curriculumWeek.ts</w:t>
+      </w:r>
+      <w:r>
+        <w:t xml:space="preserve"> instead of hard-coded.</w:t>
+      </w:r>
+    </w:p>
+    <w:p>
+      <w:pPr>
+        <w:keepNext w:val="0"/>
+        <w:keepLines w:val="0"/>
+        <w:widowControl/>
+        <w:numPr>
+          <w:ilvl w:val="0"/>
+          <w:numId w:val="10"/>
+        </w:numPr>
+        <w:suppressLineNumbers w:val="0"/>
+        <w:spacing w:before="0" w:beforeAutospacing="1" w:after="0" w:afterAutospacing="1"/>
+        <w:ind w:left="720" w:hanging="360"/>
+      </w:pPr>
+      <w:r>
+        <w:t xml:space="preserve">API routes: </w:t>
+      </w:r>
+      <w:r>
+        <w:rPr>
+          <w:rStyle w:val="8"/>
+        </w:rPr>
+        <w:t>GET /api/session/today</w:t>
+      </w:r>
+      <w:r>
+        <w:t xml:space="preserve">, </w:t>
+      </w:r>
+      <w:r>
+        <w:rPr>
+          <w:rStyle w:val="8"/>
+        </w:rPr>
+        <w:t>POST /api/reviews</w:t>
+      </w:r>
+      <w:r>
+        <w:t xml:space="preserve">, </w:t>
+      </w:r>
+      <w:r>
+        <w:rPr>
+          <w:rStyle w:val="8"/>
+        </w:rPr>
+        <w:t>GET /api/dashboard</w:t>
+      </w:r>
+      <w:r>
+        <w:t xml:space="preserve">, </w:t>
+      </w:r>
+      <w:r>
+        <w:rPr>
+          <w:rStyle w:val="8"/>
+        </w:rPr>
+        <w:t>GET</w:t>
+      </w:r>
+      <w:r>
+        <w:t>/</w:t>
+      </w:r>
+      <w:r>
+        <w:rPr>
+          <w:rStyle w:val="8"/>
+        </w:rPr>
+        <w:t>POST /api/children</w:t>
+      </w:r>
+      <w:r>
+        <w:t xml:space="preserve">, </w:t>
+      </w:r>
+      <w:r>
+        <w:rPr>
+          <w:rStyle w:val="8"/>
+        </w:rPr>
+        <w:t>GET /api/gamification</w:t>
+      </w:r>
+      <w:r>
+        <w:t>.</w:t>
+      </w:r>
+    </w:p>
+    <w:p>
+      <w:pPr>
+        <w:keepNext w:val="0"/>
+        <w:keepLines w:val="0"/>
+        <w:widowControl/>
+        <w:numPr>
+          <w:ilvl w:val="0"/>
+          <w:numId w:val="10"/>
+        </w:numPr>
+        <w:suppressLineNumbers w:val="0"/>
+        <w:spacing w:before="0" w:beforeAutospacing="1" w:after="0" w:afterAutospacing="1"/>
+        <w:ind w:left="720" w:hanging="360"/>
+      </w:pPr>
+      <w:r>
+        <w:t xml:space="preserve">UI: </w:t>
+      </w:r>
+      <w:r>
+        <w:rPr>
+          <w:rStyle w:val="8"/>
+        </w:rPr>
+        <w:t>/child</w:t>
+      </w:r>
+      <w:r>
+        <w:t xml:space="preserve"> (one-item-at-a-time practice, accepts </w:t>
+      </w:r>
+      <w:r>
+        <w:rPr>
+          <w:rStyle w:val="8"/>
+        </w:rPr>
+        <w:t>?childId=</w:t>
+      </w:r>
+      <w:r>
+        <w:t xml:space="preserve">, real persisted points/streak/badges), </w:t>
+      </w:r>
+      <w:r>
+        <w:rPr>
+          <w:rStyle w:val="8"/>
+        </w:rPr>
+        <w:t>/parent/dashboard</w:t>
+      </w:r>
+      <w:r>
+        <w:t xml:space="preserve"> (accepts </w:t>
+      </w:r>
+      <w:r>
+        <w:rPr>
+          <w:rStyle w:val="8"/>
+        </w:rPr>
+        <w:t>?childId=</w:t>
+      </w:r>
+      <w:r>
+        <w:t xml:space="preserve">, points/streak/badge shelf), </w:t>
+      </w:r>
+      <w:r>
+        <w:rPr>
+          <w:rStyle w:val="8"/>
+        </w:rPr>
+        <w:t>/parent/children</w:t>
+      </w:r>
+      <w:r>
+        <w:t xml:space="preserve"> (add/list children, parent onboarding).</w:t>
+      </w:r>
+    </w:p>
+    <w:p>
+      <w:pPr>
+        <w:keepNext w:val="0"/>
+        <w:keepLines w:val="0"/>
+        <w:widowControl/>
+        <w:numPr>
+          <w:ilvl w:val="0"/>
+          <w:numId w:val="10"/>
+        </w:numPr>
+        <w:suppressLineNumbers w:val="0"/>
+        <w:spacing w:before="0" w:beforeAutospacing="1" w:after="0" w:afterAutospacing="1"/>
+        <w:ind w:left="720" w:hanging="360"/>
+      </w:pPr>
+      <w:r>
+        <w:t>Gamification (</w:t>
+      </w:r>
+      <w:r>
+        <w:rPr>
+          <w:rStyle w:val="8"/>
+        </w:rPr>
+        <w:t>src/lib/gamification.ts</w:t>
+      </w:r>
+      <w:r>
+        <w:t xml:space="preserve">): points + daily streak + a 7-badge starter set, fully derived from existing </w:t>
+      </w:r>
+      <w:r>
+        <w:rPr>
+          <w:rStyle w:val="8"/>
+        </w:rPr>
+        <w:t>ReviewEvent</w:t>
+      </w:r>
+      <w:r>
+        <w:t>/</w:t>
+      </w:r>
+      <w:r>
+        <w:rPr>
+          <w:rStyle w:val="8"/>
+        </w:rPr>
+        <w:t>Session</w:t>
+      </w:r>
+      <w:r>
+        <w:t xml:space="preserve"> data — no new mutable counters to keep in sync. See "Gamification" section below.</w:t>
+      </w:r>
+    </w:p>
+    <w:p>
+      <w:pPr>
+        <w:keepNext w:val="0"/>
+        <w:keepLines w:val="0"/>
+        <w:widowControl/>
+        <w:numPr>
+          <w:ilvl w:val="0"/>
+          <w:numId w:val="10"/>
+        </w:numPr>
+        <w:suppressLineNumbers w:val="0"/>
+        <w:spacing w:before="0" w:beforeAutospacing="1" w:after="0" w:afterAutospacing="1"/>
+        <w:ind w:left="720" w:hanging="360"/>
+      </w:pPr>
+      <w:r>
+        <w:t>Week 1 item bank: 62 items total (8 original hand-written samples + 54 generated) across the 5 Week 1 skills, plus a demo parent/child, so the whole loop is testable with real variety.</w:t>
+      </w:r>
+    </w:p>
+    <w:p>
+      <w:pPr>
+        <w:keepNext w:val="0"/>
+        <w:keepLines w:val="0"/>
+        <w:widowControl/>
+        <w:numPr>
+          <w:ilvl w:val="0"/>
+          <w:numId w:val="10"/>
+        </w:numPr>
+        <w:suppressLineNumbers w:val="0"/>
+        <w:spacing w:before="0" w:beforeAutospacing="1" w:after="0" w:afterAutospacing="1"/>
+        <w:ind w:left="720" w:hanging="360"/>
+      </w:pPr>
+      <w:r>
+        <w:rPr>
+          <w:rStyle w:val="8"/>
+        </w:rPr>
+        <w:t>demo/recallie-kid-demo.html</w:t>
+      </w:r>
+      <w:r>
+        <w:t xml:space="preserve"> — standalone, no-build HTML mockup of the child practice flow (real Week 1 sample questions, confetti, mascot, streak/points) used to preview the UX quickly. Not wired to the API/database — a static demo only.</w:t>
+      </w:r>
+    </w:p>
+    <w:p>
+      <w:pPr>
+        <w:keepNext w:val="0"/>
+        <w:keepLines w:val="0"/>
+        <w:widowControl/>
+        <w:numPr>
+          <w:ilvl w:val="0"/>
+          <w:numId w:val="10"/>
+        </w:numPr>
+        <w:suppressLineNumbers w:val="0"/>
+        <w:spacing w:before="0" w:beforeAutospacing="1" w:after="0" w:afterAutospacing="1"/>
+        <w:ind w:left="720" w:hanging="360"/>
+      </w:pPr>
+      <w:r>
+        <w:rPr>
+          <w:rStyle w:val="8"/>
+        </w:rPr>
+        <w:t>src/db/client.ts</w:t>
+      </w:r>
+      <w:r>
+        <w:t xml:space="preserve"> auto-detects local vs. managed Postgres (Neon/Supabase/RDS) and enables SSL accordingly — no manual config needed either way.</w:t>
+      </w:r>
+    </w:p>
+    <w:p>
+      <w:pPr>
+        <w:pStyle w:val="3"/>
+        <w:keepNext w:val="0"/>
+        <w:keepLines w:val="0"/>
+        <w:widowControl/>
+        <w:suppressLineNumbers w:val="0"/>
+      </w:pPr>
+      <w:r>
+        <w:t>Key decision: Prisma → Drizzle</w:t>
+      </w:r>
+    </w:p>
+    <w:p>
+      <w:pPr>
+        <w:pStyle w:val="10"/>
+        <w:keepNext w:val="0"/>
+        <w:keepLines w:val="0"/>
+        <w:widowControl/>
+        <w:suppressLineNumbers w:val="0"/>
+      </w:pPr>
+      <w:r>
+        <w:t xml:space="preserve">The sandbox environment could not reach </w:t>
+      </w:r>
+      <w:r>
+        <w:rPr>
+          <w:rStyle w:val="8"/>
+        </w:rPr>
+        <w:t>binaries.prisma.sh</w:t>
+      </w:r>
+      <w:r>
+        <w:t xml:space="preserve"> (network allowlist covers npm registry only), so </w:t>
+      </w:r>
+      <w:r>
+        <w:rPr>
+          <w:rStyle w:val="8"/>
+        </w:rPr>
+        <w:t>prisma init</w:t>
+      </w:r>
+      <w:r>
+        <w:t>/</w:t>
+      </w:r>
+      <w:r>
+        <w:rPr>
+          <w:rStyle w:val="8"/>
+        </w:rPr>
+        <w:t>migrate</w:t>
+      </w:r>
+      <w:r>
+        <w:t xml:space="preserve"> failed outright. Swapped to Drizzle ORM — same schema, same Postgres, no functional loss, and Drizzle was already named as an acceptable alternative in the project's own docs. If a future environment </w:t>
+      </w:r>
+      <w:r>
+        <w:rPr>
+          <w:rStyle w:val="7"/>
+        </w:rPr>
+        <w:t>can</w:t>
+      </w:r>
+      <w:r>
+        <w:t xml:space="preserve"> reach Prisma's binaries and the team prefers Prisma, </w:t>
+      </w:r>
+      <w:r>
+        <w:rPr>
+          <w:rStyle w:val="8"/>
+        </w:rPr>
+        <w:t>src/db/schema.ts</w:t>
+      </w:r>
+      <w:r>
+        <w:t xml:space="preserve"> is a straightforward translation back (it mirrors the documented Prisma models field-for-field).</w:t>
+      </w:r>
+    </w:p>
+    <w:p>
+      <w:pPr>
+        <w:pStyle w:val="3"/>
+        <w:keepNext w:val="0"/>
+        <w:keepLines w:val="0"/>
+        <w:widowControl/>
+        <w:suppressLineNumbers w:val="0"/>
+      </w:pPr>
+      <w:r>
+        <w:t>Item bank expansion</w:t>
+      </w:r>
+    </w:p>
+    <w:p>
+      <w:pPr>
+        <w:pStyle w:val="10"/>
+        <w:keepNext w:val="0"/>
+        <w:keepLines w:val="0"/>
+        <w:widowControl/>
+        <w:suppressLineNumbers w:val="0"/>
+      </w:pPr>
+      <w:r>
+        <w:t xml:space="preserve">Generated 54 new practice items for the 5 Week 1 skills (M3N01, M3M01, E3LY03, E3LA04, E3LY09) following the project's own Maths/English item-generation prompt templates — </w:t>
+      </w:r>
+      <w:r>
+        <w:rPr>
+          <w:rStyle w:val="8"/>
+        </w:rPr>
+        <w:t>src/db/seed/week1-item-bank.json</w:t>
+      </w:r>
+      <w:r>
+        <w:t xml:space="preserve">. Each item has answer key, 3–6 step step-by-step solution, 2–3 common misconceptions, 2 scaffolded hints, difficulty, and tags, in Australian English, growth-oriented language. </w:t>
+      </w:r>
+      <w:r>
+        <w:rPr>
+          <w:rStyle w:val="11"/>
+        </w:rPr>
+        <w:t>Not yet human-reviewed</w:t>
+      </w:r>
+      <w:r>
+        <w:t xml:space="preserve"> — flagged as pending review in the file's own </w:t>
+      </w:r>
+      <w:r>
+        <w:rPr>
+          <w:rStyle w:val="8"/>
+        </w:rPr>
+        <w:t>_note</w:t>
+      </w:r>
+      <w:r>
+        <w:t xml:space="preserve"> field and in the README.</w:t>
+      </w:r>
+    </w:p>
+    <w:p>
+      <w:pPr>
+        <w:pStyle w:val="10"/>
+        <w:keepNext w:val="0"/>
+        <w:keepLines w:val="0"/>
+        <w:widowControl/>
+        <w:suppressLineNumbers w:val="0"/>
+      </w:pPr>
+      <w:r>
+        <w:t xml:space="preserve">Grading-compatibility decisions: explanatory items keep </w:t>
+      </w:r>
+      <w:r>
+        <w:rPr>
+          <w:rStyle w:val="8"/>
+        </w:rPr>
+        <w:t>answerKey</w:t>
+      </w:r>
+      <w:r>
+        <w:t xml:space="preserve"> to the core factual answer only (reasoning moved to </w:t>
+      </w:r>
+      <w:r>
+        <w:rPr>
+          <w:rStyle w:val="8"/>
+        </w:rPr>
+        <w:t>stepByStepSolution</w:t>
+      </w:r>
+      <w:r>
+        <w:t xml:space="preserve">); a few items use array-valued </w:t>
+      </w:r>
+      <w:r>
+        <w:rPr>
+          <w:rStyle w:val="8"/>
+        </w:rPr>
+        <w:t>answerKey</w:t>
+      </w:r>
+      <w:r>
+        <w:t xml:space="preserve"> for accepted variant phrasings; 4 </w:t>
+      </w:r>
+      <w:r>
+        <w:rPr>
+          <w:rStyle w:val="8"/>
+        </w:rPr>
+        <w:t>multi_part</w:t>
+      </w:r>
+      <w:r>
+        <w:t xml:space="preserve"> items have object-valued answer keys (not gradable yet); 2 items are genuinely open-ended creative writing (</w:t>
+      </w:r>
+      <w:r>
+        <w:rPr>
+          <w:rStyle w:val="8"/>
+        </w:rPr>
+        <w:t>answerKey: "open response"</w:t>
+      </w:r>
+      <w:r>
+        <w:t xml:space="preserve">). </w:t>
+      </w:r>
+      <w:r>
+        <w:rPr>
+          <w:rStyle w:val="8"/>
+        </w:rPr>
+        <w:t>sessionBuilder.ts</w:t>
+      </w:r>
+      <w:r>
+        <w:t xml:space="preserve"> excludes </w:t>
+      </w:r>
+      <w:r>
+        <w:rPr>
+          <w:rStyle w:val="8"/>
+        </w:rPr>
+        <w:t>multi_part</w:t>
+      </w:r>
+      <w:r>
+        <w:t>/</w:t>
+      </w:r>
+      <w:r>
+        <w:rPr>
+          <w:rStyle w:val="8"/>
+        </w:rPr>
+        <w:t>open_response</w:t>
+      </w:r>
+      <w:r>
+        <w:t xml:space="preserve"> from live sessions so only auto-gradable items reach children.</w:t>
+      </w:r>
+    </w:p>
+    <w:p>
+      <w:pPr>
+        <w:pStyle w:val="3"/>
+        <w:keepNext w:val="0"/>
+        <w:keepLines w:val="0"/>
+        <w:widowControl/>
+        <w:suppressLineNumbers w:val="0"/>
+      </w:pPr>
+      <w:r>
+        <w:t>Parent onboarding + real curriculum-week derivation</w:t>
+      </w:r>
+    </w:p>
+    <w:p>
+      <w:pPr>
+        <w:keepNext w:val="0"/>
+        <w:keepLines w:val="0"/>
+        <w:widowControl/>
+        <w:numPr>
+          <w:ilvl w:val="0"/>
+          <w:numId w:val="11"/>
+        </w:numPr>
+        <w:suppressLineNumbers w:val="0"/>
+        <w:spacing w:before="0" w:beforeAutospacing="1" w:after="0" w:afterAutospacing="1"/>
+        <w:ind w:left="720" w:hanging="360"/>
+      </w:pPr>
+      <w:r>
+        <w:rPr>
+          <w:rStyle w:val="11"/>
+        </w:rPr>
+        <w:t>Parent onboarding</w:t>
+      </w:r>
+      <w:r>
+        <w:t xml:space="preserve"> (</w:t>
+      </w:r>
+      <w:r>
+        <w:rPr>
+          <w:rStyle w:val="8"/>
+        </w:rPr>
+        <w:t>/parent/children</w:t>
+      </w:r>
+      <w:r>
+        <w:t xml:space="preserve">, </w:t>
+      </w:r>
+      <w:r>
+        <w:rPr>
+          <w:rStyle w:val="8"/>
+        </w:rPr>
+        <w:t>GET</w:t>
+      </w:r>
+      <w:r>
+        <w:t>/</w:t>
+      </w:r>
+      <w:r>
+        <w:rPr>
+          <w:rStyle w:val="8"/>
+        </w:rPr>
+        <w:t>POST /api/children</w:t>
+      </w:r>
+      <w:r>
+        <w:t xml:space="preserve">): parents can add multiple children (name, year level, state) instead of every page hard-coding </w:t>
+      </w:r>
+      <w:r>
+        <w:rPr>
+          <w:rStyle w:val="8"/>
+        </w:rPr>
+        <w:t>demo_child_1</w:t>
+      </w:r>
+      <w:r>
+        <w:t xml:space="preserve">. </w:t>
+      </w:r>
+      <w:r>
+        <w:rPr>
+          <w:rStyle w:val="8"/>
+        </w:rPr>
+        <w:t>/child</w:t>
+      </w:r>
+      <w:r>
+        <w:t xml:space="preserve"> and </w:t>
+      </w:r>
+      <w:r>
+        <w:rPr>
+          <w:rStyle w:val="8"/>
+        </w:rPr>
+        <w:t>/parent/dashboard</w:t>
+      </w:r>
+      <w:r>
+        <w:t xml:space="preserve"> read </w:t>
+      </w:r>
+      <w:r>
+        <w:rPr>
+          <w:rStyle w:val="8"/>
+        </w:rPr>
+        <w:t>?childId=</w:t>
+      </w:r>
+      <w:r>
+        <w:t xml:space="preserve"> from the URL, falling back to the demo child if absent. Still no real auth — every call runs as one hard-coded demo parent (</w:t>
+      </w:r>
+      <w:r>
+        <w:rPr>
+          <w:rStyle w:val="8"/>
+        </w:rPr>
+        <w:t>demo_parent_1</w:t>
+      </w:r>
+      <w:r>
+        <w:t xml:space="preserve">); adding Clerk later means swapping that id for the authenticated user's id. Adding a child outside Year 3 succeeds but returns </w:t>
+      </w:r>
+      <w:r>
+        <w:rPr>
+          <w:rStyle w:val="8"/>
+        </w:rPr>
+        <w:t>hasContent: false</w:t>
+      </w:r>
+      <w:r>
+        <w:t xml:space="preserve"> and the UI shows a "coming soon" note.</w:t>
+      </w:r>
+    </w:p>
+    <w:p>
+      <w:pPr>
+        <w:keepNext w:val="0"/>
+        <w:keepLines w:val="0"/>
+        <w:widowControl/>
+        <w:numPr>
+          <w:ilvl w:val="0"/>
+          <w:numId w:val="11"/>
+        </w:numPr>
+        <w:suppressLineNumbers w:val="0"/>
+        <w:spacing w:before="0" w:beforeAutospacing="1" w:after="0" w:afterAutospacing="1"/>
+        <w:ind w:left="720" w:hanging="360"/>
+      </w:pPr>
+      <w:r>
+        <w:rPr>
+          <w:rStyle w:val="11"/>
+        </w:rPr>
+        <w:t>Curriculum week derivation</w:t>
+      </w:r>
+      <w:r>
+        <w:t xml:space="preserve"> (</w:t>
+      </w:r>
+      <w:r>
+        <w:rPr>
+          <w:rStyle w:val="8"/>
+        </w:rPr>
+        <w:t>src/lib/curriculumWeek.ts</w:t>
+      </w:r>
+      <w:r>
+        <w:t xml:space="preserve">): </w:t>
+      </w:r>
+      <w:r>
+        <w:rPr>
+          <w:rStyle w:val="8"/>
+        </w:rPr>
+        <w:t>User.enrolledAt</w:t>
+      </w:r>
+      <w:r>
+        <w:t xml:space="preserve"> column (migration </w:t>
+      </w:r>
+      <w:r>
+        <w:rPr>
+          <w:rStyle w:val="8"/>
+        </w:rPr>
+        <w:t>0001_add_enrolled_at.sql</w:t>
+      </w:r>
+      <w:r>
+        <w:t xml:space="preserve">) + </w:t>
+      </w:r>
+      <w:r>
+        <w:rPr>
+          <w:rStyle w:val="8"/>
+        </w:rPr>
+        <w:t>computeCurrentTermWeek(enrolledAt, now)</w:t>
+      </w:r>
+      <w:r>
+        <w:t xml:space="preserve"> (10-week terms), replacing the old </w:t>
+      </w:r>
+      <w:r>
+        <w:rPr>
+          <w:rStyle w:val="8"/>
+        </w:rPr>
+        <w:t>term: 1, week: 1</w:t>
+      </w:r>
+      <w:r>
+        <w:t xml:space="preserve"> hard-code. Clamped to term 1 / week 1 for now — verified via a manual test that removing the clamp caused an empty session for a backdated-enrolment test child (their computed week had no curriculum content); the clamp fixes that. Raising </w:t>
+      </w:r>
+      <w:r>
+        <w:rPr>
+          <w:rStyle w:val="8"/>
+        </w:rPr>
+        <w:t>MAX_AVAILABLE_TERM</w:t>
+      </w:r>
+      <w:r>
+        <w:t>/</w:t>
+      </w:r>
+      <w:r>
+        <w:rPr>
+          <w:rStyle w:val="8"/>
+        </w:rPr>
+        <w:t>MAX_AVAILABLE_WEEK</w:t>
+      </w:r>
+      <w:r>
+        <w:t xml:space="preserve"> is the only change needed once more weeks of content exist.</w:t>
+      </w:r>
+    </w:p>
+    <w:p>
+      <w:pPr>
+        <w:pStyle w:val="3"/>
+        <w:keepNext w:val="0"/>
+        <w:keepLines w:val="0"/>
+        <w:widowControl/>
+        <w:suppressLineNumbers w:val="0"/>
+      </w:pPr>
+      <w:r>
+        <w:t>Gamification (points, streak, badges)</w:t>
+      </w:r>
+    </w:p>
+    <w:p>
+      <w:pPr>
+        <w:pStyle w:val="10"/>
+        <w:keepNext w:val="0"/>
+        <w:keepLines w:val="0"/>
+        <w:widowControl/>
+        <w:suppressLineNumbers w:val="0"/>
+      </w:pPr>
+      <w:r>
+        <w:rPr>
+          <w:rStyle w:val="8"/>
+        </w:rPr>
+        <w:t>src/lib/gamification.ts</w:t>
+      </w:r>
+      <w:r>
+        <w:t xml:space="preserve"> computes everything from existing data rather than introducing new mutable state:</w:t>
+      </w:r>
+    </w:p>
+    <w:p>
+      <w:pPr>
+        <w:keepNext w:val="0"/>
+        <w:keepLines w:val="0"/>
+        <w:widowControl/>
+        <w:numPr>
+          <w:ilvl w:val="0"/>
+          <w:numId w:val="12"/>
+        </w:numPr>
+        <w:suppressLineNumbers w:val="0"/>
+        <w:spacing w:before="0" w:beforeAutospacing="1" w:after="0" w:afterAutospacing="1"/>
+        <w:ind w:left="720" w:hanging="360"/>
+      </w:pPr>
+      <w:r>
+        <w:rPr>
+          <w:rStyle w:val="11"/>
+        </w:rPr>
+        <w:t>Points</w:t>
+      </w:r>
+      <w:r>
+        <w:t xml:space="preserve">: derived from </w:t>
+      </w:r>
+      <w:r>
+        <w:rPr>
+          <w:rStyle w:val="8"/>
+        </w:rPr>
+        <w:t>ReviewEvent</w:t>
+      </w:r>
+      <w:r>
+        <w:t xml:space="preserve"> (10 pts correct, 5 if a hint was used, 0 incorrect) — </w:t>
+      </w:r>
+      <w:r>
+        <w:rPr>
+          <w:rStyle w:val="8"/>
+        </w:rPr>
+        <w:t>POST /api/reviews</w:t>
+      </w:r>
+      <w:r>
+        <w:t xml:space="preserve"> now returns the authoritative </w:t>
+      </w:r>
+      <w:r>
+        <w:rPr>
+          <w:rStyle w:val="8"/>
+        </w:rPr>
+        <w:t>pointsEarned</w:t>
+      </w:r>
+      <w:r>
+        <w:t xml:space="preserve"> per answer instead of the child page guessing client-side.</w:t>
+      </w:r>
+    </w:p>
+    <w:p>
+      <w:pPr>
+        <w:keepNext w:val="0"/>
+        <w:keepLines w:val="0"/>
+        <w:widowControl/>
+        <w:numPr>
+          <w:ilvl w:val="0"/>
+          <w:numId w:val="12"/>
+        </w:numPr>
+        <w:suppressLineNumbers w:val="0"/>
+        <w:spacing w:before="0" w:beforeAutospacing="1" w:after="0" w:afterAutospacing="1"/>
+        <w:ind w:left="720" w:hanging="360"/>
+      </w:pPr>
+      <w:r>
+        <w:rPr>
+          <w:rStyle w:val="11"/>
+        </w:rPr>
+        <w:t>Daily streak</w:t>
+      </w:r>
+      <w:r>
+        <w:t xml:space="preserve">: consecutive calendar days with at least one </w:t>
+      </w:r>
+      <w:r>
+        <w:rPr>
+          <w:rStyle w:val="8"/>
+        </w:rPr>
+        <w:t>ReviewEvent</w:t>
+      </w:r>
+      <w:r>
+        <w:t>, staying "alive" through today even before the child has practised yet (only breaks after a full missed day).</w:t>
+      </w:r>
+    </w:p>
+    <w:p>
+      <w:pPr>
+        <w:keepNext w:val="0"/>
+        <w:keepLines w:val="0"/>
+        <w:widowControl/>
+        <w:numPr>
+          <w:ilvl w:val="0"/>
+          <w:numId w:val="12"/>
+        </w:numPr>
+        <w:suppressLineNumbers w:val="0"/>
+        <w:spacing w:before="0" w:beforeAutospacing="1" w:after="0" w:afterAutospacing="1"/>
+        <w:ind w:left="720" w:hanging="360"/>
+      </w:pPr>
+      <w:r>
+        <w:rPr>
+          <w:rStyle w:val="11"/>
+        </w:rPr>
+        <w:t>Badges</w:t>
+      </w:r>
+      <w:r>
+        <w:t xml:space="preserve"> (7, all pure functions over the same derived stats — no earned-badge table): First Steps, Mission Complete, 3-/7-Day Streak, Number Ninja (25 Maths correct), Word Wizard (25 English correct), Century Club (100 correct total).</w:t>
+      </w:r>
+    </w:p>
+    <w:p>
+      <w:pPr>
+        <w:keepNext w:val="0"/>
+        <w:keepLines w:val="0"/>
+        <w:widowControl/>
+        <w:numPr>
+          <w:ilvl w:val="0"/>
+          <w:numId w:val="12"/>
+        </w:numPr>
+        <w:suppressLineNumbers w:val="0"/>
+        <w:spacing w:before="0" w:beforeAutospacing="1" w:after="0" w:afterAutospacing="1"/>
+        <w:ind w:left="720" w:hanging="360"/>
+      </w:pPr>
+      <w:r>
+        <w:rPr>
+          <w:rStyle w:val="8"/>
+        </w:rPr>
+        <w:t>GET /api/gamification?childId=</w:t>
+      </w:r>
+      <w:r>
+        <w:t xml:space="preserve"> exposes all of this; embedded in </w:t>
+      </w:r>
+      <w:r>
+        <w:rPr>
+          <w:rStyle w:val="8"/>
+        </w:rPr>
+        <w:t>/api/dashboard</w:t>
+      </w:r>
+      <w:r>
+        <w:t xml:space="preserve"> too.</w:t>
+      </w:r>
+    </w:p>
+    <w:p>
+      <w:pPr>
+        <w:keepNext w:val="0"/>
+        <w:keepLines w:val="0"/>
+        <w:widowControl/>
+        <w:numPr>
+          <w:ilvl w:val="0"/>
+          <w:numId w:val="12"/>
+        </w:numPr>
+        <w:suppressLineNumbers w:val="0"/>
+        <w:spacing w:before="0" w:beforeAutospacing="1" w:after="0" w:afterAutospacing="1"/>
+        <w:ind w:left="720" w:hanging="360"/>
+      </w:pPr>
+      <w:r>
+        <w:t>Parent dashboard shows a stats header (points/streak/badge count) + full badge shelf (locked badges shown greyed-out with their unlock condition as a teaser).</w:t>
+      </w:r>
+    </w:p>
+    <w:p>
+      <w:pPr>
+        <w:keepNext w:val="0"/>
+        <w:keepLines w:val="0"/>
+        <w:widowControl/>
+        <w:numPr>
+          <w:ilvl w:val="0"/>
+          <w:numId w:val="12"/>
+        </w:numPr>
+        <w:suppressLineNumbers w:val="0"/>
+        <w:spacing w:before="0" w:beforeAutospacing="1" w:after="0" w:afterAutospacing="1"/>
+        <w:ind w:left="720" w:hanging="360"/>
+      </w:pPr>
+      <w:r>
+        <w:t>Child page shows both today's session tally (unchanged UX) and lifetime totals, plus a dismissible "New badge unlocked!" banner detected by diffing badge state after each answer.</w:t>
+      </w:r>
+    </w:p>
+    <w:p>
+      <w:pPr>
+        <w:pStyle w:val="4"/>
+        <w:keepNext w:val="0"/>
+        <w:keepLines w:val="0"/>
+        <w:widowControl/>
+        <w:suppressLineNumbers w:val="0"/>
+      </w:pPr>
+      <w:r>
+        <w:t>Two bugs found and fixed while testing this end-to-end</w:t>
+      </w:r>
+    </w:p>
+    <w:p>
+      <w:pPr>
+        <w:keepNext w:val="0"/>
+        <w:keepLines w:val="0"/>
+        <w:widowControl/>
+        <w:numPr>
+          <w:ilvl w:val="0"/>
+          <w:numId w:val="13"/>
+        </w:numPr>
+        <w:suppressLineNumbers w:val="0"/>
+        <w:spacing w:before="0" w:beforeAutospacing="1" w:after="0" w:afterAutospacing="1"/>
+        <w:ind w:left="720" w:hanging="360"/>
+      </w:pPr>
+      <w:r>
+        <w:rPr>
+          <w:rStyle w:val="8"/>
+        </w:rPr>
+        <w:t>GET /api/session/today</w:t>
+      </w:r>
+      <w:r>
+        <w:t xml:space="preserve">'s "already built today" (reused) path only ever returned </w:t>
+      </w:r>
+      <w:r>
+        <w:rPr>
+          <w:rStyle w:val="8"/>
+        </w:rPr>
+        <w:t>plannedItemIds</w:t>
+      </w:r>
+      <w:r>
+        <w:t>, never actual question content — reloading mid-day (or visiting again later the same day) showed "no items available" even with items left to answer. Fixed by hydrating full item details for the remaining, not-yet-completed items on that path.</w:t>
+      </w:r>
+    </w:p>
+    <w:p>
+      <w:pPr>
+        <w:keepNext w:val="0"/>
+        <w:keepLines w:val="0"/>
+        <w:widowControl/>
+        <w:numPr>
+          <w:ilvl w:val="0"/>
+          <w:numId w:val="13"/>
+        </w:numPr>
+        <w:suppressLineNumbers w:val="0"/>
+        <w:spacing w:before="0" w:beforeAutospacing="1" w:after="0" w:afterAutospacing="1"/>
+        <w:ind w:left="720" w:hanging="360"/>
+      </w:pPr>
+      <w:r>
+        <w:rPr>
+          <w:rStyle w:val="8"/>
+        </w:rPr>
+        <w:t>POST /api/reviews</w:t>
+      </w:r>
+      <w:r>
+        <w:t xml:space="preserve"> matched "today's session" by child + date only (no subject filter) — on a day with both a Maths and English session, an answer could mark the </w:t>
+      </w:r>
+      <w:r>
+        <w:rPr>
+          <w:rStyle w:val="7"/>
+        </w:rPr>
+        <w:t>wrong</w:t>
+      </w:r>
+      <w:r>
+        <w:t xml:space="preserve"> subject's session complete. Fixed by matching on which session actually planned that item. Confirmed fixed with a scripted repro (create child → build both sessions → answer one English item → verify Maths session's </w:t>
+      </w:r>
+      <w:r>
+        <w:rPr>
+          <w:rStyle w:val="8"/>
+        </w:rPr>
+        <w:t>completedItemIds</w:t>
+      </w:r>
+      <w:r>
+        <w:t xml:space="preserve"> stays empty).</w:t>
+      </w:r>
+    </w:p>
+    <w:p>
+      <w:pPr>
+        <w:pStyle w:val="10"/>
+        <w:keepNext w:val="0"/>
+        <w:keepLines w:val="0"/>
+        <w:widowControl/>
+        <w:suppressLineNumbers w:val="0"/>
+      </w:pPr>
+      <w:r>
+        <w:t>Both were caught by testing the real multi-subject, multi-reload flow rather than a single happy-path run — worth remembering as a testing habit for future sessions on this app.</w:t>
+      </w:r>
+    </w:p>
+    <w:p>
+      <w:pPr>
+        <w:pStyle w:val="10"/>
+        <w:keepNext w:val="0"/>
+        <w:keepLines w:val="0"/>
+        <w:widowControl/>
+        <w:suppressLineNumbers w:val="0"/>
+      </w:pPr>
+      <w:r>
+        <w:rPr>
+          <w:rStyle w:val="11"/>
+        </w:rPr>
+        <w:t>Delivered to Chandana as sequential git patches</w:t>
+      </w:r>
+      <w:r>
+        <w:t xml:space="preserve"> (</w:t>
+      </w:r>
+      <w:r>
+        <w:rPr>
+          <w:rStyle w:val="8"/>
+        </w:rPr>
+        <w:t>recallie-week1-items.patch</w:t>
+      </w:r>
+      <w:r>
+        <w:t xml:space="preserve"> → </w:t>
+      </w:r>
+      <w:r>
+        <w:rPr>
+          <w:rStyle w:val="8"/>
+        </w:rPr>
+        <w:t>recallie-parent-onboarding.patch</w:t>
+      </w:r>
+      <w:r>
+        <w:t xml:space="preserve"> → </w:t>
+      </w:r>
+      <w:r>
+        <w:rPr>
+          <w:rStyle w:val="8"/>
+        </w:rPr>
+        <w:t>recallie-gamification.patch</w:t>
+      </w:r>
+      <w:r>
+        <w:t xml:space="preserve">) rather than tarballs, since her local </w:t>
+      </w:r>
+      <w:r>
+        <w:rPr>
+          <w:rStyle w:val="8"/>
+        </w:rPr>
+        <w:t>C:\recallie-app</w:t>
+      </w:r>
+      <w:r>
+        <w:t xml:space="preserve"> copy tracks this repo via git. Apply in that order with </w:t>
+      </w:r>
+      <w:r>
+        <w:rPr>
+          <w:rStyle w:val="8"/>
+        </w:rPr>
+        <w:t>git apply &lt;file&gt;</w:t>
+      </w:r>
+      <w:r>
+        <w:t xml:space="preserve">, then </w:t>
+      </w:r>
+      <w:r>
+        <w:rPr>
+          <w:rStyle w:val="8"/>
+        </w:rPr>
+        <w:t>npm run db:migrate &amp;&amp; npm run db:seed:demo</w:t>
+      </w:r>
+      <w:r>
+        <w:t>, then commit/push herself — sandbox git still can't push directly to her GitHub repo (token scoping).</w:t>
+      </w:r>
+    </w:p>
+    <w:p>
+      <w:pPr>
+        <w:pStyle w:val="3"/>
+        <w:keepNext w:val="0"/>
+        <w:keepLines w:val="0"/>
+        <w:widowControl/>
+        <w:suppressLineNumbers w:val="0"/>
+      </w:pPr>
+      <w:r>
+        <w:t>Verified working (smoke-tested via curl/scripted-python + tsc + Playwright screenshots</w:t>
+      </w:r>
+    </w:p>
+    <w:p>
+      <w:pPr>
+        <w:pStyle w:val="10"/>
+        <w:keepNext w:val="0"/>
+        <w:keepLines w:val="0"/>
+        <w:widowControl/>
+        <w:suppressLineNumbers w:val="0"/>
+      </w:pPr>
+      <w:r>
+        <w:t>against the sandbox's local Postgres)</w:t>
+      </w:r>
+    </w:p>
+    <w:p>
+      <w:pPr>
+        <w:keepNext w:val="0"/>
+        <w:keepLines w:val="0"/>
+        <w:widowControl/>
+        <w:numPr>
+          <w:ilvl w:val="0"/>
+          <w:numId w:val="14"/>
+        </w:numPr>
+        <w:suppressLineNumbers w:val="0"/>
+        <w:spacing w:before="0" w:beforeAutospacing="1" w:after="0" w:afterAutospacing="1"/>
+        <w:ind w:left="720" w:hanging="360"/>
+      </w:pPr>
+      <w:r>
+        <w:rPr>
+          <w:rStyle w:val="8"/>
+        </w:rPr>
+        <w:t>npx tsc --noEmit</w:t>
+      </w:r>
+      <w:r>
+        <w:t xml:space="preserve"> clean after every change described above.</w:t>
+      </w:r>
+    </w:p>
+    <w:p>
+      <w:pPr>
+        <w:keepNext w:val="0"/>
+        <w:keepLines w:val="0"/>
+        <w:widowControl/>
+        <w:numPr>
+          <w:ilvl w:val="0"/>
+          <w:numId w:val="14"/>
+        </w:numPr>
+        <w:suppressLineNumbers w:val="0"/>
+        <w:spacing w:before="0" w:beforeAutospacing="1" w:after="0" w:afterAutospacing="1"/>
+        <w:ind w:left="720" w:hanging="360"/>
+      </w:pPr>
+      <w:r>
+        <w:t>Item bank, parent onboarding, and curriculum-week derivation verified as described in earlier entries (62 items seeded; new-child session correctly computes term 1/week 1; backdated-enrolment edge case confirmed then fixed).</w:t>
+      </w:r>
+    </w:p>
+    <w:p>
+      <w:pPr>
+        <w:keepNext w:val="0"/>
+        <w:keepLines w:val="0"/>
+        <w:widowControl/>
+        <w:numPr>
+          <w:ilvl w:val="0"/>
+          <w:numId w:val="14"/>
+        </w:numPr>
+        <w:suppressLineNumbers w:val="0"/>
+        <w:spacing w:before="0" w:beforeAutospacing="1" w:after="0" w:afterAutospacing="1"/>
+        <w:ind w:left="720" w:hanging="360"/>
+      </w:pPr>
+      <w:r>
+        <w:t xml:space="preserve">Gamification: verified points accrue correctly, </w:t>
+      </w:r>
+      <w:r>
+        <w:rPr>
+          <w:rStyle w:val="8"/>
+        </w:rPr>
+        <w:t>mission_complete</w:t>
+      </w:r>
+      <w:r>
+        <w:t xml:space="preserve"> badge flips on after completing all 8 planned items, streak counts 2 consecutive practice days correctly. Playwright screenshots of </w:t>
+      </w:r>
+      <w:r>
+        <w:rPr>
+          <w:rStyle w:val="8"/>
+        </w:rPr>
+        <w:t>/parent/dashboard</w:t>
+      </w:r>
+      <w:r>
+        <w:t xml:space="preserve"> (badge shelf, locked vs. earned) and </w:t>
+      </w:r>
+      <w:r>
+        <w:rPr>
+          <w:rStyle w:val="8"/>
+        </w:rPr>
+        <w:t>/child</w:t>
+      </w:r>
+      <w:r>
+        <w:t xml:space="preserve"> (already-completed-today state) confirm the UI renders as intended.</w:t>
+      </w:r>
+    </w:p>
+    <w:p>
+      <w:pPr>
+        <w:keepNext w:val="0"/>
+        <w:keepLines w:val="0"/>
+        <w:widowControl/>
+        <w:numPr>
+          <w:ilvl w:val="0"/>
+          <w:numId w:val="14"/>
+        </w:numPr>
+        <w:suppressLineNumbers w:val="0"/>
+        <w:spacing w:before="0" w:beforeAutospacing="1" w:after="0" w:afterAutospacing="1"/>
+        <w:ind w:left="720" w:hanging="360"/>
+      </w:pPr>
+      <w:r>
+        <w:t xml:space="preserve">Both session bugs reproduced with a scripted repro </w:t>
+      </w:r>
+      <w:r>
+        <w:rPr>
+          <w:rStyle w:val="7"/>
+        </w:rPr>
+        <w:t>before</w:t>
+      </w:r>
+      <w:r>
+        <w:t xml:space="preserve"> the fix (to confirm they were real) and re-verified fixed after.</w:t>
+      </w:r>
+    </w:p>
+    <w:p>
+      <w:pPr>
+        <w:keepNext w:val="0"/>
+        <w:keepLines w:val="0"/>
+        <w:widowControl/>
+        <w:numPr>
+          <w:ilvl w:val="0"/>
+          <w:numId w:val="14"/>
+        </w:numPr>
+        <w:suppressLineNumbers w:val="0"/>
+        <w:spacing w:before="0" w:beforeAutospacing="1" w:after="0" w:afterAutospacing="1"/>
+        <w:ind w:left="720" w:hanging="360"/>
+      </w:pPr>
+      <w:r>
+        <w:t>All commits made to the sandbox's local git (</w:t>
+      </w:r>
+      <w:r>
+        <w:rPr>
+          <w:rStyle w:val="8"/>
+        </w:rPr>
+        <w:t>ee4a1d6</w:t>
+      </w:r>
+      <w:r>
+        <w:t xml:space="preserve">, </w:t>
+      </w:r>
+      <w:r>
+        <w:rPr>
+          <w:rStyle w:val="8"/>
+        </w:rPr>
+        <w:t>7d7278d</w:t>
+      </w:r>
+      <w:r>
+        <w:t xml:space="preserve">, </w:t>
+      </w:r>
+      <w:r>
+        <w:rPr>
+          <w:rStyle w:val="8"/>
+        </w:rPr>
+        <w:t>c7f43e6</w:t>
+      </w:r>
+      <w:r>
+        <w:t>) and exported as patch files for Chandana to apply to her own tracked copy.</w:t>
+      </w:r>
+    </w:p>
+    <w:p>
+      <w:pPr>
+        <w:pStyle w:val="3"/>
+        <w:keepNext w:val="0"/>
+        <w:keepLines w:val="0"/>
+        <w:widowControl/>
+        <w:suppressLineNumbers w:val="0"/>
+      </w:pPr>
+      <w:r>
+        <w:t>Known issue to resolve with Chandana</w:t>
+      </w:r>
+    </w:p>
+    <w:p>
+      <w:pPr>
+        <w:pStyle w:val="10"/>
+        <w:keepNext w:val="0"/>
+        <w:keepLines w:val="0"/>
+        <w:widowControl/>
+        <w:suppressLineNumbers w:val="0"/>
+      </w:pPr>
+      <w:r>
+        <w:t xml:space="preserve">The "needs_attention" ("Area to give more attention") status triggers whenever </w:t>
+      </w:r>
+      <w:r>
+        <w:rPr>
+          <w:rStyle w:val="8"/>
+        </w:rPr>
+        <w:t>stability &lt;= 7 days</w:t>
+      </w:r>
+      <w:r>
+        <w:t>, which — per the documented thresholds — is true for essentially every skill during its first 1–2 weeks, even after several correct answers in a row (traced manually: 6 straight correct fast answers only reached stability ≈5.6). So new skills default to looking like they "need attention" until they mature past a week. This is a faithful port of the documented algorithm, not a bug introduced during the build — but it may read as discouraging to parents/children if shipped as-is. Options to discuss: raise thresholds, add a distinct "still building" status for skills younger than N days/reviews, or accept it.</w:t>
+      </w:r>
+    </w:p>
+    <w:p>
+      <w:pPr>
+        <w:pStyle w:val="3"/>
+        <w:keepNext w:val="0"/>
+        <w:keepLines w:val="0"/>
+        <w:widowControl/>
+        <w:suppressLineNumbers w:val="0"/>
+      </w:pPr>
+      <w:r>
+        <w:t>Explicit next steps (not yet built)</w:t>
+      </w:r>
+    </w:p>
+    <w:p>
+      <w:pPr>
+        <w:keepNext w:val="0"/>
+        <w:keepLines w:val="0"/>
+        <w:widowControl/>
+        <w:numPr>
+          <w:ilvl w:val="0"/>
+          <w:numId w:val="15"/>
+        </w:numPr>
+        <w:suppressLineNumbers w:val="0"/>
+        <w:spacing w:before="0" w:beforeAutospacing="1" w:after="0" w:afterAutospacing="1"/>
+        <w:ind w:left="720" w:hanging="360"/>
+      </w:pPr>
+      <w:r>
+        <w:t xml:space="preserve">Auth (Clerk) — every add-child/dashboard/session call still runs as one hard-coded demo parent/child; no login flow. Schema already has </w:t>
+      </w:r>
+      <w:r>
+        <w:rPr>
+          <w:rStyle w:val="8"/>
+        </w:rPr>
+        <w:t>clerkUserId</w:t>
+      </w:r>
+      <w:r>
+        <w:t xml:space="preserve"> ready for this.</w:t>
+      </w:r>
+    </w:p>
+    <w:p>
+      <w:pPr>
+        <w:keepNext w:val="0"/>
+        <w:keepLines w:val="0"/>
+        <w:widowControl/>
+        <w:numPr>
+          <w:ilvl w:val="0"/>
+          <w:numId w:val="15"/>
+        </w:numPr>
+        <w:suppressLineNumbers w:val="0"/>
+        <w:spacing w:before="0" w:beforeAutospacing="1" w:after="0" w:afterAutospacing="1"/>
+        <w:ind w:left="720" w:hanging="360"/>
+      </w:pPr>
+      <w:r>
+        <w:t>Human review of the 54 newly generated items before they're considered production content.</w:t>
+      </w:r>
+    </w:p>
+    <w:p>
+      <w:pPr>
+        <w:keepNext w:val="0"/>
+        <w:keepLines w:val="0"/>
+        <w:widowControl/>
+        <w:numPr>
+          <w:ilvl w:val="0"/>
+          <w:numId w:val="15"/>
+        </w:numPr>
+        <w:suppressLineNumbers w:val="0"/>
+        <w:spacing w:before="0" w:beforeAutospacing="1" w:after="0" w:afterAutospacing="1"/>
+        <w:ind w:left="720" w:hanging="360"/>
+      </w:pPr>
+      <w:r>
+        <w:t xml:space="preserve">More curriculum content — only Term 1 Week 1 has both sequence entries and items, for Year 3 only. Weeks 2–10, other terms, and other year levels still need generating; </w:t>
+      </w:r>
+      <w:r>
+        <w:rPr>
+          <w:rStyle w:val="8"/>
+        </w:rPr>
+        <w:t>curriculumWeek.ts</w:t>
+      </w:r>
+      <w:r>
+        <w:t xml:space="preserve"> is ready to roll forward automatically once they exist.</w:t>
+      </w:r>
+    </w:p>
+    <w:p>
+      <w:pPr>
+        <w:keepNext w:val="0"/>
+        <w:keepLines w:val="0"/>
+        <w:widowControl/>
+        <w:numPr>
+          <w:ilvl w:val="0"/>
+          <w:numId w:val="15"/>
+        </w:numPr>
+        <w:suppressLineNumbers w:val="0"/>
+        <w:spacing w:before="0" w:beforeAutospacing="1" w:after="0" w:afterAutospacing="1"/>
+        <w:ind w:left="720" w:hanging="360"/>
+      </w:pPr>
+      <w:r>
+        <w:t xml:space="preserve">Grading support for </w:t>
+      </w:r>
+      <w:r>
+        <w:rPr>
+          <w:rStyle w:val="8"/>
+        </w:rPr>
+        <w:t>multi_part</w:t>
+      </w:r>
+      <w:r>
+        <w:t xml:space="preserve"> (object-valued answers) and </w:t>
+      </w:r>
+      <w:r>
+        <w:rPr>
+          <w:rStyle w:val="8"/>
+        </w:rPr>
+        <w:t>open_response</w:t>
+      </w:r>
+      <w:r>
+        <w:t xml:space="preserve"> (rubric/teacher-review) items — currently generated but excluded from live sessions.</w:t>
+      </w:r>
+    </w:p>
+    <w:p>
+      <w:pPr>
+        <w:keepNext w:val="0"/>
+        <w:keepLines w:val="0"/>
+        <w:widowControl/>
+        <w:numPr>
+          <w:ilvl w:val="0"/>
+          <w:numId w:val="15"/>
+        </w:numPr>
+        <w:suppressLineNumbers w:val="0"/>
+        <w:spacing w:before="0" w:beforeAutospacing="1" w:after="0" w:afterAutospacing="1"/>
+        <w:ind w:left="720" w:hanging="360"/>
+      </w:pPr>
+      <w:r>
+        <w:t>Stripe subscriptions / free trial gating.</w:t>
+      </w:r>
+    </w:p>
+    <w:p>
+      <w:pPr>
+        <w:keepNext w:val="0"/>
+        <w:keepLines w:val="0"/>
+        <w:widowControl/>
+        <w:numPr>
+          <w:ilvl w:val="0"/>
+          <w:numId w:val="15"/>
+        </w:numPr>
+        <w:suppressLineNumbers w:val="0"/>
+        <w:spacing w:before="0" w:beforeAutospacing="1" w:after="0" w:afterAutospacing="1"/>
+        <w:ind w:left="720" w:hanging="360"/>
+      </w:pPr>
+      <w:r>
+        <w:t>A visual "progress map" (spatial/adventure-style) beyond the badge shelf; badges are only evaluated on-demand today (no proactive notification outside an active session).</w:t>
+      </w:r>
+    </w:p>
+    <w:p>
+      <w:pPr>
+        <w:keepNext w:val="0"/>
+        <w:keepLines w:val="0"/>
+        <w:widowControl/>
+        <w:numPr>
+          <w:ilvl w:val="0"/>
+          <w:numId w:val="15"/>
+        </w:numPr>
+        <w:suppressLineNumbers w:val="0"/>
+        <w:spacing w:before="0" w:beforeAutospacing="1" w:after="0" w:afterAutospacing="1"/>
+        <w:ind w:left="720" w:hanging="360"/>
+      </w:pPr>
+      <w:r>
+        <w:t>Monthly parent report generation/email.</w:t>
+      </w:r>
+    </w:p>
+    <w:p>
+      <w:pPr>
+        <w:keepNext w:val="0"/>
+        <w:keepLines w:val="0"/>
+        <w:widowControl/>
+        <w:numPr>
+          <w:ilvl w:val="0"/>
+          <w:numId w:val="15"/>
+        </w:numPr>
+        <w:suppressLineNumbers w:val="0"/>
+        <w:spacing w:before="0" w:beforeAutospacing="1" w:after="0" w:afterAutospacing="1"/>
+        <w:ind w:left="720" w:hanging="360"/>
+      </w:pPr>
+      <w:r>
+        <w:t xml:space="preserve">Chandana hasn't yet connected a cloud Postgres (Neon/Supabase) to her local </w:t>
+      </w:r>
+      <w:r>
+        <w:rPr>
+          <w:rStyle w:val="8"/>
+        </w:rPr>
+        <w:t>C:\recallie-app</w:t>
+      </w:r>
+      <w:r>
+        <w:t xml:space="preserve"> copy — </w:t>
+      </w:r>
+      <w:r>
+        <w:rPr>
+          <w:rStyle w:val="8"/>
+        </w:rPr>
+        <w:t>.env</w:t>
+      </w:r>
+      <w:r>
+        <w:t xml:space="preserve"> there still needs a real </w:t>
+      </w:r>
+      <w:r>
+        <w:rPr>
+          <w:rStyle w:val="8"/>
+        </w:rPr>
+        <w:t>DATABASE_URL</w:t>
+      </w:r>
+      <w:r>
+        <w:t xml:space="preserve"> before </w:t>
+      </w:r>
+      <w:r>
+        <w:rPr>
+          <w:rStyle w:val="8"/>
+        </w:rPr>
+        <w:t>npm run dev</w:t>
+      </w:r>
+      <w:r>
+        <w:t xml:space="preserve"> will work locally (she is currently developing against local Postgres, which is fine for now).</w:t>
+      </w:r>
+    </w:p>
+    <w:p>
+      <w:pPr>
+        <w:rPr>
+          <w:rFonts w:hint="default" w:ascii="Calibri" w:hAnsi="Calibri" w:cs="Calibri"/>
+        </w:rPr>
+      </w:pPr>
+      <w:bookmarkStart w:id="0" w:name="_GoBack"/>
+      <w:bookmarkEnd w:id="0"/>
     </w:p>
     <w:sectPr>
       <w:pgSz w:w="11906" w:h="16838"/>
@@ -4941,6 +6646,304 @@
     </w:lvl>
   </w:abstractNum>
   <w:abstractNum w:abstractNumId="1">
+    <w:nsid w:val="BAC90D13"/>
+    <w:multiLevelType w:val="multilevel"/>
+    <w:tmpl w:val="BAC90D13"/>
+    <w:lvl w:ilvl="0" w:tentative="0">
+      <w:start w:val="1"/>
+      <w:numFmt w:val="bullet"/>
+      <w:lvlText w:val=""/>
+      <w:lvlJc w:val="left"/>
+      <w:pPr>
+        <w:tabs>
+          <w:tab w:val="left" w:pos="720"/>
+        </w:tabs>
+        <w:ind w:left="720" w:hanging="360"/>
+      </w:pPr>
+      <w:rPr>
+        <w:rFonts w:hint="default" w:ascii="Symbol" w:hAnsi="Symbol" w:cs="Symbol"/>
+        <w:sz w:val="20"/>
+      </w:rPr>
+    </w:lvl>
+    <w:lvl w:ilvl="1" w:tentative="0">
+      <w:start w:val="1"/>
+      <w:numFmt w:val="bullet"/>
+      <w:lvlText w:val="o"/>
+      <w:lvlJc w:val="left"/>
+      <w:pPr>
+        <w:tabs>
+          <w:tab w:val="left" w:pos="1440"/>
+        </w:tabs>
+        <w:ind w:left="1440" w:hanging="360"/>
+      </w:pPr>
+      <w:rPr>
+        <w:rFonts w:hint="default" w:ascii="Courier New" w:hAnsi="Courier New" w:cs="Courier New"/>
+        <w:sz w:val="20"/>
+      </w:rPr>
+    </w:lvl>
+    <w:lvl w:ilvl="2" w:tentative="0">
+      <w:start w:val="1"/>
+      <w:numFmt w:val="bullet"/>
+      <w:lvlText w:val=""/>
+      <w:lvlJc w:val="left"/>
+      <w:pPr>
+        <w:tabs>
+          <w:tab w:val="left" w:pos="2160"/>
+        </w:tabs>
+        <w:ind w:left="2160" w:hanging="360"/>
+      </w:pPr>
+      <w:rPr>
+        <w:rFonts w:hint="default" w:ascii="Wingdings" w:hAnsi="Wingdings" w:cs="Wingdings"/>
+        <w:sz w:val="20"/>
+      </w:rPr>
+    </w:lvl>
+    <w:lvl w:ilvl="3" w:tentative="0">
+      <w:start w:val="1"/>
+      <w:numFmt w:val="bullet"/>
+      <w:lvlText w:val=""/>
+      <w:lvlJc w:val="left"/>
+      <w:pPr>
+        <w:tabs>
+          <w:tab w:val="left" w:pos="2880"/>
+        </w:tabs>
+        <w:ind w:left="2880" w:hanging="360"/>
+      </w:pPr>
+      <w:rPr>
+        <w:rFonts w:hint="default" w:ascii="Wingdings" w:hAnsi="Wingdings" w:cs="Wingdings"/>
+        <w:sz w:val="20"/>
+      </w:rPr>
+    </w:lvl>
+    <w:lvl w:ilvl="4" w:tentative="0">
+      <w:start w:val="1"/>
+      <w:numFmt w:val="bullet"/>
+      <w:lvlText w:val=""/>
+      <w:lvlJc w:val="left"/>
+      <w:pPr>
+        <w:tabs>
+          <w:tab w:val="left" w:pos="3600"/>
+        </w:tabs>
+        <w:ind w:left="3600" w:hanging="360"/>
+      </w:pPr>
+      <w:rPr>
+        <w:rFonts w:hint="default" w:ascii="Wingdings" w:hAnsi="Wingdings" w:cs="Wingdings"/>
+        <w:sz w:val="20"/>
+      </w:rPr>
+    </w:lvl>
+    <w:lvl w:ilvl="5" w:tentative="0">
+      <w:start w:val="1"/>
+      <w:numFmt w:val="bullet"/>
+      <w:lvlText w:val=""/>
+      <w:lvlJc w:val="left"/>
+      <w:pPr>
+        <w:tabs>
+          <w:tab w:val="left" w:pos="4320"/>
+        </w:tabs>
+        <w:ind w:left="4320" w:hanging="360"/>
+      </w:pPr>
+      <w:rPr>
+        <w:rFonts w:hint="default" w:ascii="Wingdings" w:hAnsi="Wingdings" w:cs="Wingdings"/>
+        <w:sz w:val="20"/>
+      </w:rPr>
+    </w:lvl>
+    <w:lvl w:ilvl="6" w:tentative="0">
+      <w:start w:val="1"/>
+      <w:numFmt w:val="bullet"/>
+      <w:lvlText w:val=""/>
+      <w:lvlJc w:val="left"/>
+      <w:pPr>
+        <w:tabs>
+          <w:tab w:val="left" w:pos="5040"/>
+        </w:tabs>
+        <w:ind w:left="5040" w:hanging="360"/>
+      </w:pPr>
+      <w:rPr>
+        <w:rFonts w:hint="default" w:ascii="Wingdings" w:hAnsi="Wingdings" w:cs="Wingdings"/>
+        <w:sz w:val="20"/>
+      </w:rPr>
+    </w:lvl>
+    <w:lvl w:ilvl="7" w:tentative="0">
+      <w:start w:val="1"/>
+      <w:numFmt w:val="bullet"/>
+      <w:lvlText w:val=""/>
+      <w:lvlJc w:val="left"/>
+      <w:pPr>
+        <w:tabs>
+          <w:tab w:val="left" w:pos="5760"/>
+        </w:tabs>
+        <w:ind w:left="5760" w:hanging="360"/>
+      </w:pPr>
+      <w:rPr>
+        <w:rFonts w:hint="default" w:ascii="Wingdings" w:hAnsi="Wingdings" w:cs="Wingdings"/>
+        <w:sz w:val="20"/>
+      </w:rPr>
+    </w:lvl>
+    <w:lvl w:ilvl="8" w:tentative="0">
+      <w:start w:val="1"/>
+      <w:numFmt w:val="bullet"/>
+      <w:lvlText w:val=""/>
+      <w:lvlJc w:val="left"/>
+      <w:pPr>
+        <w:tabs>
+          <w:tab w:val="left" w:pos="6480"/>
+        </w:tabs>
+        <w:ind w:left="6480" w:hanging="360"/>
+      </w:pPr>
+      <w:rPr>
+        <w:rFonts w:hint="default" w:ascii="Wingdings" w:hAnsi="Wingdings" w:cs="Wingdings"/>
+        <w:sz w:val="20"/>
+      </w:rPr>
+    </w:lvl>
+  </w:abstractNum>
+  <w:abstractNum w:abstractNumId="2">
+    <w:nsid w:val="C59F9E52"/>
+    <w:multiLevelType w:val="multilevel"/>
+    <w:tmpl w:val="C59F9E52"/>
+    <w:lvl w:ilvl="0" w:tentative="0">
+      <w:start w:val="1"/>
+      <w:numFmt w:val="decimal"/>
+      <w:lvlText w:val="%1."/>
+      <w:lvlJc w:val="left"/>
+      <w:pPr>
+        <w:tabs>
+          <w:tab w:val="left" w:pos="720"/>
+        </w:tabs>
+        <w:ind w:left="720" w:hanging="360"/>
+      </w:pPr>
+      <w:rPr>
+        <w:sz w:val="24"/>
+        <w:szCs w:val="24"/>
+      </w:rPr>
+    </w:lvl>
+    <w:lvl w:ilvl="1" w:tentative="0">
+      <w:start w:val="1"/>
+      <w:numFmt w:val="decimal"/>
+      <w:lvlText w:val="%2."/>
+      <w:lvlJc w:val="left"/>
+      <w:pPr>
+        <w:tabs>
+          <w:tab w:val="left" w:pos="1440"/>
+        </w:tabs>
+        <w:ind w:left="1440" w:hanging="360"/>
+      </w:pPr>
+      <w:rPr>
+        <w:sz w:val="24"/>
+        <w:szCs w:val="24"/>
+      </w:rPr>
+    </w:lvl>
+    <w:lvl w:ilvl="2" w:tentative="0">
+      <w:start w:val="1"/>
+      <w:numFmt w:val="decimal"/>
+      <w:lvlText w:val="%3."/>
+      <w:lvlJc w:val="left"/>
+      <w:pPr>
+        <w:tabs>
+          <w:tab w:val="left" w:pos="2160"/>
+        </w:tabs>
+        <w:ind w:left="2160" w:hanging="360"/>
+      </w:pPr>
+      <w:rPr>
+        <w:sz w:val="24"/>
+        <w:szCs w:val="24"/>
+      </w:rPr>
+    </w:lvl>
+    <w:lvl w:ilvl="3" w:tentative="0">
+      <w:start w:val="1"/>
+      <w:numFmt w:val="decimal"/>
+      <w:lvlText w:val="%4."/>
+      <w:lvlJc w:val="left"/>
+      <w:pPr>
+        <w:tabs>
+          <w:tab w:val="left" w:pos="2517"/>
+        </w:tabs>
+        <w:ind w:left="2880" w:hanging="360"/>
+      </w:pPr>
+      <w:rPr>
+        <w:sz w:val="24"/>
+        <w:szCs w:val="24"/>
+      </w:rPr>
+    </w:lvl>
+    <w:lvl w:ilvl="4" w:tentative="0">
+      <w:start w:val="1"/>
+      <w:numFmt w:val="decimal"/>
+      <w:lvlText w:val="%5."/>
+      <w:lvlJc w:val="left"/>
+      <w:pPr>
+        <w:tabs>
+          <w:tab w:val="left" w:pos="3238"/>
+        </w:tabs>
+        <w:ind w:left="3600" w:hanging="360"/>
+      </w:pPr>
+      <w:rPr>
+        <w:sz w:val="24"/>
+        <w:szCs w:val="24"/>
+      </w:rPr>
+    </w:lvl>
+    <w:lvl w:ilvl="5" w:tentative="0">
+      <w:start w:val="1"/>
+      <w:numFmt w:val="decimal"/>
+      <w:lvlText w:val="%6."/>
+      <w:lvlJc w:val="left"/>
+      <w:pPr>
+        <w:tabs>
+          <w:tab w:val="left" w:pos="3958"/>
+        </w:tabs>
+        <w:ind w:left="4320" w:hanging="360"/>
+      </w:pPr>
+      <w:rPr>
+        <w:sz w:val="24"/>
+        <w:szCs w:val="24"/>
+      </w:rPr>
+    </w:lvl>
+    <w:lvl w:ilvl="6" w:tentative="0">
+      <w:start w:val="1"/>
+      <w:numFmt w:val="decimal"/>
+      <w:lvlText w:val="%7."/>
+      <w:lvlJc w:val="left"/>
+      <w:pPr>
+        <w:tabs>
+          <w:tab w:val="left" w:pos="4678"/>
+        </w:tabs>
+        <w:ind w:left="5040" w:hanging="360"/>
+      </w:pPr>
+      <w:rPr>
+        <w:sz w:val="24"/>
+        <w:szCs w:val="24"/>
+      </w:rPr>
+    </w:lvl>
+    <w:lvl w:ilvl="7" w:tentative="0">
+      <w:start w:val="1"/>
+      <w:numFmt w:val="decimal"/>
+      <w:lvlText w:val="%8."/>
+      <w:lvlJc w:val="left"/>
+      <w:pPr>
+        <w:tabs>
+          <w:tab w:val="left" w:pos="5398"/>
+        </w:tabs>
+        <w:ind w:left="5760" w:hanging="360"/>
+      </w:pPr>
+      <w:rPr>
+        <w:sz w:val="24"/>
+        <w:szCs w:val="24"/>
+      </w:rPr>
+    </w:lvl>
+    <w:lvl w:ilvl="8" w:tentative="0">
+      <w:start w:val="1"/>
+      <w:numFmt w:val="decimal"/>
+      <w:lvlText w:val="%9."/>
+      <w:lvlJc w:val="left"/>
+      <w:pPr>
+        <w:tabs>
+          <w:tab w:val="left" w:pos="6118"/>
+        </w:tabs>
+        <w:ind w:left="6480" w:hanging="360"/>
+      </w:pPr>
+      <w:rPr>
+        <w:sz w:val="24"/>
+        <w:szCs w:val="24"/>
+      </w:rPr>
+    </w:lvl>
+  </w:abstractNum>
+  <w:abstractNum w:abstractNumId="3">
     <w:nsid w:val="F376E6D0"/>
     <w:multiLevelType w:val="multilevel"/>
     <w:tmpl w:val="F376E6D0"/>
@@ -5089,7 +7092,7 @@
       </w:rPr>
     </w:lvl>
   </w:abstractNum>
-  <w:abstractNum w:abstractNumId="2">
+  <w:abstractNum w:abstractNumId="4">
     <w:nsid w:val="F4472441"/>
     <w:multiLevelType w:val="multilevel"/>
     <w:tmpl w:val="F4472441"/>
@@ -5238,7 +7241,7 @@
       </w:rPr>
     </w:lvl>
   </w:abstractNum>
-  <w:abstractNum w:abstractNumId="3">
+  <w:abstractNum w:abstractNumId="5">
     <w:nsid w:val="F922E12D"/>
     <w:multiLevelType w:val="multilevel"/>
     <w:tmpl w:val="F922E12D"/>
@@ -5387,7 +7390,305 @@
       </w:rPr>
     </w:lvl>
   </w:abstractNum>
-  <w:abstractNum w:abstractNumId="4">
+  <w:abstractNum w:abstractNumId="6">
+    <w:nsid w:val="09FFA9B1"/>
+    <w:multiLevelType w:val="multilevel"/>
+    <w:tmpl w:val="09FFA9B1"/>
+    <w:lvl w:ilvl="0" w:tentative="0">
+      <w:start w:val="1"/>
+      <w:numFmt w:val="bullet"/>
+      <w:lvlText w:val=""/>
+      <w:lvlJc w:val="left"/>
+      <w:pPr>
+        <w:tabs>
+          <w:tab w:val="left" w:pos="720"/>
+        </w:tabs>
+        <w:ind w:left="720" w:hanging="360"/>
+      </w:pPr>
+      <w:rPr>
+        <w:rFonts w:hint="default" w:ascii="Symbol" w:hAnsi="Symbol" w:cs="Symbol"/>
+        <w:sz w:val="20"/>
+      </w:rPr>
+    </w:lvl>
+    <w:lvl w:ilvl="1" w:tentative="0">
+      <w:start w:val="1"/>
+      <w:numFmt w:val="bullet"/>
+      <w:lvlText w:val="o"/>
+      <w:lvlJc w:val="left"/>
+      <w:pPr>
+        <w:tabs>
+          <w:tab w:val="left" w:pos="1440"/>
+        </w:tabs>
+        <w:ind w:left="1440" w:hanging="360"/>
+      </w:pPr>
+      <w:rPr>
+        <w:rFonts w:hint="default" w:ascii="Courier New" w:hAnsi="Courier New" w:cs="Courier New"/>
+        <w:sz w:val="20"/>
+      </w:rPr>
+    </w:lvl>
+    <w:lvl w:ilvl="2" w:tentative="0">
+      <w:start w:val="1"/>
+      <w:numFmt w:val="bullet"/>
+      <w:lvlText w:val=""/>
+      <w:lvlJc w:val="left"/>
+      <w:pPr>
+        <w:tabs>
+          <w:tab w:val="left" w:pos="2160"/>
+        </w:tabs>
+        <w:ind w:left="2160" w:hanging="360"/>
+      </w:pPr>
+      <w:rPr>
+        <w:rFonts w:hint="default" w:ascii="Wingdings" w:hAnsi="Wingdings" w:cs="Wingdings"/>
+        <w:sz w:val="20"/>
+      </w:rPr>
+    </w:lvl>
+    <w:lvl w:ilvl="3" w:tentative="0">
+      <w:start w:val="1"/>
+      <w:numFmt w:val="bullet"/>
+      <w:lvlText w:val=""/>
+      <w:lvlJc w:val="left"/>
+      <w:pPr>
+        <w:tabs>
+          <w:tab w:val="left" w:pos="2880"/>
+        </w:tabs>
+        <w:ind w:left="2880" w:hanging="360"/>
+      </w:pPr>
+      <w:rPr>
+        <w:rFonts w:hint="default" w:ascii="Wingdings" w:hAnsi="Wingdings" w:cs="Wingdings"/>
+        <w:sz w:val="20"/>
+      </w:rPr>
+    </w:lvl>
+    <w:lvl w:ilvl="4" w:tentative="0">
+      <w:start w:val="1"/>
+      <w:numFmt w:val="bullet"/>
+      <w:lvlText w:val=""/>
+      <w:lvlJc w:val="left"/>
+      <w:pPr>
+        <w:tabs>
+          <w:tab w:val="left" w:pos="3600"/>
+        </w:tabs>
+        <w:ind w:left="3600" w:hanging="360"/>
+      </w:pPr>
+      <w:rPr>
+        <w:rFonts w:hint="default" w:ascii="Wingdings" w:hAnsi="Wingdings" w:cs="Wingdings"/>
+        <w:sz w:val="20"/>
+      </w:rPr>
+    </w:lvl>
+    <w:lvl w:ilvl="5" w:tentative="0">
+      <w:start w:val="1"/>
+      <w:numFmt w:val="bullet"/>
+      <w:lvlText w:val=""/>
+      <w:lvlJc w:val="left"/>
+      <w:pPr>
+        <w:tabs>
+          <w:tab w:val="left" w:pos="4320"/>
+        </w:tabs>
+        <w:ind w:left="4320" w:hanging="360"/>
+      </w:pPr>
+      <w:rPr>
+        <w:rFonts w:hint="default" w:ascii="Wingdings" w:hAnsi="Wingdings" w:cs="Wingdings"/>
+        <w:sz w:val="20"/>
+      </w:rPr>
+    </w:lvl>
+    <w:lvl w:ilvl="6" w:tentative="0">
+      <w:start w:val="1"/>
+      <w:numFmt w:val="bullet"/>
+      <w:lvlText w:val=""/>
+      <w:lvlJc w:val="left"/>
+      <w:pPr>
+        <w:tabs>
+          <w:tab w:val="left" w:pos="5040"/>
+        </w:tabs>
+        <w:ind w:left="5040" w:hanging="360"/>
+      </w:pPr>
+      <w:rPr>
+        <w:rFonts w:hint="default" w:ascii="Wingdings" w:hAnsi="Wingdings" w:cs="Wingdings"/>
+        <w:sz w:val="20"/>
+      </w:rPr>
+    </w:lvl>
+    <w:lvl w:ilvl="7" w:tentative="0">
+      <w:start w:val="1"/>
+      <w:numFmt w:val="bullet"/>
+      <w:lvlText w:val=""/>
+      <w:lvlJc w:val="left"/>
+      <w:pPr>
+        <w:tabs>
+          <w:tab w:val="left" w:pos="5760"/>
+        </w:tabs>
+        <w:ind w:left="5760" w:hanging="360"/>
+      </w:pPr>
+      <w:rPr>
+        <w:rFonts w:hint="default" w:ascii="Wingdings" w:hAnsi="Wingdings" w:cs="Wingdings"/>
+        <w:sz w:val="20"/>
+      </w:rPr>
+    </w:lvl>
+    <w:lvl w:ilvl="8" w:tentative="0">
+      <w:start w:val="1"/>
+      <w:numFmt w:val="bullet"/>
+      <w:lvlText w:val=""/>
+      <w:lvlJc w:val="left"/>
+      <w:pPr>
+        <w:tabs>
+          <w:tab w:val="left" w:pos="6480"/>
+        </w:tabs>
+        <w:ind w:left="6480" w:hanging="360"/>
+      </w:pPr>
+      <w:rPr>
+        <w:rFonts w:hint="default" w:ascii="Wingdings" w:hAnsi="Wingdings" w:cs="Wingdings"/>
+        <w:sz w:val="20"/>
+      </w:rPr>
+    </w:lvl>
+  </w:abstractNum>
+  <w:abstractNum w:abstractNumId="7">
+    <w:nsid w:val="3F14F6EC"/>
+    <w:multiLevelType w:val="multilevel"/>
+    <w:tmpl w:val="3F14F6EC"/>
+    <w:lvl w:ilvl="0" w:tentative="0">
+      <w:start w:val="1"/>
+      <w:numFmt w:val="bullet"/>
+      <w:lvlText w:val=""/>
+      <w:lvlJc w:val="left"/>
+      <w:pPr>
+        <w:tabs>
+          <w:tab w:val="left" w:pos="720"/>
+        </w:tabs>
+        <w:ind w:left="720" w:hanging="360"/>
+      </w:pPr>
+      <w:rPr>
+        <w:rFonts w:hint="default" w:ascii="Symbol" w:hAnsi="Symbol" w:cs="Symbol"/>
+        <w:sz w:val="20"/>
+      </w:rPr>
+    </w:lvl>
+    <w:lvl w:ilvl="1" w:tentative="0">
+      <w:start w:val="1"/>
+      <w:numFmt w:val="bullet"/>
+      <w:lvlText w:val="o"/>
+      <w:lvlJc w:val="left"/>
+      <w:pPr>
+        <w:tabs>
+          <w:tab w:val="left" w:pos="1440"/>
+        </w:tabs>
+        <w:ind w:left="1440" w:hanging="360"/>
+      </w:pPr>
+      <w:rPr>
+        <w:rFonts w:hint="default" w:ascii="Courier New" w:hAnsi="Courier New" w:cs="Courier New"/>
+        <w:sz w:val="20"/>
+      </w:rPr>
+    </w:lvl>
+    <w:lvl w:ilvl="2" w:tentative="0">
+      <w:start w:val="1"/>
+      <w:numFmt w:val="bullet"/>
+      <w:lvlText w:val=""/>
+      <w:lvlJc w:val="left"/>
+      <w:pPr>
+        <w:tabs>
+          <w:tab w:val="left" w:pos="2160"/>
+        </w:tabs>
+        <w:ind w:left="2160" w:hanging="360"/>
+      </w:pPr>
+      <w:rPr>
+        <w:rFonts w:hint="default" w:ascii="Wingdings" w:hAnsi="Wingdings" w:cs="Wingdings"/>
+        <w:sz w:val="20"/>
+      </w:rPr>
+    </w:lvl>
+    <w:lvl w:ilvl="3" w:tentative="0">
+      <w:start w:val="1"/>
+      <w:numFmt w:val="bullet"/>
+      <w:lvlText w:val=""/>
+      <w:lvlJc w:val="left"/>
+      <w:pPr>
+        <w:tabs>
+          <w:tab w:val="left" w:pos="2880"/>
+        </w:tabs>
+        <w:ind w:left="2880" w:hanging="360"/>
+      </w:pPr>
+      <w:rPr>
+        <w:rFonts w:hint="default" w:ascii="Wingdings" w:hAnsi="Wingdings" w:cs="Wingdings"/>
+        <w:sz w:val="20"/>
+      </w:rPr>
+    </w:lvl>
+    <w:lvl w:ilvl="4" w:tentative="0">
+      <w:start w:val="1"/>
+      <w:numFmt w:val="bullet"/>
+      <w:lvlText w:val=""/>
+      <w:lvlJc w:val="left"/>
+      <w:pPr>
+        <w:tabs>
+          <w:tab w:val="left" w:pos="3600"/>
+        </w:tabs>
+        <w:ind w:left="3600" w:hanging="360"/>
+      </w:pPr>
+      <w:rPr>
+        <w:rFonts w:hint="default" w:ascii="Wingdings" w:hAnsi="Wingdings" w:cs="Wingdings"/>
+        <w:sz w:val="20"/>
+      </w:rPr>
+    </w:lvl>
+    <w:lvl w:ilvl="5" w:tentative="0">
+      <w:start w:val="1"/>
+      <w:numFmt w:val="bullet"/>
+      <w:lvlText w:val=""/>
+      <w:lvlJc w:val="left"/>
+      <w:pPr>
+        <w:tabs>
+          <w:tab w:val="left" w:pos="4320"/>
+        </w:tabs>
+        <w:ind w:left="4320" w:hanging="360"/>
+      </w:pPr>
+      <w:rPr>
+        <w:rFonts w:hint="default" w:ascii="Wingdings" w:hAnsi="Wingdings" w:cs="Wingdings"/>
+        <w:sz w:val="20"/>
+      </w:rPr>
+    </w:lvl>
+    <w:lvl w:ilvl="6" w:tentative="0">
+      <w:start w:val="1"/>
+      <w:numFmt w:val="bullet"/>
+      <w:lvlText w:val=""/>
+      <w:lvlJc w:val="left"/>
+      <w:pPr>
+        <w:tabs>
+          <w:tab w:val="left" w:pos="5040"/>
+        </w:tabs>
+        <w:ind w:left="5040" w:hanging="360"/>
+      </w:pPr>
+      <w:rPr>
+        <w:rFonts w:hint="default" w:ascii="Wingdings" w:hAnsi="Wingdings" w:cs="Wingdings"/>
+        <w:sz w:val="20"/>
+      </w:rPr>
+    </w:lvl>
+    <w:lvl w:ilvl="7" w:tentative="0">
+      <w:start w:val="1"/>
+      <w:numFmt w:val="bullet"/>
+      <w:lvlText w:val=""/>
+      <w:lvlJc w:val="left"/>
+      <w:pPr>
+        <w:tabs>
+          <w:tab w:val="left" w:pos="5760"/>
+        </w:tabs>
+        <w:ind w:left="5760" w:hanging="360"/>
+      </w:pPr>
+      <w:rPr>
+        <w:rFonts w:hint="default" w:ascii="Wingdings" w:hAnsi="Wingdings" w:cs="Wingdings"/>
+        <w:sz w:val="20"/>
+      </w:rPr>
+    </w:lvl>
+    <w:lvl w:ilvl="8" w:tentative="0">
+      <w:start w:val="1"/>
+      <w:numFmt w:val="bullet"/>
+      <w:lvlText w:val=""/>
+      <w:lvlJc w:val="left"/>
+      <w:pPr>
+        <w:tabs>
+          <w:tab w:val="left" w:pos="6480"/>
+        </w:tabs>
+        <w:ind w:left="6480" w:hanging="360"/>
+      </w:pPr>
+      <w:rPr>
+        <w:rFonts w:hint="default" w:ascii="Wingdings" w:hAnsi="Wingdings" w:cs="Wingdings"/>
+        <w:sz w:val="20"/>
+      </w:rPr>
+    </w:lvl>
+  </w:abstractNum>
+  <w:abstractNum w:abstractNumId="8">
     <w:nsid w:val="40BC5D75"/>
     <w:multiLevelType w:val="multilevel"/>
     <w:tmpl w:val="40BC5D75"/>
@@ -5536,7 +7837,305 @@
       </w:rPr>
     </w:lvl>
   </w:abstractNum>
-  <w:abstractNum w:abstractNumId="5">
+  <w:abstractNum w:abstractNumId="9">
+    <w:nsid w:val="44035F04"/>
+    <w:multiLevelType w:val="multilevel"/>
+    <w:tmpl w:val="44035F04"/>
+    <w:lvl w:ilvl="0" w:tentative="0">
+      <w:start w:val="1"/>
+      <w:numFmt w:val="bullet"/>
+      <w:lvlText w:val=""/>
+      <w:lvlJc w:val="left"/>
+      <w:pPr>
+        <w:tabs>
+          <w:tab w:val="left" w:pos="720"/>
+        </w:tabs>
+        <w:ind w:left="720" w:hanging="360"/>
+      </w:pPr>
+      <w:rPr>
+        <w:rFonts w:ascii="Symbol" w:hAnsi="Symbol" w:cs="Symbol"/>
+        <w:sz w:val="20"/>
+      </w:rPr>
+    </w:lvl>
+    <w:lvl w:ilvl="1" w:tentative="0">
+      <w:start w:val="1"/>
+      <w:numFmt w:val="bullet"/>
+      <w:lvlText w:val="o"/>
+      <w:lvlJc w:val="left"/>
+      <w:pPr>
+        <w:tabs>
+          <w:tab w:val="left" w:pos="1440"/>
+        </w:tabs>
+        <w:ind w:left="1440" w:hanging="360"/>
+      </w:pPr>
+      <w:rPr>
+        <w:rFonts w:ascii="Courier New" w:hAnsi="Courier New" w:cs="Courier New"/>
+        <w:sz w:val="20"/>
+      </w:rPr>
+    </w:lvl>
+    <w:lvl w:ilvl="2" w:tentative="0">
+      <w:start w:val="1"/>
+      <w:numFmt w:val="bullet"/>
+      <w:lvlText w:val=""/>
+      <w:lvlJc w:val="left"/>
+      <w:pPr>
+        <w:tabs>
+          <w:tab w:val="left" w:pos="2160"/>
+        </w:tabs>
+        <w:ind w:left="2160" w:hanging="360"/>
+      </w:pPr>
+      <w:rPr>
+        <w:rFonts w:ascii="Wingdings" w:hAnsi="Wingdings" w:cs="Wingdings"/>
+        <w:sz w:val="20"/>
+      </w:rPr>
+    </w:lvl>
+    <w:lvl w:ilvl="3" w:tentative="0">
+      <w:start w:val="1"/>
+      <w:numFmt w:val="bullet"/>
+      <w:lvlText w:val=""/>
+      <w:lvlJc w:val="left"/>
+      <w:pPr>
+        <w:tabs>
+          <w:tab w:val="left" w:pos="2880"/>
+        </w:tabs>
+        <w:ind w:left="2880" w:hanging="360"/>
+      </w:pPr>
+      <w:rPr>
+        <w:rFonts w:hint="default" w:ascii="Wingdings" w:hAnsi="Wingdings" w:cs="Wingdings"/>
+        <w:sz w:val="20"/>
+      </w:rPr>
+    </w:lvl>
+    <w:lvl w:ilvl="4" w:tentative="0">
+      <w:start w:val="1"/>
+      <w:numFmt w:val="bullet"/>
+      <w:lvlText w:val=""/>
+      <w:lvlJc w:val="left"/>
+      <w:pPr>
+        <w:tabs>
+          <w:tab w:val="left" w:pos="3600"/>
+        </w:tabs>
+        <w:ind w:left="3600" w:hanging="360"/>
+      </w:pPr>
+      <w:rPr>
+        <w:rFonts w:hint="default" w:ascii="Wingdings" w:hAnsi="Wingdings" w:cs="Wingdings"/>
+        <w:sz w:val="20"/>
+      </w:rPr>
+    </w:lvl>
+    <w:lvl w:ilvl="5" w:tentative="0">
+      <w:start w:val="1"/>
+      <w:numFmt w:val="bullet"/>
+      <w:lvlText w:val=""/>
+      <w:lvlJc w:val="left"/>
+      <w:pPr>
+        <w:tabs>
+          <w:tab w:val="left" w:pos="4320"/>
+        </w:tabs>
+        <w:ind w:left="4320" w:hanging="360"/>
+      </w:pPr>
+      <w:rPr>
+        <w:rFonts w:hint="default" w:ascii="Wingdings" w:hAnsi="Wingdings" w:cs="Wingdings"/>
+        <w:sz w:val="20"/>
+      </w:rPr>
+    </w:lvl>
+    <w:lvl w:ilvl="6" w:tentative="0">
+      <w:start w:val="1"/>
+      <w:numFmt w:val="bullet"/>
+      <w:lvlText w:val=""/>
+      <w:lvlJc w:val="left"/>
+      <w:pPr>
+        <w:tabs>
+          <w:tab w:val="left" w:pos="5040"/>
+        </w:tabs>
+        <w:ind w:left="5040" w:hanging="360"/>
+      </w:pPr>
+      <w:rPr>
+        <w:rFonts w:hint="default" w:ascii="Wingdings" w:hAnsi="Wingdings" w:cs="Wingdings"/>
+        <w:sz w:val="20"/>
+      </w:rPr>
+    </w:lvl>
+    <w:lvl w:ilvl="7" w:tentative="0">
+      <w:start w:val="1"/>
+      <w:numFmt w:val="bullet"/>
+      <w:lvlText w:val=""/>
+      <w:lvlJc w:val="left"/>
+      <w:pPr>
+        <w:tabs>
+          <w:tab w:val="left" w:pos="5760"/>
+        </w:tabs>
+        <w:ind w:left="5760" w:hanging="360"/>
+      </w:pPr>
+      <w:rPr>
+        <w:rFonts w:hint="default" w:ascii="Wingdings" w:hAnsi="Wingdings" w:cs="Wingdings"/>
+        <w:sz w:val="20"/>
+      </w:rPr>
+    </w:lvl>
+    <w:lvl w:ilvl="8" w:tentative="0">
+      <w:start w:val="1"/>
+      <w:numFmt w:val="bullet"/>
+      <w:lvlText w:val=""/>
+      <w:lvlJc w:val="left"/>
+      <w:pPr>
+        <w:tabs>
+          <w:tab w:val="left" w:pos="6480"/>
+        </w:tabs>
+        <w:ind w:left="6480" w:hanging="360"/>
+      </w:pPr>
+      <w:rPr>
+        <w:rFonts w:hint="default" w:ascii="Wingdings" w:hAnsi="Wingdings" w:cs="Wingdings"/>
+        <w:sz w:val="20"/>
+      </w:rPr>
+    </w:lvl>
+  </w:abstractNum>
+  <w:abstractNum w:abstractNumId="10">
+    <w:nsid w:val="54FC44FC"/>
+    <w:multiLevelType w:val="multilevel"/>
+    <w:tmpl w:val="54FC44FC"/>
+    <w:lvl w:ilvl="0" w:tentative="0">
+      <w:start w:val="1"/>
+      <w:numFmt w:val="bullet"/>
+      <w:lvlText w:val=""/>
+      <w:lvlJc w:val="left"/>
+      <w:pPr>
+        <w:tabs>
+          <w:tab w:val="left" w:pos="720"/>
+        </w:tabs>
+        <w:ind w:left="720" w:hanging="360"/>
+      </w:pPr>
+      <w:rPr>
+        <w:rFonts w:hint="default" w:ascii="Symbol" w:hAnsi="Symbol" w:cs="Symbol"/>
+        <w:sz w:val="20"/>
+      </w:rPr>
+    </w:lvl>
+    <w:lvl w:ilvl="1" w:tentative="0">
+      <w:start w:val="1"/>
+      <w:numFmt w:val="bullet"/>
+      <w:lvlText w:val="o"/>
+      <w:lvlJc w:val="left"/>
+      <w:pPr>
+        <w:tabs>
+          <w:tab w:val="left" w:pos="1440"/>
+        </w:tabs>
+        <w:ind w:left="1440" w:hanging="360"/>
+      </w:pPr>
+      <w:rPr>
+        <w:rFonts w:hint="default" w:ascii="Courier New" w:hAnsi="Courier New" w:cs="Courier New"/>
+        <w:sz w:val="20"/>
+      </w:rPr>
+    </w:lvl>
+    <w:lvl w:ilvl="2" w:tentative="0">
+      <w:start w:val="1"/>
+      <w:numFmt w:val="bullet"/>
+      <w:lvlText w:val=""/>
+      <w:lvlJc w:val="left"/>
+      <w:pPr>
+        <w:tabs>
+          <w:tab w:val="left" w:pos="2160"/>
+        </w:tabs>
+        <w:ind w:left="2160" w:hanging="360"/>
+      </w:pPr>
+      <w:rPr>
+        <w:rFonts w:hint="default" w:ascii="Wingdings" w:hAnsi="Wingdings" w:cs="Wingdings"/>
+        <w:sz w:val="20"/>
+      </w:rPr>
+    </w:lvl>
+    <w:lvl w:ilvl="3" w:tentative="0">
+      <w:start w:val="1"/>
+      <w:numFmt w:val="bullet"/>
+      <w:lvlText w:val=""/>
+      <w:lvlJc w:val="left"/>
+      <w:pPr>
+        <w:tabs>
+          <w:tab w:val="left" w:pos="2880"/>
+        </w:tabs>
+        <w:ind w:left="2880" w:hanging="360"/>
+      </w:pPr>
+      <w:rPr>
+        <w:rFonts w:hint="default" w:ascii="Wingdings" w:hAnsi="Wingdings" w:cs="Wingdings"/>
+        <w:sz w:val="20"/>
+      </w:rPr>
+    </w:lvl>
+    <w:lvl w:ilvl="4" w:tentative="0">
+      <w:start w:val="1"/>
+      <w:numFmt w:val="bullet"/>
+      <w:lvlText w:val=""/>
+      <w:lvlJc w:val="left"/>
+      <w:pPr>
+        <w:tabs>
+          <w:tab w:val="left" w:pos="3600"/>
+        </w:tabs>
+        <w:ind w:left="3600" w:hanging="360"/>
+      </w:pPr>
+      <w:rPr>
+        <w:rFonts w:hint="default" w:ascii="Wingdings" w:hAnsi="Wingdings" w:cs="Wingdings"/>
+        <w:sz w:val="20"/>
+      </w:rPr>
+    </w:lvl>
+    <w:lvl w:ilvl="5" w:tentative="0">
+      <w:start w:val="1"/>
+      <w:numFmt w:val="bullet"/>
+      <w:lvlText w:val=""/>
+      <w:lvlJc w:val="left"/>
+      <w:pPr>
+        <w:tabs>
+          <w:tab w:val="left" w:pos="4320"/>
+        </w:tabs>
+        <w:ind w:left="4320" w:hanging="360"/>
+      </w:pPr>
+      <w:rPr>
+        <w:rFonts w:hint="default" w:ascii="Wingdings" w:hAnsi="Wingdings" w:cs="Wingdings"/>
+        <w:sz w:val="20"/>
+      </w:rPr>
+    </w:lvl>
+    <w:lvl w:ilvl="6" w:tentative="0">
+      <w:start w:val="1"/>
+      <w:numFmt w:val="bullet"/>
+      <w:lvlText w:val=""/>
+      <w:lvlJc w:val="left"/>
+      <w:pPr>
+        <w:tabs>
+          <w:tab w:val="left" w:pos="5040"/>
+        </w:tabs>
+        <w:ind w:left="5040" w:hanging="360"/>
+      </w:pPr>
+      <w:rPr>
+        <w:rFonts w:hint="default" w:ascii="Wingdings" w:hAnsi="Wingdings" w:cs="Wingdings"/>
+        <w:sz w:val="20"/>
+      </w:rPr>
+    </w:lvl>
+    <w:lvl w:ilvl="7" w:tentative="0">
+      <w:start w:val="1"/>
+      <w:numFmt w:val="bullet"/>
+      <w:lvlText w:val=""/>
+      <w:lvlJc w:val="left"/>
+      <w:pPr>
+        <w:tabs>
+          <w:tab w:val="left" w:pos="5760"/>
+        </w:tabs>
+        <w:ind w:left="5760" w:hanging="360"/>
+      </w:pPr>
+      <w:rPr>
+        <w:rFonts w:hint="default" w:ascii="Wingdings" w:hAnsi="Wingdings" w:cs="Wingdings"/>
+        <w:sz w:val="20"/>
+      </w:rPr>
+    </w:lvl>
+    <w:lvl w:ilvl="8" w:tentative="0">
+      <w:start w:val="1"/>
+      <w:numFmt w:val="bullet"/>
+      <w:lvlText w:val=""/>
+      <w:lvlJc w:val="left"/>
+      <w:pPr>
+        <w:tabs>
+          <w:tab w:val="left" w:pos="6480"/>
+        </w:tabs>
+        <w:ind w:left="6480" w:hanging="360"/>
+      </w:pPr>
+      <w:rPr>
+        <w:rFonts w:hint="default" w:ascii="Wingdings" w:hAnsi="Wingdings" w:cs="Wingdings"/>
+        <w:sz w:val="20"/>
+      </w:rPr>
+    </w:lvl>
+  </w:abstractNum>
+  <w:abstractNum w:abstractNumId="11">
     <w:nsid w:val="5A8DDD35"/>
     <w:multiLevelType w:val="multilevel"/>
     <w:tmpl w:val="5A8DDD35"/>
@@ -5685,7 +8284,7 @@
       </w:rPr>
     </w:lvl>
   </w:abstractNum>
-  <w:abstractNum w:abstractNumId="6">
+  <w:abstractNum w:abstractNumId="12">
     <w:nsid w:val="614F642F"/>
     <w:multiLevelType w:val="multilevel"/>
     <w:tmpl w:val="614F642F"/>
@@ -5834,7 +8433,7 @@
       </w:rPr>
     </w:lvl>
   </w:abstractNum>
-  <w:abstractNum w:abstractNumId="7">
+  <w:abstractNum w:abstractNumId="13">
     <w:nsid w:val="69B58DC0"/>
     <w:multiLevelType w:val="multilevel"/>
     <w:tmpl w:val="69B58DC0"/>
@@ -5983,7 +8582,7 @@
       </w:rPr>
     </w:lvl>
   </w:abstractNum>
-  <w:abstractNum w:abstractNumId="8">
+  <w:abstractNum w:abstractNumId="14">
     <w:nsid w:val="6B6DEB3A"/>
     <w:multiLevelType w:val="multilevel"/>
     <w:tmpl w:val="6B6DEB3A"/>
@@ -6133,31 +8732,49 @@
     </w:lvl>
   </w:abstractNum>
   <w:num w:numId="1">
-    <w:abstractNumId w:val="1"/>
+    <w:abstractNumId w:val="3"/>
   </w:num>
   <w:num w:numId="2">
-    <w:abstractNumId w:val="3"/>
+    <w:abstractNumId w:val="5"/>
   </w:num>
   <w:num w:numId="3">
+    <w:abstractNumId w:val="14"/>
+  </w:num>
+  <w:num w:numId="4">
     <w:abstractNumId w:val="8"/>
   </w:num>
-  <w:num w:numId="4">
-    <w:abstractNumId w:val="4"/>
-  </w:num>
   <w:num w:numId="5">
-    <w:abstractNumId w:val="6"/>
+    <w:abstractNumId w:val="12"/>
   </w:num>
   <w:num w:numId="6">
-    <w:abstractNumId w:val="7"/>
+    <w:abstractNumId w:val="13"/>
   </w:num>
   <w:num w:numId="7">
-    <w:abstractNumId w:val="2"/>
+    <w:abstractNumId w:val="4"/>
   </w:num>
   <w:num w:numId="8">
     <w:abstractNumId w:val="0"/>
   </w:num>
   <w:num w:numId="9">
-    <w:abstractNumId w:val="5"/>
+    <w:abstractNumId w:val="11"/>
+  </w:num>
+  <w:num w:numId="10">
+    <w:abstractNumId w:val="9"/>
+  </w:num>
+  <w:num w:numId="11">
+    <w:abstractNumId w:val="2"/>
+  </w:num>
+  <w:num w:numId="12">
+    <w:abstractNumId w:val="10"/>
+  </w:num>
+  <w:num w:numId="13">
+    <w:abstractNumId w:val="6"/>
+  </w:num>
+  <w:num w:numId="14">
+    <w:abstractNumId w:val="7"/>
+  </w:num>
+  <w:num w:numId="15">
+    <w:abstractNumId w:val="1"/>
   </w:num>
 </w:numbering>
 </file>
@@ -6238,7 +8855,7 @@
     <w:lsdException w:qFormat="1" w:unhideWhenUsed="0" w:uiPriority="0" w:semiHidden="0" w:name="Title"/>
     <w:lsdException w:unhideWhenUsed="0" w:uiPriority="0" w:semiHidden="0" w:name="Closing"/>
     <w:lsdException w:unhideWhenUsed="0" w:uiPriority="0" w:semiHidden="0" w:name="Signature"/>
-    <w:lsdException w:unhideWhenUsed="0" w:uiPriority="0" w:name="Default Paragraph Font"/>
+    <w:lsdException w:qFormat="1" w:unhideWhenUsed="0" w:uiPriority="0" w:name="Default Paragraph Font"/>
     <w:lsdException w:unhideWhenUsed="0" w:uiPriority="0" w:semiHidden="0" w:name="Body Text"/>
     <w:lsdException w:unhideWhenUsed="0" w:uiPriority="0" w:semiHidden="0" w:name="Body Text Indent"/>
     <w:lsdException w:unhideWhenUsed="0" w:uiPriority="0" w:semiHidden="0" w:name="List Continue"/>
@@ -6471,12 +9088,34 @@
       <w:lang w:val="en-US" w:eastAsia="zh-CN" w:bidi="ar"/>
     </w:rPr>
   </w:style>
-  <w:style w:type="character" w:default="1" w:styleId="4">
+  <w:style w:type="paragraph" w:styleId="4">
+    <w:name w:val="heading 3"/>
+    <w:next w:val="1"/>
+    <w:semiHidden/>
+    <w:unhideWhenUsed/>
+    <w:qFormat/>
+    <w:uiPriority w:val="0"/>
+    <w:pPr>
+      <w:spacing w:before="0" w:beforeAutospacing="1" w:after="0" w:afterAutospacing="1"/>
+      <w:jc w:val="left"/>
+    </w:pPr>
+    <w:rPr>
+      <w:rFonts w:hint="eastAsia" w:ascii="SimSun" w:hAnsi="SimSun" w:eastAsia="SimSun" w:cs="SimSun"/>
+      <w:b/>
+      <w:bCs/>
+      <w:kern w:val="0"/>
+      <w:sz w:val="27"/>
+      <w:szCs w:val="27"/>
+      <w:lang w:val="en-US" w:eastAsia="zh-CN" w:bidi="ar"/>
+    </w:rPr>
+  </w:style>
+  <w:style w:type="character" w:default="1" w:styleId="5">
     <w:name w:val="Default Paragraph Font"/>
     <w:semiHidden/>
+    <w:qFormat/>
     <w:uiPriority w:val="0"/>
   </w:style>
-  <w:style w:type="table" w:default="1" w:styleId="5">
+  <w:style w:type="table" w:default="1" w:styleId="6">
     <w:name w:val="Normal Table"/>
     <w:semiHidden/>
     <w:qFormat/>
@@ -6490,9 +9129,9 @@
       </w:tblCellMar>
     </w:tblPr>
   </w:style>
-  <w:style w:type="character" w:styleId="6">
+  <w:style w:type="character" w:styleId="7">
     <w:name w:val="Emphasis"/>
-    <w:basedOn w:val="4"/>
+    <w:basedOn w:val="5"/>
     <w:qFormat/>
     <w:uiPriority w:val="0"/>
     <w:rPr>
@@ -6500,9 +9139,9 @@
       <w:iCs/>
     </w:rPr>
   </w:style>
-  <w:style w:type="character" w:styleId="7">
+  <w:style w:type="character" w:styleId="8">
     <w:name w:val="HTML Code"/>
-    <w:basedOn w:val="4"/>
+    <w:basedOn w:val="5"/>
     <w:uiPriority w:val="0"/>
     <w:rPr>
       <w:rFonts w:ascii="Courier New" w:hAnsi="Courier New" w:cs="Courier New"/>
@@ -6510,27 +9149,33 @@
       <w:szCs w:val="20"/>
     </w:rPr>
   </w:style>
-  <w:style w:type="character" w:styleId="8">
+  <w:style w:type="character" w:styleId="9">
     <w:name w:val="Hyperlink"/>
-    <w:basedOn w:val="4"/>
+    <w:basedOn w:val="5"/>
     <w:uiPriority w:val="0"/>
     <w:rPr>
       <w:color w:val="0000FF"/>
       <w:u w:val="single"/>
     </w:rPr>
   </w:style>
-  <w:style w:type="paragraph" w:styleId="9">
+  <w:style w:type="paragraph" w:styleId="10">
     <w:name w:val="Normal (Web)"/>
-    <w:basedOn w:val="1"/>
     <w:uiPriority w:val="0"/>
+    <w:pPr>
+      <w:spacing w:before="0" w:beforeAutospacing="1" w:after="0" w:afterAutospacing="1"/>
+      <w:ind w:left="0" w:right="0"/>
+      <w:jc w:val="left"/>
+    </w:pPr>
     <w:rPr>
+      <w:kern w:val="0"/>
       <w:sz w:val="24"/>
       <w:szCs w:val="24"/>
+      <w:lang w:val="en-US" w:eastAsia="zh-CN" w:bidi="ar"/>
     </w:rPr>
   </w:style>
-  <w:style w:type="character" w:styleId="10">
+  <w:style w:type="character" w:styleId="11">
     <w:name w:val="Strong"/>
-    <w:basedOn w:val="4"/>
+    <w:basedOn w:val="5"/>
     <w:qFormat/>
     <w:uiPriority w:val="0"/>
     <w:rPr>

</xml_diff>